<commit_message>
Add department line below logo on cover page
Co-Authored-By: Claude Sonnet 5.5 <noreply@anthropic.com>
Claude-Session: https://claude.ai/code/session_01XSGpBmyyfwNpi7tuzVvNqh
</commit_message>
<xml_diff>
--- a/report/BEACON_Project_Report.docx
+++ b/report/BEACON_Project_Report.docx
@@ -231,6 +231,22 @@
             </a:graphic>
           </wp:inline>
         </w:drawing>
+      </w:r>
+    </w:p>
+    <w:p>
+      <w:pPr>
+        <w:spacing w:after="0" w:before="80" w:line="276" w:lineRule="auto"/>
+        <w:ind w:firstLine="0"/>
+        <w:jc w:val="center"/>
+      </w:pPr>
+      <w:r>
+        <w:rPr>
+          <w:rFonts w:ascii="Times New Roman" w:hAnsi="Times New Roman"/>
+          <w:b/>
+          <w:i w:val="0"/>
+          <w:sz w:val="22"/>
+        </w:rPr>
+        <w:t>DEPARTMENT OF ELECTRONICS AND COMMUNICATION ENGINEERING</w:t>
       </w:r>
     </w:p>
     <w:p>

</xml_diff>

<commit_message>
Follow template indent, spacing and chapter heading style
Co-Authored-By: Claude Sonnet 5.5 <noreply@anthropic.com>
Claude-Session: https://claude.ai/code/session_01XSGpBmyyfwNpi7tuzVvNqh
</commit_message>
<xml_diff>
--- a/report/BEACON_Project_Report.docx
+++ b/report/BEACON_Project_Report.docx
@@ -1750,14 +1750,15 @@
       </w:pPr>
       <w:r>
         <w:rPr>
-          <w:rStyle w:val="SectionNumber"/>
-        </w:rPr>
-        <w:t>1</w:t>
-      </w:r>
-      <w:r>
-        <w:tab/>
-      </w:r>
-      <w:r>
+          <w:b/>
+        </w:rPr>
+        <w:t>CHAPTER 1</w:t>
+        <w:br/>
+      </w:r>
+      <w:r>
+        <w:rPr>
+          <w:b/>
+        </w:rPr>
         <w:t>INTRODUCTION</w:t>
       </w:r>
     </w:p>
@@ -2376,14 +2377,15 @@
       </w:pPr>
       <w:r>
         <w:rPr>
-          <w:rStyle w:val="SectionNumber"/>
-        </w:rPr>
-        <w:t>2</w:t>
-      </w:r>
-      <w:r>
-        <w:tab/>
-      </w:r>
-      <w:r>
+          <w:b/>
+        </w:rPr>
+        <w:t>CHAPTER 2</w:t>
+        <w:br/>
+      </w:r>
+      <w:r>
+        <w:rPr>
+          <w:b/>
+        </w:rPr>
         <w:t>LITERATURE REVIEW</w:t>
       </w:r>
     </w:p>
@@ -3256,14 +3258,15 @@
       </w:pPr>
       <w:r>
         <w:rPr>
-          <w:rStyle w:val="SectionNumber"/>
-        </w:rPr>
-        <w:t>3</w:t>
-      </w:r>
-      <w:r>
-        <w:tab/>
-      </w:r>
-      <w:r>
+          <w:b/>
+        </w:rPr>
+        <w:t>CHAPTER 3</w:t>
+        <w:br/>
+      </w:r>
+      <w:r>
+        <w:rPr>
+          <w:b/>
+        </w:rPr>
         <w:t>METHODOLOGY / SYSTEM DESIGN</w:t>
       </w:r>
     </w:p>
@@ -7366,14 +7369,15 @@
       </w:pPr>
       <w:r>
         <w:rPr>
-          <w:rStyle w:val="SectionNumber"/>
-        </w:rPr>
-        <w:t>4</w:t>
-      </w:r>
-      <w:r>
-        <w:tab/>
-      </w:r>
-      <w:r>
+          <w:b/>
+        </w:rPr>
+        <w:t>CHAPTER 4</w:t>
+        <w:br/>
+      </w:r>
+      <w:r>
+        <w:rPr>
+          <w:b/>
+        </w:rPr>
         <w:t>IMPLEMENTATION AND DEPLOYMENT</w:t>
       </w:r>
     </w:p>
@@ -12317,14 +12321,15 @@
       </w:pPr>
       <w:r>
         <w:rPr>
-          <w:rStyle w:val="SectionNumber"/>
-        </w:rPr>
-        <w:t>5</w:t>
-      </w:r>
-      <w:r>
-        <w:tab/>
-      </w:r>
-      <w:r>
+          <w:b/>
+        </w:rPr>
+        <w:t>CHAPTER 5</w:t>
+        <w:br/>
+      </w:r>
+      <w:r>
+        <w:rPr>
+          <w:b/>
+        </w:rPr>
         <w:t>RESULTS AND DISCUSSION</w:t>
       </w:r>
     </w:p>
@@ -19357,14 +19362,15 @@
       </w:pPr>
       <w:r>
         <w:rPr>
-          <w:rStyle w:val="SectionNumber"/>
-        </w:rPr>
-        <w:t>6</w:t>
-      </w:r>
-      <w:r>
-        <w:tab/>
-      </w:r>
-      <w:r>
+          <w:b/>
+        </w:rPr>
+        <w:t>CHAPTER 6</w:t>
+        <w:br/>
+      </w:r>
+      <w:r>
+        <w:rPr>
+          <w:b/>
+        </w:rPr>
         <w:t>CONCLUSION AND FUTURE WORK</w:t>
       </w:r>
     </w:p>
@@ -21899,7 +21905,7 @@
     <w:name w:val="Normal"/>
     <w:qFormat/>
     <w:pPr>
-      <w:spacing w:line="360" w:lineRule="auto" w:after="160"/>
+      <w:spacing w:line="360" w:lineRule="auto" w:after="0" w:before="0"/>
       <w:ind w:firstLine="0"/>
     </w:pPr>
     <w:rPr>
@@ -21913,8 +21919,8 @@
     <w:basedOn w:val="Normal"/>
     <w:link w:val="BodyTextChar"/>
     <w:pPr>
-      <w:spacing w:after="160" w:before="180" w:line="360" w:lineRule="auto"/>
-      <w:ind w:firstLine="0"/>
+      <w:spacing w:after="0" w:before="0" w:line="360" w:lineRule="auto"/>
+      <w:ind w:firstLine="567"/>
       <w:jc w:val="both"/>
     </w:pPr>
     <w:qFormat/>
@@ -21930,7 +21936,7 @@
     <w:next w:val="BodyText"/>
     <w:qFormat/>
     <w:pPr>
-      <w:spacing w:line="360" w:lineRule="auto" w:after="160"/>
+      <w:spacing w:line="360" w:lineRule="auto" w:after="0" w:before="0"/>
       <w:ind w:firstLine="0"/>
       <w:jc w:val="both"/>
     </w:pPr>
@@ -21945,7 +21951,7 @@
     <w:basedOn w:val="BodyText"/>
     <w:qFormat/>
     <w:pPr>
-      <w:spacing w:after="40" w:before="36" w:line="240" w:lineRule="auto"/>
+      <w:spacing w:after="40" w:before="0" w:line="240" w:lineRule="auto"/>
       <w:ind w:firstLine="0"/>
     </w:pPr>
     <w:rPr>
@@ -22073,7 +22079,7 @@
       <w:keepNext/>
       <w:keepLines/>
       <w:pageBreakBefore/>
-      <w:spacing w:after="160" w:before="360"/>
+      <w:spacing w:after="400" w:before="400"/>
       <w:jc w:val="center"/>
       <w:outlineLvl w:val="0"/>
     </w:pPr>
@@ -22097,7 +22103,7 @@
     <w:pPr>
       <w:keepNext/>
       <w:keepLines/>
-      <w:spacing w:after="160" w:before="240"/>
+      <w:spacing w:after="120" w:before="240"/>
       <w:outlineLvl w:val="1"/>
     </w:pPr>
     <w:rPr>
@@ -22120,7 +22126,7 @@
     <w:pPr>
       <w:keepNext/>
       <w:keepLines/>
-      <w:spacing w:after="160" w:before="240"/>
+      <w:spacing w:after="80" w:before="200"/>
       <w:outlineLvl w:val="2"/>
     </w:pPr>
     <w:rPr>
@@ -22143,7 +22149,7 @@
     <w:pPr>
       <w:keepNext/>
       <w:keepLines/>
-      <w:spacing w:after="160" w:before="240"/>
+      <w:spacing w:after="80" w:before="200"/>
       <w:outlineLvl w:val="3"/>
     </w:pPr>
     <w:rPr>

</xml_diff>

<commit_message>
Add acknowledgement text to Word report; clean LaTeX placeholder
Co-Authored-By: Claude Sonnet 5.5 <noreply@anthropic.com>
Claude-Session: https://claude.ai/code/session_01XSGpBmyyfwNpi7tuzVvNqh
</commit_message>
<xml_diff>
--- a/report/BEACON_Project_Report.docx
+++ b/report/BEACON_Project_Report.docx
@@ -1008,18 +1008,185 @@
     </w:p>
     <w:p>
       <w:pPr>
-        <w:spacing w:after="120" w:before="0" w:line="276" w:lineRule="auto"/>
+        <w:spacing w:after="0" w:before="0" w:line="360" w:lineRule="auto"/>
+        <w:ind w:firstLine="567"/>
+        <w:jc w:val="both"/>
+      </w:pPr>
+      <w:r>
+        <w:rPr>
+          <w:b w:val="0"/>
+        </w:rPr>
+        <w:t xml:space="preserve">This project work would not have been possible without the contribution of many people. It gives us immense pleasure to express our profound gratitude to our honorable Chancellor </w:t>
+      </w:r>
+      <w:r>
+        <w:rPr>
+          <w:b/>
+        </w:rPr>
+        <w:t>SRI MATA AMRITANANDAMAYI DEVI</w:t>
+      </w:r>
+      <w:r>
+        <w:rPr>
+          <w:b w:val="0"/>
+        </w:rPr>
+        <w:t>, for her blessings and for being a source of inspiration.</w:t>
+      </w:r>
+    </w:p>
+    <w:p>
+      <w:pPr>
+        <w:spacing w:after="0" w:before="0" w:line="360" w:lineRule="auto"/>
+        <w:ind w:firstLine="567"/>
+        <w:jc w:val="both"/>
+      </w:pPr>
+      <w:r>
+        <w:rPr>
+          <w:b w:val="0"/>
+        </w:rPr>
+        <w:t xml:space="preserve">We are indebted to extend our gratitude to our Director, </w:t>
+      </w:r>
+      <w:r>
+        <w:rPr>
+          <w:b/>
+        </w:rPr>
+        <w:t>Mr. I B MANIKANTAN</w:t>
+      </w:r>
+      <w:r>
+        <w:rPr>
+          <w:b w:val="0"/>
+        </w:rPr>
+        <w:t>, Amrita Vishwa Vidyapeetham, Chennai for facilitating us all the facilities and extended support to gain valuable education and learning experience.</w:t>
+      </w:r>
+    </w:p>
+    <w:p>
+      <w:pPr>
+        <w:spacing w:after="0" w:before="0" w:line="360" w:lineRule="auto"/>
+        <w:ind w:firstLine="567"/>
+        <w:jc w:val="both"/>
+      </w:pPr>
+      <w:r>
+        <w:rPr>
+          <w:b w:val="0"/>
+        </w:rPr>
+        <w:t xml:space="preserve">We register our special thanks to </w:t>
+      </w:r>
+      <w:r>
+        <w:rPr>
+          <w:b/>
+        </w:rPr>
+        <w:t>Dr. V. JAYAKUMAR</w:t>
+      </w:r>
+      <w:r>
+        <w:rPr>
+          <w:b w:val="0"/>
+        </w:rPr>
+        <w:t xml:space="preserve">, Principal, Amrita Vishwa Vidyapeetham, Chennai for the support given to us in the successful conduct of this project. We wish to express our sincere gratitude to </w:t>
+      </w:r>
+      <w:r>
+        <w:rPr>
+          <w:b/>
+        </w:rPr>
+        <w:t>DR. LAKSHMANAN S A</w:t>
+      </w:r>
+      <w:r>
+        <w:rPr>
+          <w:b w:val="0"/>
+        </w:rPr>
+        <w:t xml:space="preserve">, Chairperson, Department of Electronics and Communication Engineering, and our supervisor </w:t>
+      </w:r>
+      <w:r>
+        <w:rPr>
+          <w:b/>
+        </w:rPr>
+        <w:t>DR. M GAYATHRI</w:t>
+      </w:r>
+      <w:r>
+        <w:rPr>
+          <w:b w:val="0"/>
+        </w:rPr>
+        <w:t xml:space="preserve"> for their inspiring guidance, personal involvement, and constant encouragement during the entire course of this work.</w:t>
+      </w:r>
+    </w:p>
+    <w:p>
+      <w:pPr>
+        <w:spacing w:after="0" w:before="0" w:line="360" w:lineRule="auto"/>
+        <w:ind w:firstLine="567"/>
+        <w:jc w:val="both"/>
+      </w:pPr>
+      <w:r>
+        <w:rPr>
+          <w:b w:val="0"/>
+        </w:rPr>
+        <w:t>We are grateful to Project Coordinator, Review Panel Members and the entire faculty of the Department of Electronics and Communication Engineering, for their constructive criticisms and valuable suggestions which have been a rich source to improve the quality of this work.</w:t>
+      </w:r>
+    </w:p>
+    <w:p>
+      <w:pPr>
+        <w:spacing w:after="600" w:before="0" w:line="276" w:lineRule="auto"/>
         <w:ind w:firstLine="0"/>
-        <w:jc w:val="left"/>
+        <w:jc w:val="center"/>
+      </w:pPr>
+    </w:p>
+    <w:p>
+      <w:pPr>
+        <w:spacing w:after="0" w:before="0" w:line="276" w:lineRule="auto"/>
+        <w:ind w:firstLine="0"/>
+        <w:jc w:val="right"/>
       </w:pPr>
       <w:r>
         <w:rPr>
           <w:rFonts w:ascii="Times New Roman" w:hAnsi="Times New Roman"/>
-          <w:b w:val="0"/>
+          <w:b/>
           <w:i w:val="0"/>
           <w:sz w:val="24"/>
         </w:rPr>
-        <w:t>[To be completed by the authors.]</w:t>
+        <w:t>V NAVEEN</w:t>
+      </w:r>
+    </w:p>
+    <w:p>
+      <w:pPr>
+        <w:spacing w:after="200" w:before="0" w:line="276" w:lineRule="auto"/>
+        <w:ind w:firstLine="0"/>
+        <w:jc w:val="right"/>
+      </w:pPr>
+      <w:r>
+        <w:rPr>
+          <w:rFonts w:ascii="Times New Roman" w:hAnsi="Times New Roman"/>
+          <w:b/>
+          <w:i w:val="0"/>
+          <w:sz w:val="24"/>
+        </w:rPr>
+        <w:t>CH.EN.U4CCE23054</w:t>
+      </w:r>
+    </w:p>
+    <w:p>
+      <w:pPr>
+        <w:spacing w:after="0" w:before="0" w:line="276" w:lineRule="auto"/>
+        <w:ind w:firstLine="0"/>
+        <w:jc w:val="right"/>
+      </w:pPr>
+      <w:r>
+        <w:rPr>
+          <w:rFonts w:ascii="Times New Roman" w:hAnsi="Times New Roman"/>
+          <w:b/>
+          <w:i w:val="0"/>
+          <w:sz w:val="24"/>
+        </w:rPr>
+        <w:t>SANJAY P</w:t>
+      </w:r>
+    </w:p>
+    <w:p>
+      <w:pPr>
+        <w:spacing w:after="200" w:before="0" w:line="276" w:lineRule="auto"/>
+        <w:ind w:firstLine="0"/>
+        <w:jc w:val="right"/>
+      </w:pPr>
+      <w:r>
+        <w:rPr>
+          <w:rFonts w:ascii="Times New Roman" w:hAnsi="Times New Roman"/>
+          <w:b/>
+          <w:i w:val="0"/>
+          <w:sz w:val="24"/>
+        </w:rPr>
+        <w:t>CH.EN.U4CCE23042</w:t>
       </w:r>
     </w:p>
     <w:p>

</xml_diff>

<commit_message>
Add single-file LaTeX report that works with the stock template class; fix alignment
Co-Authored-By: Claude Sonnet 5.5 <noreply@anthropic.com>
Claude-Session: https://claude.ai/code/session_01XSGpBmyyfwNpi7tuzVvNqh
</commit_message>
<xml_diff>
--- a/report/BEACON_Project_Report.docx
+++ b/report/BEACON_Project_Report.docx
@@ -17335,7 +17335,7 @@
       </w:r>
     </w:p>
     <w:bookmarkEnd w:id="100"/>
-    <w:bookmarkStart w:id="101" w:name="X26c779bc697a8a944fe6628e70e8feac4fbc77c"/>
+    <w:bookmarkStart w:id="101" w:name="Xd3eceaa1d102af3c39ecdd10656f2d2a5d3468b"/>
     <w:p>
       <w:pPr>
         <w:pStyle w:val="Heading2"/>
@@ -17350,7 +17350,7 @@
         <w:tab/>
       </w:r>
       <w:r>
-        <w:t>A THIRD DATASET, TEMPERATURE, AND KNOWING WHEN TO REFUSE</w:t>
+        <w:t>A THIRD DATASET AND KNOWING WHEN TO REFUSE</w:t>
       </w:r>
     </w:p>
     <w:p>
@@ -19880,9 +19880,9 @@
         </w:tblBorders>
       </w:tblPr>
       <w:tblGrid>
-        <w:gridCol w:w="1108"/>
-        <w:gridCol w:w="3168"/>
-        <w:gridCol w:w="2692"/>
+        <w:gridCol w:w="712"/>
+        <w:gridCol w:w="3009"/>
+        <w:gridCol w:w="3247"/>
       </w:tblGrid>
       <w:tr>
         <w:trPr>
@@ -20219,7 +20219,14 @@
                 <w:rStyle w:val="VerbatimChar"/>
                 <w:sz w:val="20"/>
               </w:rPr>
-              <w:t xml:space="preserve">calce_rul_horizon_early_ref/</w:t>
+              <w:t xml:space="preserve">calce_rul_horizon_</w:t>
+            </w:r>
+            <w:r>
+              <w:rPr>
+                <w:rStyle w:val="VerbatimChar"/>
+                <w:sz w:val="20"/>
+              </w:rPr>
+              <w:t xml:space="preserve">early_ref/</w:t>
             </w:r>
             <w:r>
               <w:rPr>
@@ -20658,7 +20665,14 @@
                 <w:rStyle w:val="VerbatimChar"/>
                 <w:sz w:val="20"/>
               </w:rPr>
-              <w:t xml:space="preserve">reports/figures/results_*.png</w:t>
+              <w:t xml:space="preserve">reports/figures/</w:t>
+            </w:r>
+            <w:r>
+              <w:rPr>
+                <w:rStyle w:val="VerbatimChar"/>
+                <w:sz w:val="20"/>
+              </w:rPr>
+              <w:t xml:space="preserve">results_*.png</w:t>
             </w:r>
           </w:p>
         </w:tc>

</xml_diff>

<commit_message>
Fix report errors found in audit (RUL bias, Oxford figures, dashboard description, ranges, wording)
Co-Authored-By: Claude Sonnet 5.5 <noreply@anthropic.com>
Claude-Session: https://claude.ai/code/session_01XSGpBmyyfwNpi7tuzVvNqh
</commit_message>
<xml_diff>
--- a/report/BEACON_Project_Report.docx
+++ b/report/BEACON_Project_Report.docx
@@ -3996,7 +3996,7 @@
               <w:rPr>
                 <w:sz w:val="20"/>
               </w:rPr>
-              <w:t xml:space="preserve">18650 cells, 9 protocols, ambient 4–43 </w:t>
+              <w:t xml:space="preserve">18650 cells, 9 protocols, ambient 4–44 </w:t>
             </w:r>
             <m:oMath>
               <m:sSup>
@@ -7132,7 +7132,7 @@
         <w:t xml:space="preserve"> </w:t>
       </w:r>
       <w:r>
-        <w:t xml:space="preserve">validated against measured degradation. The Spearman correlation between the risk score and measured fade on 33 NASA cells was</w:t>
+        <w:t xml:space="preserve">validated against measured degradation. The Spearman correlation between the risk score and measured fade on a separate set of 33 NASA cells was</w:t>
       </w:r>
       <w:r>
         <w:t xml:space="preserve"> </w:t>
@@ -7215,7 +7215,7 @@
         <w:t xml:space="preserve"> </w:t>
       </w:r>
       <w:r>
-        <w:t xml:space="preserve">Ground truth is the cycler’s measured discharge capacity, which never enters an estimate. SOH truth is capacity over the median of the cell’s first five cycles. For partial-cycling cells, whose checks are about 100 cycles apart, it is capacity over the checks within the first ten cycles. This is the reference a BMS can hold. A reference drawn from the cell’s whole record uses the future, and Section 5.5 quantifies the resulting inflation.</w:t>
+        <w:t xml:space="preserve">Ground truth is the cycler’s measured discharge capacity, which never enters an estimate. SOH truth is capacity over the median of the cell’s first five cycles. For partial-cycling cells, whose checks are about 100 cycles apart, the partial-discharge study scores each cell against its first check, and the remaining-life study uses the capacity over the checks within the first ten cycles. Each is a reference a BMS can hold. A reference drawn from the cell’s whole record uses the future, and Section 5.5 quantifies the resulting inflation.</w:t>
       </w:r>
     </w:p>
     <w:p>
@@ -11976,249 +11976,9 @@
         <w:pStyle w:val="BodyText"/>
       </w:pPr>
       <w:r>
-        <w:t xml:space="preserve">The React client has five views (Table 4.9). A Guardian explanation is rendered inside the CAN replay view and not as its own tab, because it is only meaningful next to the run it explains. Refusals are rendered as results and not as errors.</w:t>
-      </w:r>
-    </w:p>
-    <w:p>
-      <w:pPr>
-        <w:pStyle w:val="TableCaption"/>
-      </w:pPr>
-      <w:r>
-        <w:t xml:space="preserve">Table 4.9: Dashboard Views</w:t>
-      </w:r>
-    </w:p>
-    <w:tbl>
-      <w:tblPr>
-        <w:tblStyle w:val="Table"/>
-        <w:tblW w:type="pct" w:w="4250"/>
-        <w:tblLook w:firstRow="1" w:lastRow="0" w:firstColumn="0" w:lastColumn="0" w:noHBand="0" w:noVBand="0" w:val="0020"/>
-        <w:jc w:val="start"/>
-        <w:tblCaption w:val="Table 4.9: Dashboard Views"/>
-        <w:tblBorders>
-          <w:top w:val="single" w:sz="4" w:color="000000"/>
-          <w:left w:val="single" w:sz="4" w:color="000000"/>
-          <w:bottom w:val="single" w:sz="4" w:color="000000"/>
-          <w:right w:val="single" w:sz="4" w:color="000000"/>
-          <w:insideH w:val="single" w:sz="4" w:color="000000"/>
-          <w:insideV w:val="single" w:sz="4" w:color="000000"/>
-        </w:tblBorders>
-      </w:tblPr>
-      <w:tblGrid>
-        <w:gridCol w:w="1980"/>
-        <w:gridCol w:w="4752"/>
-      </w:tblGrid>
-      <w:tr>
-        <w:trPr>
-          <w:tblHeader w:val="true"/>
-        </w:trPr>
-        <w:tc>
-          <w:tcPr/>
-          <w:p>
-            <w:pPr>
-              <w:pStyle w:val="Compact"/>
-              <w:spacing w:after="40" w:line="240" w:lineRule="auto"/>
-              <w:jc w:val="left"/>
-            </w:pPr>
-            <w:r>
-              <w:rPr>
-                <w:bCs/>
-                <w:b/>
-                <w:sz w:val="20"/>
-              </w:rPr>
-              <w:t xml:space="preserve">View</w:t>
-            </w:r>
-          </w:p>
-        </w:tc>
-        <w:tc>
-          <w:tcPr/>
-          <w:p>
-            <w:pPr>
-              <w:pStyle w:val="Compact"/>
-              <w:spacing w:after="40" w:line="240" w:lineRule="auto"/>
-              <w:jc w:val="left"/>
-            </w:pPr>
-            <w:r>
-              <w:rPr>
-                <w:bCs/>
-                <w:b/>
-                <w:sz w:val="20"/>
-              </w:rPr>
-              <w:t xml:space="preserve">Shows</w:t>
-            </w:r>
-          </w:p>
-        </w:tc>
-      </w:tr>
-      <w:tr>
-        <w:tc>
-          <w:tcPr/>
-          <w:p>
-            <w:pPr>
-              <w:pStyle w:val="Compact"/>
-              <w:spacing w:after="40" w:line="240" w:lineRule="auto"/>
-              <w:jc w:val="left"/>
-            </w:pPr>
-            <w:r>
-              <w:rPr>
-                <w:sz w:val="20"/>
-              </w:rPr>
-              <w:t xml:space="preserve">Fleet</w:t>
-            </w:r>
-          </w:p>
-        </w:tc>
-        <w:tc>
-          <w:tcPr/>
-          <w:p>
-            <w:pPr>
-              <w:pStyle w:val="Compact"/>
-              <w:spacing w:after="40" w:line="240" w:lineRule="auto"/>
-              <w:jc w:val="left"/>
-            </w:pPr>
-            <w:r>
-              <w:rPr>
-                <w:sz w:val="20"/>
-              </w:rPr>
-              <w:t xml:space="preserve">Fleet table with health, risk and RUL per battery, from a simulated or loaded run</w:t>
-            </w:r>
-          </w:p>
-        </w:tc>
-      </w:tr>
-      <w:tr>
-        <w:tc>
-          <w:tcPr/>
-          <w:p>
-            <w:pPr>
-              <w:pStyle w:val="Compact"/>
-              <w:spacing w:after="40" w:line="240" w:lineRule="auto"/>
-              <w:jc w:val="left"/>
-            </w:pPr>
-            <w:r>
-              <w:rPr>
-                <w:sz w:val="20"/>
-              </w:rPr>
-              <w:t xml:space="preserve">CAN Replay</w:t>
-            </w:r>
-          </w:p>
-        </w:tc>
-        <w:tc>
-          <w:tcPr/>
-          <w:p>
-            <w:pPr>
-              <w:pStyle w:val="Compact"/>
-              <w:spacing w:after="40" w:line="240" w:lineRule="auto"/>
-              <w:jc w:val="left"/>
-            </w:pPr>
-            <w:r>
-              <w:rPr>
-                <w:sz w:val="20"/>
-              </w:rPr>
-              <w:t xml:space="preserve">Replay of a decoded CAN capture with coverage and the Guardian explanation</w:t>
-            </w:r>
-          </w:p>
-        </w:tc>
-      </w:tr>
-      <w:tr>
-        <w:tc>
-          <w:tcPr/>
-          <w:p>
-            <w:pPr>
-              <w:pStyle w:val="Compact"/>
-              <w:spacing w:after="40" w:line="240" w:lineRule="auto"/>
-              <w:jc w:val="left"/>
-            </w:pPr>
-            <w:r>
-              <w:rPr>
-                <w:sz w:val="20"/>
-              </w:rPr>
-              <w:t xml:space="preserve">Digital Twin</w:t>
-            </w:r>
-          </w:p>
-        </w:tc>
-        <w:tc>
-          <w:tcPr/>
-          <w:p>
-            <w:pPr>
-              <w:pStyle w:val="Compact"/>
-              <w:spacing w:after="40" w:line="240" w:lineRule="auto"/>
-              <w:jc w:val="left"/>
-            </w:pPr>
-            <w:r>
-              <w:rPr>
-                <w:sz w:val="20"/>
-              </w:rPr>
-              <w:t xml:space="preserve">Twin state and state transitions for a battery</w:t>
-            </w:r>
-          </w:p>
-        </w:tc>
-      </w:tr>
-      <w:tr>
-        <w:tc>
-          <w:tcPr/>
-          <w:p>
-            <w:pPr>
-              <w:pStyle w:val="Compact"/>
-              <w:spacing w:after="40" w:line="240" w:lineRule="auto"/>
-              <w:jc w:val="left"/>
-            </w:pPr>
-            <w:r>
-              <w:rPr>
-                <w:sz w:val="20"/>
-              </w:rPr>
-              <w:t xml:space="preserve">Thermal</w:t>
-            </w:r>
-          </w:p>
-        </w:tc>
-        <w:tc>
-          <w:tcPr/>
-          <w:p>
-            <w:pPr>
-              <w:pStyle w:val="Compact"/>
-              <w:spacing w:after="40" w:line="240" w:lineRule="auto"/>
-              <w:jc w:val="left"/>
-            </w:pPr>
-            <w:r>
-              <w:rPr>
-                <w:sz w:val="20"/>
-              </w:rPr>
-              <w:t xml:space="preserve">Pack temperature view built only from what was measured</w:t>
-            </w:r>
-          </w:p>
-        </w:tc>
-      </w:tr>
-      <w:tr>
-        <w:tc>
-          <w:tcPr/>
-          <w:p>
-            <w:pPr>
-              <w:pStyle w:val="Compact"/>
-              <w:spacing w:after="40" w:line="240" w:lineRule="auto"/>
-              <w:jc w:val="left"/>
-            </w:pPr>
-            <w:r>
-              <w:rPr>
-                <w:sz w:val="20"/>
-              </w:rPr>
-              <w:t xml:space="preserve">Transfer Validation</w:t>
-            </w:r>
-          </w:p>
-        </w:tc>
-        <w:tc>
-          <w:tcPr/>
-          <w:p>
-            <w:pPr>
-              <w:pStyle w:val="Compact"/>
-              <w:spacing w:after="40" w:line="240" w:lineRule="auto"/>
-              <w:jc w:val="left"/>
-            </w:pPr>
-            <w:r>
-              <w:rPr>
-                <w:sz w:val="20"/>
-              </w:rPr>
-              <w:t xml:space="preserve">Whether a model may be transferred between datasets, and why not</w:t>
-            </w:r>
-          </w:p>
-        </w:tc>
-      </w:tr>
-    </w:tbl>
+        <w:t xml:space="preserve">The React client is a single-surface dashboard. It shows the fleet of batteries with health, risk and remaining life for each, a battery detail view, a digital-twin sheet with the twin state and its transitions, and a banner stating where the run’s data came from. An earlier version had separate tabs for fleet, CAN replay, thermal and transfer views. They were removed because two parallel dashboards meant two provenance banners that could disagree about the same run. A Guardian explanation is shown next to the run it explains, and refusals are rendered as results and not as errors.</w:t>
+      </w:r>
+    </w:p>
     <w:p>
       <w:pPr>
         <w:pStyle w:val="BodyText"/>
@@ -16195,7 +15955,7 @@
         <w:t xml:space="preserve"> </w:t>
       </w:r>
       <w:r>
-        <w:t xml:space="preserve">claim is true near end of life and false far from it (0% at 200 or more cycles out), so it is reported with its condition and not bare. The conservative direction is a property of the 90% threshold on these cells and is not a general guarantee. At an 85% threshold the median bias near end of life turns positive (+17.6 cycles within 25 cycles of end of life), so the estimate runs late there and only 62.8% of estimates fall within</w:t>
+        <w:t xml:space="preserve">claim is true near end of life and false far from it (0% at 200 or more cycles out), so it is reported with its condition and not bare. The conservative direction is a property of the 90% threshold on these cells and is not a general guarantee. At an 85% threshold the median bias near end of life turns positive (+6.7 cycles within 25 cycles of end of life), so the estimate runs late there and only 62.8% of estimates fall within</w:t>
       </w:r>
       <w:r>
         <w:t xml:space="preserve"> </w:t>
@@ -16470,7 +16230,7 @@
         <w:pStyle w:val="BodyText"/>
       </w:pPr>
       <w:r>
-        <w:t xml:space="preserve">The failure of the field-trajectory method has a clean cause. Near 0.90, field SOH reads a median 1.1 points below capacity. Because fade near the threshold is slow, that small bias moves the 0.90 crossing a median 56 cycles early. An SOH error that is acceptable as a health figure thus becomes large as a time to threshold. None of the four is reported, and the system refuses RUL for partial-only records and states that this was tested.</w:t>
+        <w:t xml:space="preserve">The failure of the field-trajectory method has a clean cause. Near 0.90, field SOH reads a median 1.1 points below capacity (measured in a first pass of this study, not kept as a separate artifact). Because fade near the threshold is slow, that small bias moves the 0.90 crossing a median 56 cycles early. An SOH error that is acceptable as a health figure thus becomes large as a time to threshold. None of the four is reported, and the system refuses RUL for partial-only records and states that this was tested.</w:t>
       </w:r>
     </w:p>
     <w:bookmarkEnd w:id="98"/>
@@ -17331,7 +17091,7 @@
         <w:t xml:space="preserve"> </w:t>
       </w:r>
       <w:r>
-        <w:t xml:space="preserve">The Oxford trajectories cross the 80% convention, so the shipped RUL estimator was scored there unchanged. When it predicted fewer than 500 cycles to 80%, the cell lasted at least that long in 97% of cases (36 estimates, 5 cells). Precision is low: the median miss is 385 cycles against characterisations 100 cycles apart. The guarantee also weakens with distance, since predictions of 500 to 1,000 cycles were met or exceeded only 79% of the time (24 estimates, 5 cells).</w:t>
+        <w:t xml:space="preserve">The Oxford trajectories cross the 80% convention, so the shipped RUL estimator was scored there unchanged. When it predicted fewer than 500 cycles to 80%, the cell lasted at least that long in 97% of cases (36 estimates, 5 cells). Precision is low: the median miss is 385 cycles against characterisations 100 cycles apart. The guarantee also weakens with distance, since predictions of 500 to 1,000 cycles were met or exceeded only 80% of the time (25 estimates, 5 cells).</w:t>
       </w:r>
     </w:p>
     <w:bookmarkEnd w:id="100"/>
@@ -18320,7 +18080,7 @@
         <w:pStyle w:val="BodyText"/>
       </w:pPr>
       <w:r>
-        <w:t xml:space="preserve">The health figure is within a third of a point. The remaining-life figure is 51 cycles early, which is the conservative bias the RUL study measured at that distance (median</w:t>
+        <w:t xml:space="preserve">The health figure is within half a point. The remaining-life figure is 51 cycles early, which is the conservative bias the RUL study measured at that distance (median</w:t>
       </w:r>
       <w:r>
         <w:t xml:space="preserve"> </w:t>
@@ -18377,7 +18137,7 @@
         <w:t xml:space="preserve"> </w:t>
       </w:r>
       <w:r>
-        <w:t xml:space="preserve">Across fourteen fitted methods, LOCO differences were smaller than the uncertainty on any one of them. Three conditioning decisions, by contrast, changed error by multiples. Refusing truncated discharges took the worst cell from 52% to about 10%. Identifying resistance from the load step took the median from 4.3% to 1.7% and coverage from 12 to 17 cells. Refusing knee windows converted 6.8–12.8% errors into refusals. For a BMS software layer, the leverage lies in what is measured and how it is conditioned, not in the regressor that follows. The first of these was a misdiagnosis corrected during the project: the 52% worst case had been attributed to loss of active material, when it was actually truncated discharges being read as full ones.</w:t>
+        <w:t xml:space="preserve">Across fourteen scored methods, LOCO differences were smaller than the uncertainty on any one of them. Three conditioning decisions, by contrast, changed error by multiples. Refusing truncated discharges took the worst cell from 52% to about 10%. Identifying resistance from the load step took the median from 4.3% to 1.7% and coverage from 12 to 17 cells. Refusing knee windows converted 6.8–12.8% errors into refusals. For a BMS software layer, the leverage lies in what is measured and how it is conditioned, not in the regressor that follows. The first of these was a misdiagnosis corrected during the project: the 52% worst case had been attributed to loss of active material, when it was actually truncated discharges being read as full ones.</w:t>
       </w:r>
     </w:p>
     <w:p>
@@ -18395,7 +18155,7 @@
         <w:t xml:space="preserve"> </w:t>
       </w:r>
       <w:r>
-        <w:t xml:space="preserve">Two results moved when the reference was made one a BMS can hold: RUL accuracy fell from 88% to 73%, and a partial-discharge reference formed at discharge 805 produced a 58% error until the timing gate existed. Validation should use the reference the deployed system will have.</w:t>
+        <w:t xml:space="preserve">Two results moved when the reference was made one a BMS can hold: RUL accuracy fell from 88% to 73%, and a partial-discharge reference formed from a late discharge produced a large error until the timing gate existed. Validation should use the reference the deployed system will have.</w:t>
       </w:r>
     </w:p>
     <w:p>
@@ -19822,7 +19582,7 @@
         <w:pStyle w:val="BodyText"/>
       </w:pPr>
       <w:r>
-        <w:t xml:space="preserve">Every number in this report is regenerated by a named script from committed artifacts. Table 1 maps each results section to the artifact under</w:t>
+        <w:t xml:space="preserve">Every number in this report is regenerated by a named script from committed artifacts. Table A.1 maps each results section to the artifact under</w:t>
       </w:r>
       <w:r>
         <w:t xml:space="preserve"> </w:t>
@@ -19860,7 +19620,7 @@
         <w:pStyle w:val="TableCaption"/>
       </w:pPr>
       <w:r>
-        <w:t xml:space="preserve">Table 1: Artifacts and Scripts Behind Each Results Section</w:t>
+        <w:t xml:space="preserve">Table A.1: Artifacts and Scripts Behind Each Results Section</w:t>
       </w:r>
     </w:p>
     <w:tbl>
@@ -19869,7 +19629,7 @@
         <w:tblW w:type="pct" w:w="4400"/>
         <w:tblLook w:firstRow="1" w:lastRow="0" w:firstColumn="0" w:lastColumn="0" w:noHBand="0" w:noVBand="0" w:val="0020"/>
         <w:jc w:val="start"/>
-        <w:tblCaption w:val="Table 1: Artifacts and Scripts Behind Each Results Section"/>
+        <w:tblCaption w:val="Table A.1: Artifacts and Scripts Behind Each Results Section"/>
         <w:tblBorders>
           <w:top w:val="single" w:sz="4" w:color="000000"/>
           <w:left w:val="single" w:sz="4" w:color="000000"/>
@@ -20508,7 +20268,7 @@
                 <w:rStyle w:val="VerbatimChar"/>
                 <w:sz w:val="20"/>
               </w:rPr>
-              <w:t xml:space="preserve">run_cross_dataset_ study.py</w:t>
+              <w:t xml:space="preserve">run_cross_dataset_study.py</w:t>
             </w:r>
           </w:p>
         </w:tc>

</xml_diff>

<commit_message>
Match template heading conventions: uppercase sections, title-case subsections, Fig. abbreviation
Co-Authored-By: Claude Sonnet 5.5 <noreply@anthropic.com>
Claude-Session: https://claude.ai/code/session_01XSGpBmyyfwNpi7tuzVvNqh
</commit_message>
<xml_diff>
--- a/report/BEACON_Project_Report.docx
+++ b/report/BEACON_Project_Report.docx
@@ -3576,7 +3576,7 @@
         <w:tab/>
       </w:r>
       <w:r>
-        <w:t xml:space="preserve">RESEARCH VARIABLES</w:t>
+        <w:t xml:space="preserve">Research Variables</w:t>
       </w:r>
     </w:p>
     <w:p>
@@ -3740,7 +3740,7 @@
         <w:tab/>
       </w:r>
       <w:r>
-        <w:t xml:space="preserve">ONE SCORING PATH, EXTRACTED RATHER THAN COPIED</w:t>
+        <w:t xml:space="preserve">One Scoring Path, Extracted Rather Than Copied</w:t>
       </w:r>
     </w:p>
     <w:p>
@@ -4780,7 +4780,7 @@
         <w:pStyle w:val="BodyText"/>
       </w:pPr>
       <w:r>
-        <w:t xml:space="preserve">Equation (3.1) assumes the discharge curve scales approximately uniformly with capacity. Loss of lithium inventory shifts the curve, which the ratio partly absorbs. Loss of active material and resistance growth change its shape and position, which it does not. This is the method’s principal approximation, and Section 5.7 measures how it drifts with age. Figure 3.2 summarises the estimator.</w:t>
+        <w:t xml:space="preserve">Equation (3.1) assumes the discharge curve scales approximately uniformly with capacity. Loss of lithium inventory shifts the curve, which the ratio partly absorbs. Loss of active material and resistance growth change its shape and position, which it does not. This is the method’s principal approximation, and Section 5.7 measures how it drifts with age. Fig. 3.2 summarises the estimator.</w:t>
       </w:r>
     </w:p>
     <w:p>
@@ -9104,7 +9104,7 @@
         <w:tab/>
       </w:r>
       <w:r>
-        <w:t xml:space="preserve">THE SEAM IS NARROW</w:t>
+        <w:t xml:space="preserve">The Seam Is Narrow</w:t>
       </w:r>
     </w:p>
     <w:p>
@@ -9314,7 +9314,7 @@
         <w:tab/>
       </w:r>
       <w:r>
-        <w:t xml:space="preserve">FRAMING BY SENTINEL</w:t>
+        <w:t xml:space="preserve">Framing by Sentinel</w:t>
       </w:r>
     </w:p>
     <w:p>
@@ -9356,7 +9356,7 @@
         <w:tab/>
       </w:r>
       <w:r>
-        <w:t xml:space="preserve">ERROR DETECTION</w:t>
+        <w:t xml:space="preserve">Error Detection</w:t>
       </w:r>
     </w:p>
     <w:p>
@@ -9383,7 +9383,7 @@
         <w:tab/>
       </w:r>
       <w:r>
-        <w:t xml:space="preserve">CHANNEL UTILISATION</w:t>
+        <w:t xml:space="preserve">Channel Utilisation</w:t>
       </w:r>
     </w:p>
     <w:p>
@@ -10182,7 +10182,7 @@
         <w:tab/>
       </w:r>
       <w:r>
-        <w:t xml:space="preserve">REQUIREMENT AND DESIGN CALCULATIONS</w:t>
+        <w:t xml:space="preserve">Requirement and Design Calculations</w:t>
       </w:r>
     </w:p>
     <w:p>
@@ -10730,7 +10730,7 @@
         <w:tab/>
       </w:r>
       <w:r>
-        <w:t xml:space="preserve">AS-BUILT RIG</w:t>
+        <w:t xml:space="preserve">As-Built Rig</w:t>
       </w:r>
     </w:p>
     <w:p>
@@ -11179,7 +11179,7 @@
         <w:tab/>
       </w:r>
       <w:r>
-        <w:t xml:space="preserve">FIRMWARE</w:t>
+        <w:t xml:space="preserve">Firmware</w:t>
       </w:r>
     </w:p>
     <w:p>
@@ -11517,7 +11517,7 @@
         <w:tab/>
       </w:r>
       <w:r>
-        <w:t xml:space="preserve">BRING-UP PROCEDURE</w:t>
+        <w:t xml:space="preserve">Bring-Up Procedure</w:t>
       </w:r>
     </w:p>
     <w:p>
@@ -14419,7 +14419,7 @@
         <w:pStyle w:val="BodyText"/>
       </w:pPr>
       <w:r>
-        <w:t xml:space="preserve">The denominators differ because a correction can only be scored on cells for which it exists: one cell never rests before discharging, so no step resistance exists for it, which gives 17 of 21 cells for the field arm and 17 of 22 once that cell is counted as refused. The three worst cells (6.4–10.3%) are all Type 3, whose discharge switches rate within a cycle. Every refusal carries a stated cause: four storage and partial-protocol cells delivered 80–155 equivalent full cycles before any constant-current discharge crossed the window, so the reference gate refused them, and one cell never rests before discharging. Figure 5.1 tracks the estimate against every laboratory capacity test, and Fig. 5.2 shows every measured cell.</w:t>
+        <w:t xml:space="preserve">The denominators differ because a correction can only be scored on cells for which it exists: one cell never rests before discharging, so no step resistance exists for it, which gives 17 of 21 cells for the field arm and 17 of 22 once that cell is counted as refused. The three worst cells (6.4–10.3%) are all Type 3, whose discharge switches rate within a cycle. Every refusal carries a stated cause: four storage and partial-protocol cells delivered 80–155 equivalent full cycles before any constant-current discharge crossed the window, so the reference gate refused them, and one cell never rests before discharging. Fig. 5.1 tracks the estimate against every laboratory capacity test, and Fig. 5.2 shows every measured cell.</w:t>
       </w:r>
     </w:p>
     <w:p>
@@ -15836,7 +15836,7 @@
         </m:r>
       </m:oMath>
       <w:r>
-        <w:t xml:space="preserve">20 cycles 88% of the time near end of life. That reference uses the future, which no BMS can hold. Against the cell’s own early capacity the figure is 73%, and that is the figure reported. Figure 5.3 summarises the result.</w:t>
+        <w:t xml:space="preserve">20 cycles 88% of the time near end of life. That reference uses the future, which no BMS can hold. Against the cell’s own early capacity the figure is 73%, and that is the figure reported. Fig. 5.3 summarises the result.</w:t>
       </w:r>
     </w:p>
     <w:p>
@@ -17231,7 +17231,7 @@
         <w:tab/>
       </w:r>
       <w:r>
-        <w:t xml:space="preserve">BENCH RIG CAPTURES</w:t>
+        <w:t xml:space="preserve">Bench Rig Captures</w:t>
       </w:r>
     </w:p>
     <w:p>
@@ -17714,7 +17714,7 @@
         <w:tab/>
       </w:r>
       <w:r>
-        <w:t xml:space="preserve">FAULT INJECTION</w:t>
+        <w:t xml:space="preserve">Fault Injection</w:t>
       </w:r>
     </w:p>
     <w:p>
@@ -17741,7 +17741,7 @@
         <w:tab/>
       </w:r>
       <w:r>
-        <w:t xml:space="preserve">WHAT THE HARDWARE RESULT DOES AND DOES NOT SHOW</w:t>
+        <w:t xml:space="preserve">What the Hardware Result Does and Does Not Show</w:t>
       </w:r>
     </w:p>
     <w:p>
@@ -17793,7 +17793,7 @@
         <w:pStyle w:val="FirstParagraph"/>
       </w:pPr>
       <w:r>
-        <w:t xml:space="preserve">Figure 5.4 abridges the report card for CALCE cell CS2_35 as it would have read at cycle 90. The pipeline saw voltage, current and time only.</w:t>
+        <w:t xml:space="preserve">Fig. 5.4 abridges the report card for CALCE cell CS2_35 as it would have read at cycle 90. The pipeline saw voltage, current and time only.</w:t>
       </w:r>
     </w:p>
     <w:tbl>

</xml_diff>

<commit_message>
Add dashboard screenshots, benchmark chart and rig capture plot to the report
Co-Authored-By: Claude Sonnet 5.5 <noreply@anthropic.com>
Claude-Session: https://claude.ai/code/session_01XSGpBmyyfwNpi7tuzVvNqh
</commit_message>
<xml_diff>
--- a/report/BEACON_Project_Report.docx
+++ b/report/BEACON_Project_Report.docx
@@ -202,7 +202,7 @@
         <w:drawing>
           <wp:inline>
             <wp:extent cx="1828800" cy="607614"/>
-            <wp:docPr id="97" name="Picture 97"/>
+            <wp:docPr id="117" name="Picture 117"/>
             <wp:cNvGraphicFramePr>
               <a:graphicFrameLocks noChangeAspect="1"/>
             </wp:cNvGraphicFramePr>
@@ -326,7 +326,7 @@
         <w:drawing>
           <wp:inline>
             <wp:extent cx="2926080" cy="589842"/>
-            <wp:docPr id="98" name="Picture 98"/>
+            <wp:docPr id="118" name="Picture 118"/>
             <wp:cNvGraphicFramePr>
               <a:graphicFrameLocks noChangeAspect="1"/>
             </wp:cNvGraphicFramePr>
@@ -7529,7 +7529,7 @@
     </w:p>
     <w:bookmarkEnd w:id="58"/>
     <w:bookmarkEnd w:id="59"/>
-    <w:bookmarkStart w:id="83" w:name="implementation-and-deployment"/>
+    <w:bookmarkStart w:id="89" w:name="implementation-and-deployment"/>
     <w:p>
       <w:pPr>
         <w:pStyle w:val="Heading1"/>
@@ -11553,7 +11553,7 @@
     </w:p>
     <w:bookmarkEnd w:id="76"/>
     <w:bookmarkEnd w:id="77"/>
-    <w:bookmarkStart w:id="78" w:name="Xfd48512d5f70e04d50df1141f37bb841ce2dac8"/>
+    <w:bookmarkStart w:id="84" w:name="Xfd48512d5f70e04d50df1141f37bb841ce2dac8"/>
     <w:p>
       <w:pPr>
         <w:pStyle w:val="Heading2"/>
@@ -11984,11 +11984,129 @@
         <w:pStyle w:val="BodyText"/>
       </w:pPr>
       <w:r>
+        <w:t xml:space="preserve">Fig. 4.3 and Fig. 4.4 show the dashboard. Both are screenshots of the running system, taken on a synthetic fleet, which the interface labels as simulated data; the bench-rig panel below the fleet summary is the only part backed by a physical measurement.</w:t>
+      </w:r>
+    </w:p>
+    <w:p>
+      <w:pPr>
+        <w:pStyle w:val="CaptionedFigure"/>
+      </w:pPr>
+      <w:r>
+        <w:drawing>
+          <wp:inline>
+            <wp:extent cx="4937760" cy="4238244"/>
+            <wp:effectExtent b="0" l="0" r="0" t="0"/>
+            <wp:docPr descr="" title="" id="79" name="Picture"/>
+            <a:graphic>
+              <a:graphicData uri="http://schemas.openxmlformats.org/drawingml/2006/picture">
+                <pic:pic>
+                  <pic:nvPicPr>
+                    <pic:cNvPr descr="images/ui_overview.png" id="80" name="Picture"/>
+                    <pic:cNvPicPr>
+                      <a:picLocks noChangeArrowheads="1" noChangeAspect="1"/>
+                    </pic:cNvPicPr>
+                  </pic:nvPicPr>
+                  <pic:blipFill>
+                    <a:blip r:embed="rId78"/>
+                    <a:stretch>
+                      <a:fillRect/>
+                    </a:stretch>
+                  </pic:blipFill>
+                  <pic:spPr bwMode="auto">
+                    <a:xfrm>
+                      <a:off x="0" y="0"/>
+                      <a:ext cx="4937760" cy="4238244"/>
+                    </a:xfrm>
+                    <a:prstGeom prst="rect">
+                      <a:avLst/>
+                    </a:prstGeom>
+                    <a:noFill/>
+                    <a:ln w="9525">
+                      <a:noFill/>
+                      <a:headEnd/>
+                      <a:tailEnd/>
+                    </a:ln>
+                  </pic:spPr>
+                </pic:pic>
+              </a:graphicData>
+            </a:graphic>
+          </wp:inline>
+        </w:drawing>
+      </w:r>
+    </w:p>
+    <w:p>
+      <w:pPr>
+        <w:pStyle w:val="ImageCaption"/>
+      </w:pPr>
+      <w:r>
+        <w:t xml:space="preserve">Figure 4.3: Overview screen of the BEACON dashboard on a synthetic fleet. The banner marks the values as simulated, and the panel at the bottom shows the measured bench-rig readings, with the health index and remaining life refused because no temperature channel exists.</w:t>
+      </w:r>
+    </w:p>
+    <w:p>
+      <w:pPr>
+        <w:pStyle w:val="CaptionedFigure"/>
+      </w:pPr>
+      <w:r>
+        <w:drawing>
+          <wp:inline>
+            <wp:extent cx="4937760" cy="3915917"/>
+            <wp:effectExtent b="0" l="0" r="0" t="0"/>
+            <wp:docPr descr="" title="" id="82" name="Picture"/>
+            <a:graphic>
+              <a:graphicData uri="http://schemas.openxmlformats.org/drawingml/2006/picture">
+                <pic:pic>
+                  <pic:nvPicPr>
+                    <pic:cNvPr descr="images/ui_health.png" id="83" name="Picture"/>
+                    <pic:cNvPicPr>
+                      <a:picLocks noChangeArrowheads="1" noChangeAspect="1"/>
+                    </pic:cNvPicPr>
+                  </pic:nvPicPr>
+                  <pic:blipFill>
+                    <a:blip r:embed="rId81"/>
+                    <a:stretch>
+                      <a:fillRect/>
+                    </a:stretch>
+                  </pic:blipFill>
+                  <pic:spPr bwMode="auto">
+                    <a:xfrm>
+                      <a:off x="0" y="0"/>
+                      <a:ext cx="4937760" cy="3915917"/>
+                    </a:xfrm>
+                    <a:prstGeom prst="rect">
+                      <a:avLst/>
+                    </a:prstGeom>
+                    <a:noFill/>
+                    <a:ln w="9525">
+                      <a:noFill/>
+                      <a:headEnd/>
+                      <a:tailEnd/>
+                    </a:ln>
+                  </pic:spPr>
+                </pic:pic>
+              </a:graphicData>
+            </a:graphic>
+          </wp:inline>
+        </w:drawing>
+      </w:r>
+    </w:p>
+    <w:p>
+      <w:pPr>
+        <w:pStyle w:val="ImageCaption"/>
+      </w:pPr>
+      <w:r>
+        <w:t xml:space="preserve">Figure 4.4: Battery health screen: state of health over cycles for one battery, the attribution of its health index to behaviour terms, and its aggregate usage parameters (synthetic fleet).</w:t>
+      </w:r>
+    </w:p>
+    <w:p>
+      <w:pPr>
+        <w:pStyle w:val="BodyText"/>
+      </w:pPr>
+      <w:r>
         <w:t xml:space="preserve">There are two deliberate absences. There is no database: the fleet store is in memory, and adding a database to the compose file would imply a persistence layer that does not exist, so the compose file says so. Persistence is the next substantial piece of work.</w:t>
       </w:r>
     </w:p>
-    <w:bookmarkEnd w:id="78"/>
-    <w:bookmarkStart w:id="79" w:name="health-report-card"/>
+    <w:bookmarkEnd w:id="84"/>
+    <w:bookmarkStart w:id="85" w:name="health-report-card"/>
     <w:p>
       <w:pPr>
         <w:pStyle w:val="Heading2"/>
@@ -12014,8 +12132,8 @@
         <w:t xml:space="preserve">The health report script renders the outputs as a plain-language card for one battery, in five parts: how healthy it is, how long it has left, what the usage is doing to it, what to do, and what the report cannot tell. Every figure carries its validation error band, which is taken from a file of measured bands and pinned by a test, and each output is labelled measured, estimate or heuristic. When ground truth exists, the card is followed by a check against the laboratory, which the card itself was not shown. Section 5.11 reports a worked example.</w:t>
       </w:r>
     </w:p>
-    <w:bookmarkEnd w:id="79"/>
-    <w:bookmarkStart w:id="80" w:name="X4ad724ce4bc60d3d774effce658d43aa469ce9a"/>
+    <w:bookmarkEnd w:id="85"/>
+    <w:bookmarkStart w:id="86" w:name="X4ad724ce4bc60d3d774effce658d43aa469ce9a"/>
     <w:p>
       <w:pPr>
         <w:pStyle w:val="Heading2"/>
@@ -12130,8 +12248,8 @@
         <w:t xml:space="preserve">is otherwise an untested claim. The Python-version matrix exists because testing only the newest version lets a declared floor rot silently.</w:t>
       </w:r>
     </w:p>
-    <w:bookmarkEnd w:id="80"/>
-    <w:bookmarkStart w:id="81" w:name="containerisation-and-deployment"/>
+    <w:bookmarkEnd w:id="86"/>
+    <w:bookmarkStart w:id="87" w:name="containerisation-and-deployment"/>
     <w:p>
       <w:pPr>
         <w:pStyle w:val="Heading2"/>
@@ -12196,8 +12314,8 @@
         <w:t xml:space="preserve">docker compose up                  # API, gateway, client</w:t>
       </w:r>
     </w:p>
-    <w:bookmarkEnd w:id="81"/>
-    <w:bookmarkStart w:id="82" w:name="chapter-summary"/>
+    <w:bookmarkEnd w:id="87"/>
+    <w:bookmarkStart w:id="88" w:name="chapter-summary"/>
     <w:p>
       <w:pPr>
         <w:pStyle w:val="Heading2"/>
@@ -12239,9 +12357,9 @@
         <w:t xml:space="preserve">is reported in the next chapter.</w:t>
       </w:r>
     </w:p>
-    <w:bookmarkEnd w:id="82"/>
-    <w:bookmarkEnd w:id="83"/>
-    <w:bookmarkStart w:id="109" w:name="results-and-discussion"/>
+    <w:bookmarkEnd w:id="88"/>
+    <w:bookmarkEnd w:id="89"/>
+    <w:bookmarkStart w:id="124" w:name="results-and-discussion"/>
     <w:p>
       <w:pPr>
         <w:pStyle w:val="Heading1"/>
@@ -12268,7 +12386,7 @@
         <w:t xml:space="preserve">This chapter reports what the system measured and interprets each result where it appears. Every number is traced to a committed artifact (Appendix A). Errors are mean absolute errors in SOH (0.01 equals one percentage point) per cell, summarised as a median over cells with a 95% bootstrap interval that resamples cells, unless stated otherwise. Results that failed are reported alongside those that worked.</w:t>
       </w:r>
     </w:p>
-    <w:bookmarkStart w:id="84" w:name="X6a03b46872daed9e9da28c7cca3c0a630f99c80"/>
+    <w:bookmarkStart w:id="93" w:name="X6a03b46872daed9e9da28c7cca3c0a630f99c80"/>
     <w:p>
       <w:pPr>
         <w:pStyle w:val="Heading2"/>
@@ -13155,6 +13273,104 @@
         <w:pStyle w:val="BodyText"/>
       </w:pPr>
       <w:r>
+        <w:t xml:space="preserve">Fig. 5.1 shows the same comparison for all fourteen scored methods: nearly every bar drops from the blue (LOBO) to the red (LOCO) value when the held-out unit changes from a cell to a whole protocol cohort.</w:t>
+      </w:r>
+    </w:p>
+    <w:p>
+      <w:pPr>
+        <w:pStyle w:val="CaptionedFigure"/>
+      </w:pPr>
+      <w:r>
+        <w:drawing>
+          <wp:inline>
+            <wp:extent cx="4937760" cy="2468880"/>
+            <wp:effectExtent b="0" l="0" r="0" t="0"/>
+            <wp:docPr descr="" title="" id="91" name="Picture"/>
+            <a:graphic>
+              <a:graphicData uri="http://schemas.openxmlformats.org/drawingml/2006/picture">
+                <pic:pic>
+                  <pic:nvPicPr>
+                    <pic:cNvPr descr="images/bench_lobo_loco.png" id="92" name="Picture"/>
+                    <pic:cNvPicPr>
+                      <a:picLocks noChangeArrowheads="1" noChangeAspect="1"/>
+                    </pic:cNvPicPr>
+                  </pic:nvPicPr>
+                  <pic:blipFill>
+                    <a:blip r:embed="rId90"/>
+                    <a:stretch>
+                      <a:fillRect/>
+                    </a:stretch>
+                  </pic:blipFill>
+                  <pic:spPr bwMode="auto">
+                    <a:xfrm>
+                      <a:off x="0" y="0"/>
+                      <a:ext cx="4937760" cy="2468880"/>
+                    </a:xfrm>
+                    <a:prstGeom prst="rect">
+                      <a:avLst/>
+                    </a:prstGeom>
+                    <a:noFill/>
+                    <a:ln w="9525">
+                      <a:noFill/>
+                      <a:headEnd/>
+                      <a:tailEnd/>
+                    </a:ln>
+                  </pic:spPr>
+                </pic:pic>
+              </a:graphicData>
+            </a:graphic>
+          </wp:inline>
+        </w:drawing>
+      </w:r>
+    </w:p>
+    <w:p>
+      <w:pPr>
+        <w:pStyle w:val="ImageCaption"/>
+      </w:pPr>
+      <w:r>
+        <w:t xml:space="preserve">Figure 5.1: LOBO and LOCO</w:t>
+      </w:r>
+      <w:r>
+        <w:t xml:space="preserve"> </w:t>
+      </w:r>
+      <m:oMath>
+        <m:sSup>
+          <m:e>
+            <m:r>
+              <m:t>R</m:t>
+            </m:r>
+          </m:e>
+          <m:sup>
+            <m:r>
+              <m:t>2</m:t>
+            </m:r>
+          </m:sup>
+        </m:sSup>
+      </m:oMath>
+      <w:r>
+        <w:t xml:space="preserve"> </w:t>
+      </w:r>
+      <w:r>
+        <w:t xml:space="preserve">for SOH for every scored method on the 31-cell NASA benchmark (data:</w:t>
+      </w:r>
+      <w:r>
+        <w:t xml:space="preserve"> </w:t>
+      </w:r>
+      <w:r>
+        <w:rPr>
+          <w:rStyle w:val="VerbatimChar"/>
+        </w:rPr>
+        <w:t xml:space="preserve">benchmark_results.csv</w:t>
+      </w:r>
+      <w:r>
+        <w:t xml:space="preserve">). Skill measured across cells does not carry over to a new protocol.</w:t>
+      </w:r>
+    </w:p>
+    <w:p>
+      <w:pPr>
+        <w:pStyle w:val="BodyText"/>
+      </w:pPr>
+      <w:r>
         <w:t xml:space="preserve">An ablation isolates where the skill comes from (Table 5.2). XGBoost on cycle number alone scored a LOCO</w:t>
       </w:r>
       <w:r>
@@ -14004,8 +14220,8 @@
         <w:t xml:space="preserve">No fitted method retains reliable skill under a change of protocol, and no method can be distinguished from another. This is the result that motivates the rest of the project: the estimators that ship fit nothing across cells.</w:t>
       </w:r>
     </w:p>
-    <w:bookmarkEnd w:id="84"/>
-    <w:bookmarkStart w:id="91" w:name="field-soh-from-voltage-current-and-time"/>
+    <w:bookmarkEnd w:id="93"/>
+    <w:bookmarkStart w:id="100" w:name="field-soh-from-voltage-current-and-time"/>
     <w:p>
       <w:pPr>
         <w:pStyle w:val="Heading2"/>
@@ -14419,7 +14635,7 @@
         <w:pStyle w:val="BodyText"/>
       </w:pPr>
       <w:r>
-        <w:t xml:space="preserve">The denominators differ because a correction can only be scored on cells for which it exists: one cell never rests before discharging, so no step resistance exists for it, which gives 17 of 21 cells for the field arm and 17 of 22 once that cell is counted as refused. The three worst cells (6.4–10.3%) are all Type 3, whose discharge switches rate within a cycle. Every refusal carries a stated cause: four storage and partial-protocol cells delivered 80–155 equivalent full cycles before any constant-current discharge crossed the window, so the reference gate refused them, and one cell never rests before discharging. Fig. 5.1 tracks the estimate against every laboratory capacity test, and Fig. 5.2 shows every measured cell.</w:t>
+        <w:t xml:space="preserve">The denominators differ because a correction can only be scored on cells for which it exists: one cell never rests before discharging, so no step resistance exists for it, which gives 17 of 21 cells for the field arm and 17 of 22 once that cell is counted as refused. The three worst cells (6.4–10.3%) are all Type 3, whose discharge switches rate within a cycle. Every refusal carries a stated cause: four storage and partial-protocol cells delivered 80–155 equivalent full cycles before any constant-current discharge crossed the window, so the reference gate refused them, and one cell never rests before discharging. Fig. 5.2 tracks the estimate against every laboratory capacity test, and Fig. 5.3 shows every measured cell.</w:t>
       </w:r>
     </w:p>
     <w:p>
@@ -14431,18 +14647,18 @@
           <wp:inline>
             <wp:extent cx="4937760" cy="3142210"/>
             <wp:effectExtent b="0" l="0" r="0" t="0"/>
-            <wp:docPr descr="" title="" id="86" name="Picture"/>
+            <wp:docPr descr="" title="" id="95" name="Picture"/>
             <a:graphic>
               <a:graphicData uri="http://schemas.openxmlformats.org/drawingml/2006/picture">
                 <pic:pic>
                   <pic:nvPicPr>
-                    <pic:cNvPr descr="images/results_soh_tracking.png" id="87" name="Picture"/>
+                    <pic:cNvPr descr="images/results_soh_tracking.png" id="96" name="Picture"/>
                     <pic:cNvPicPr>
                       <a:picLocks noChangeArrowheads="1" noChangeAspect="1"/>
                     </pic:cNvPicPr>
                   </pic:nvPicPr>
                   <pic:blipFill>
-                    <a:blip r:embed="rId85"/>
+                    <a:blip r:embed="rId94"/>
                     <a:stretch>
                       <a:fillRect/>
                     </a:stretch>
@@ -14474,7 +14690,7 @@
         <w:pStyle w:val="ImageCaption"/>
       </w:pPr>
       <w:r>
-        <w:t xml:space="preserve">Figure 5.1: SOH from voltage, current and time against every laboratory capacity test. Top: two constant-current cells, fixed window (mean error 0.9 and 1.1 points). Bottom: two cells of real partial cycling, learned window, estimate from partial discharges only (3.4 and 3.2 points).</w:t>
+        <w:t xml:space="preserve">Figure 5.2: SOH from voltage, current and time against every laboratory capacity test. Top: two constant-current cells, fixed window (mean error 0.9 and 1.1 points). Bottom: two cells of real partial cycling, learned window, estimate from partial discharges only (3.4 and 3.2 points).</w:t>
       </w:r>
     </w:p>
     <w:p>
@@ -14486,18 +14702,18 @@
           <wp:inline>
             <wp:extent cx="4937760" cy="1975104"/>
             <wp:effectExtent b="0" l="0" r="0" t="0"/>
-            <wp:docPr descr="" title="" id="89" name="Picture"/>
+            <wp:docPr descr="" title="" id="98" name="Picture"/>
             <a:graphic>
               <a:graphicData uri="http://schemas.openxmlformats.org/drawingml/2006/picture">
                 <pic:pic>
                   <pic:nvPicPr>
-                    <pic:cNvPr descr="images/results_soh_per_cell.png" id="90" name="Picture"/>
+                    <pic:cNvPr descr="images/results_soh_per_cell.png" id="99" name="Picture"/>
                     <pic:cNvPicPr>
                       <a:picLocks noChangeArrowheads="1" noChangeAspect="1"/>
                     </pic:cNvPicPr>
                   </pic:nvPicPr>
                   <pic:blipFill>
-                    <a:blip r:embed="rId88"/>
+                    <a:blip r:embed="rId97"/>
                     <a:stretch>
                       <a:fillRect/>
                     </a:stretch>
@@ -14529,7 +14745,7 @@
         <w:pStyle w:val="ImageCaption"/>
       </w:pPr>
       <w:r>
-        <w:t xml:space="preserve">Figure 5.2: Mean absolute SOH error for every measured CALCE cell, field method; the dashed line is the median (1.7%).</w:t>
+        <w:t xml:space="preserve">Figure 5.3: Mean absolute SOH error for every measured CALCE cell, field method; the dashed line is the median (1.7%).</w:t>
       </w:r>
     </w:p>
     <w:p>
@@ -14550,8 +14766,8 @@
         <w:t xml:space="preserve">Identifying resistance from the load step took the median error from 4.3% to 1.7% and the coverage from 12 to 17 cells, without any quantity the cycler computed. Two earlier figures were corrected downward by this work: an earlier 3.3% SOH figure and an 88% RUL figure had been scored against a reference capacity taken from each cell’s whole life, which uses the future and which no BMS can hold.</w:t>
       </w:r>
     </w:p>
-    <w:bookmarkEnd w:id="91"/>
-    <w:bookmarkStart w:id="92" w:name="partial-discharges"/>
+    <w:bookmarkEnd w:id="100"/>
+    <w:bookmarkStart w:id="101" w:name="partial-discharges"/>
     <w:p>
       <w:pPr>
         <w:pStyle w:val="Heading2"/>
@@ -15050,8 +15266,8 @@
         <w:t xml:space="preserve">The refusal is physics and not a tuned cut. On the plateau, window charge tracks capacity, while on the knee voltage is set by resistance and diffusion, so it measures how hard the cell is working instead. The scope is two cells per band, which shows the mechanism and is too few to quote a population error.</w:t>
       </w:r>
     </w:p>
-    <w:bookmarkEnd w:id="92"/>
-    <w:bookmarkStart w:id="93" w:name="resistance-tracks-the-instrument"/>
+    <w:bookmarkEnd w:id="101"/>
+    <w:bookmarkStart w:id="102" w:name="resistance-tracks-the-instrument"/>
     <w:p>
       <w:pPr>
         <w:pStyle w:val="Heading2"/>
@@ -15077,8 +15293,8 @@
         <w:t xml:space="preserve">Against the cycler’s internal-resistance column over each cell’s life (20 cells carrying both values), the step resistance achieved a median Spearman correlation of 0.86, growth in the same direction on 19 of 20 cells, and a median growth of 1.26 times against the cycler’s 1.29 times. This includes the partial-cycling cells (0.90 and 0.98), and the exception is a Type 3 cell. The levels differ, since the step value includes early polarisation, but the trends agree, which is what a power-fade indicator requires.</w:t>
       </w:r>
     </w:p>
-    <w:bookmarkEnd w:id="93"/>
-    <w:bookmarkStart w:id="97" w:name="remaining-useful-life"/>
+    <w:bookmarkEnd w:id="102"/>
+    <w:bookmarkStart w:id="106" w:name="remaining-useful-life"/>
     <w:p>
       <w:pPr>
         <w:pStyle w:val="Heading2"/>
@@ -15836,7 +16052,7 @@
         </m:r>
       </m:oMath>
       <w:r>
-        <w:t xml:space="preserve">20 cycles 88% of the time near end of life. That reference uses the future, which no BMS can hold. Against the cell’s own early capacity the figure is 73%, and that is the figure reported. Fig. 5.3 summarises the result.</w:t>
+        <w:t xml:space="preserve">20 cycles 88% of the time near end of life. That reference uses the future, which no BMS can hold. Against the cell’s own early capacity the figure is 73%, and that is the figure reported. Fig. 5.4 summarises the result.</w:t>
       </w:r>
     </w:p>
     <w:p>
@@ -15848,18 +16064,18 @@
           <wp:inline>
             <wp:extent cx="4937760" cy="2064880"/>
             <wp:effectExtent b="0" l="0" r="0" t="0"/>
-            <wp:docPr descr="" title="" id="95" name="Picture"/>
+            <wp:docPr descr="" title="" id="104" name="Picture"/>
             <a:graphic>
               <a:graphicData uri="http://schemas.openxmlformats.org/drawingml/2006/picture">
                 <pic:pic>
                   <pic:nvPicPr>
-                    <pic:cNvPr descr="images/results_rul.png" id="96" name="Picture"/>
+                    <pic:cNvPr descr="images/results_rul.png" id="105" name="Picture"/>
                     <pic:cNvPicPr>
                       <a:picLocks noChangeArrowheads="1" noChangeAspect="1"/>
                     </pic:cNvPicPr>
                   </pic:nvPicPr>
                   <pic:blipFill>
-                    <a:blip r:embed="rId94"/>
+                    <a:blip r:embed="rId103"/>
                     <a:stretch>
                       <a:fillRect/>
                     </a:stretch>
@@ -15891,7 +16107,7 @@
         <w:pStyle w:val="ImageCaption"/>
       </w:pPr>
       <w:r>
-        <w:t xml:space="preserve">Figure 5.3: RUL to 90% capacity. Left: predicted against actual cycles left in the last 50 cycles. Right: share of estimates within</w:t>
+        <w:t xml:space="preserve">Figure 5.4: RUL to 90% capacity. Left: predicted against actual cycles left in the last 50 cycles. Right: share of estimates within</w:t>
       </w:r>
       <w:r>
         <w:t xml:space="preserve"> </w:t>
@@ -15972,8 +16188,8 @@
         <w:t xml:space="preserve">20 cycles. The conventional 80% end-of-life threshold is not validated on CALCE, because its full-discharge trajectories end near 0.81 and only one cell of 22 crosses 0.80.</w:t>
       </w:r>
     </w:p>
-    <w:bookmarkEnd w:id="97"/>
-    <w:bookmarkStart w:id="98" w:name="rul-when-complete-discharges-are-rare"/>
+    <w:bookmarkEnd w:id="106"/>
+    <w:bookmarkStart w:id="107" w:name="rul-when-complete-discharges-are-rare"/>
     <w:p>
       <w:pPr>
         <w:pStyle w:val="Heading2"/>
@@ -16233,8 +16449,8 @@
         <w:t xml:space="preserve">The failure of the field-trajectory method has a clean cause. Near 0.90, field SOH reads a median 1.1 points below capacity (measured in a first pass of this study, not kept as a separate artifact). Because fade near the threshold is slow, that small bias moves the 0.90 crossing a median 56 cycles early. An SOH error that is acceptable as a health figure thus becomes large as a time to threshold. None of the four is reported, and the system refuses RUL for partial-only records and states that this was tested.</w:t>
       </w:r>
     </w:p>
-    <w:bookmarkEnd w:id="98"/>
-    <w:bookmarkStart w:id="99" w:name="when-the-evidence-suffices"/>
+    <w:bookmarkEnd w:id="107"/>
+    <w:bookmarkStart w:id="108" w:name="when-the-evidence-suffices"/>
     <w:p>
       <w:pPr>
         <w:pStyle w:val="Heading2"/>
@@ -16669,8 +16885,8 @@
         <w:t xml:space="preserve">: in the study’s own scoring, larger references reduced error (one discharge 3.6%, five 2.0%, ten 1.3%), but on the field-study metric ten versus five changed the median only from 1.681% to 1.665%, so the estimator retains five.</w:t>
       </w:r>
     </w:p>
-    <w:bookmarkEnd w:id="99"/>
-    <w:bookmarkStart w:id="100" w:name="external-validation-on-a-second-dataset"/>
+    <w:bookmarkEnd w:id="108"/>
+    <w:bookmarkStart w:id="109" w:name="external-validation-on-a-second-dataset"/>
     <w:p>
       <w:pPr>
         <w:pStyle w:val="Heading2"/>
@@ -17094,8 +17310,8 @@
         <w:t xml:space="preserve">The Oxford trajectories cross the 80% convention, so the shipped RUL estimator was scored there unchanged. When it predicted fewer than 500 cycles to 80%, the cell lasted at least that long in 97% of cases (36 estimates, 5 cells). Precision is low: the median miss is 385 cycles against characterisations 100 cycles apart. The guarantee also weakens with distance, since predictions of 500 to 1,000 cycles were met or exceeded only 80% of the time (25 estimates, 5 cells).</w:t>
       </w:r>
     </w:p>
-    <w:bookmarkEnd w:id="100"/>
-    <w:bookmarkStart w:id="101" w:name="Xd3eceaa1d102af3c39ecdd10656f2d2a5d3468b"/>
+    <w:bookmarkEnd w:id="109"/>
+    <w:bookmarkStart w:id="110" w:name="Xd3eceaa1d102af3c39ecdd10656f2d2a5d3468b"/>
     <w:p>
       <w:pPr>
         <w:pStyle w:val="Heading2"/>
@@ -17197,8 +17413,8 @@
         <w:t xml:space="preserve">For contrast, a gradient-boosted model on three window features, the setting where fitting looks best, reached 0.7% under leave-one-cell-out within Oxford and 1.2% within CALCE, but 6.7% when moved from Oxford to NASA and 5.5% from CALCE to Oxford. Validation inside one dataset overstated transferable accuracy four- to tenfold.</w:t>
       </w:r>
     </w:p>
-    <w:bookmarkEnd w:id="101"/>
-    <w:bookmarkStart w:id="105" w:name="system-and-hardware-results"/>
+    <w:bookmarkEnd w:id="110"/>
+    <w:bookmarkStart w:id="120" w:name="system-and-hardware-results"/>
     <w:p>
       <w:pPr>
         <w:pStyle w:val="Heading2"/>
@@ -17216,7 +17432,7 @@
         <w:t>SYSTEM AND HARDWARE RESULTS</w:t>
       </w:r>
     </w:p>
-    <w:bookmarkStart w:id="102" w:name="bench-rig-captures"/>
+    <w:bookmarkStart w:id="117" w:name="bench-rig-captures"/>
     <w:p>
       <w:pPr>
         <w:pStyle w:val="Heading3"/>
@@ -17698,8 +17914,140 @@
         <w:t xml:space="preserve">In both real captures the cadence held at 1.000 s with no gaps and a monotonic time base. Every measured voltage is an exact multiple of the INA219’s 4 mV bus LSB, which is what a genuine read from that part looks like and what a fabricated one would not. The sensor-complement declaration worked as designed: the firmware named the sensor that failed at boot, declared only the channels it could supply, and the host scored those and refused the rest by name. The first real board also exposed a baud-rate fault (the CH340 bridge accepts only 9600 and 19200 baud), which the refusal wording named as a cause and which led to the fix.</w:t>
       </w:r>
     </w:p>
-    <w:bookmarkEnd w:id="102"/>
-    <w:bookmarkStart w:id="103" w:name="fault-injection"/>
+    <w:p>
+      <w:pPr>
+        <w:pStyle w:val="BodyText"/>
+      </w:pPr>
+      <w:r>
+        <w:t xml:space="preserve">Fig. 5.5 plots the Stage B capture and Fig. 5.6 shows how the dashboard presents it.</w:t>
+      </w:r>
+    </w:p>
+    <w:p>
+      <w:pPr>
+        <w:pStyle w:val="CaptionedFigure"/>
+      </w:pPr>
+      <w:r>
+        <w:drawing>
+          <wp:inline>
+            <wp:extent cx="4937760" cy="2606039"/>
+            <wp:effectExtent b="0" l="0" r="0" t="0"/>
+            <wp:docPr descr="" title="" id="112" name="Picture"/>
+            <a:graphic>
+              <a:graphicData uri="http://schemas.openxmlformats.org/drawingml/2006/picture">
+                <pic:pic>
+                  <pic:nvPicPr>
+                    <pic:cNvPr descr="images/rig_capture.png" id="113" name="Picture"/>
+                    <pic:cNvPicPr>
+                      <a:picLocks noChangeArrowheads="1" noChangeAspect="1"/>
+                    </pic:cNvPicPr>
+                  </pic:nvPicPr>
+                  <pic:blipFill>
+                    <a:blip r:embed="rId111"/>
+                    <a:stretch>
+                      <a:fillRect/>
+                    </a:stretch>
+                  </pic:blipFill>
+                  <pic:spPr bwMode="auto">
+                    <a:xfrm>
+                      <a:off x="0" y="0"/>
+                      <a:ext cx="4937760" cy="2606039"/>
+                    </a:xfrm>
+                    <a:prstGeom prst="rect">
+                      <a:avLst/>
+                    </a:prstGeom>
+                    <a:noFill/>
+                    <a:ln w="9525">
+                      <a:noFill/>
+                      <a:headEnd/>
+                      <a:tailEnd/>
+                    </a:ln>
+                  </pic:spPr>
+                </pic:pic>
+              </a:graphicData>
+            </a:graphic>
+          </wp:inline>
+        </w:drawing>
+      </w:r>
+    </w:p>
+    <w:p>
+      <w:pPr>
+        <w:pStyle w:val="ImageCaption"/>
+      </w:pPr>
+      <w:r>
+        <w:t xml:space="preserve">Figure 5.5: Stage B capture from the bench rig (83 frames over 82 s, one cell at rest). Voltage moves between 3.984 and 3.992 V in steps of the INA219’s 4 mV LSB, and current stays at the</w:t>
+      </w:r>
+      <w:r>
+        <w:t xml:space="preserve"> </w:t>
+      </w:r>
+      <m:oMath>
+        <m:r>
+          <m:rPr>
+            <m:sty m:val="p"/>
+          </m:rPr>
+          <m:t>±</m:t>
+        </m:r>
+      </m:oMath>
+      <w:r>
+        <w:t xml:space="preserve">0.4 mA noise floor.</w:t>
+      </w:r>
+    </w:p>
+    <w:p>
+      <w:pPr>
+        <w:pStyle w:val="CaptionedFigure"/>
+      </w:pPr>
+      <w:r>
+        <w:drawing>
+          <wp:inline>
+            <wp:extent cx="4937760" cy="3833621"/>
+            <wp:effectExtent b="0" l="0" r="0" t="0"/>
+            <wp:docPr descr="" title="" id="115" name="Picture"/>
+            <a:graphic>
+              <a:graphicData uri="http://schemas.openxmlformats.org/drawingml/2006/picture">
+                <pic:pic>
+                  <pic:nvPicPr>
+                    <pic:cNvPr descr="images/ui_evidence.png" id="116" name="Picture"/>
+                    <pic:cNvPicPr>
+                      <a:picLocks noChangeArrowheads="1" noChangeAspect="1"/>
+                    </pic:cNvPicPr>
+                  </pic:nvPicPr>
+                  <pic:blipFill>
+                    <a:blip r:embed="rId114"/>
+                    <a:stretch>
+                      <a:fillRect/>
+                    </a:stretch>
+                  </pic:blipFill>
+                  <pic:spPr bwMode="auto">
+                    <a:xfrm>
+                      <a:off x="0" y="0"/>
+                      <a:ext cx="4937760" cy="3833621"/>
+                    </a:xfrm>
+                    <a:prstGeom prst="rect">
+                      <a:avLst/>
+                    </a:prstGeom>
+                    <a:noFill/>
+                    <a:ln w="9525">
+                      <a:noFill/>
+                      <a:headEnd/>
+                      <a:tailEnd/>
+                    </a:ln>
+                  </pic:spPr>
+                </pic:pic>
+              </a:graphicData>
+            </a:graphic>
+          </wp:inline>
+        </w:drawing>
+      </w:r>
+    </w:p>
+    <w:p>
+      <w:pPr>
+        <w:pStyle w:val="ImageCaption"/>
+      </w:pPr>
+      <w:r>
+        <w:t xml:space="preserve">Figure 5.6: Evidence view of the BEACON dashboard for the bench rig: 83 of 83 records accepted, voltage and current as measured, temperature reported as not supplied, and the health index, remaining life and state of health refused because coverage is incomplete.</w:t>
+      </w:r>
+    </w:p>
+    <w:bookmarkEnd w:id="117"/>
+    <w:bookmarkStart w:id="118" w:name="fault-injection"/>
     <w:p>
       <w:pPr>
         <w:pStyle w:val="Heading3"/>
@@ -17725,8 +18073,8 @@
         <w:t xml:space="preserve">Faults injected into a real capture behaved as designed: a corrupted byte failed its checksum, a NaN field was rejected, a reversed timestamp refused the capture, and a missing sensor was refused by name. The injection also exposed one defect, since corrected: a 999 V reading passed the field range, which is wide so that packs are admissible. Records outside 0–5 V are now rejected when the source declares a single cell.</w:t>
       </w:r>
     </w:p>
-    <w:bookmarkEnd w:id="103"/>
-    <w:bookmarkStart w:id="104" w:name="Xa02a71f04cbfbaee63c846a057c53165dabfc4c"/>
+    <w:bookmarkEnd w:id="118"/>
+    <w:bookmarkStart w:id="119" w:name="Xa02a71f04cbfbaee63c846a057c53165dabfc4c"/>
     <w:p>
       <w:pPr>
         <w:pStyle w:val="Heading3"/>
@@ -17768,9 +18116,9 @@
         <w:t xml:space="preserve">a validation of the health, RUL or risk models, which were fitted on cycled research cells and cannot be confirmed or refuted by a cell that was never cycled. Sensor accuracy against a reference meter was not measured, and no discharge has yet been recorded on the rig.</w:t>
       </w:r>
     </w:p>
-    <w:bookmarkEnd w:id="104"/>
-    <w:bookmarkEnd w:id="105"/>
-    <w:bookmarkStart w:id="106" w:name="a-worked-example-the-report-card"/>
+    <w:bookmarkEnd w:id="119"/>
+    <w:bookmarkEnd w:id="120"/>
+    <w:bookmarkStart w:id="121" w:name="a-worked-example-the-report-card"/>
     <w:p>
       <w:pPr>
         <w:pStyle w:val="Heading2"/>
@@ -17793,7 +18141,7 @@
         <w:pStyle w:val="FirstParagraph"/>
       </w:pPr>
       <w:r>
-        <w:t xml:space="preserve">Fig. 5.4 abridges the report card for CALCE cell CS2_35 as it would have read at cycle 90. The pipeline saw voltage, current and time only.</w:t>
+        <w:t xml:space="preserve">Fig. 5.7 abridges the report card for CALCE cell CS2_35 as it would have read at cycle 90. The pipeline saw voltage, current and time only.</w:t>
       </w:r>
     </w:p>
     <w:tbl>
@@ -18072,7 +18420,7 @@
         <w:pStyle w:val="ImageCaption"/>
       </w:pPr>
       <w:r>
-        <w:t xml:space="preserve">Figure 5.4: Abridged health report card for CS2_35 at cycle 90, with the laboratory check.</w:t>
+        <w:t xml:space="preserve">Figure 5.7: Abridged health report card for CS2_35 at cycle 90, with the laboratory check.</w:t>
       </w:r>
     </w:p>
     <w:p>
@@ -18103,8 +18451,8 @@
         <w:t xml:space="preserve">cycles at 50–100 cycles out), and it is the reason the card prints its own accuracy beside the number and not the number alone. Only temperature is offered as a usage finding, because it is the one behaviour-to-ageing link that survived testing, in direction only.</w:t>
       </w:r>
     </w:p>
-    <w:bookmarkEnd w:id="106"/>
-    <w:bookmarkStart w:id="107" w:name="discussion"/>
+    <w:bookmarkEnd w:id="121"/>
+    <w:bookmarkStart w:id="122" w:name="discussion"/>
     <w:p>
       <w:pPr>
         <w:pStyle w:val="Heading2"/>
@@ -18382,8 +18730,8 @@
         <w:t xml:space="preserve">has yet been recorded on the bench rig, and the heuristic risk layer is not validated.</w:t>
       </w:r>
     </w:p>
-    <w:bookmarkEnd w:id="107"/>
-    <w:bookmarkStart w:id="108" w:name="validation-summary"/>
+    <w:bookmarkEnd w:id="122"/>
+    <w:bookmarkStart w:id="123" w:name="validation-summary"/>
     <w:p>
       <w:pPr>
         <w:pStyle w:val="Heading2"/>
@@ -19280,9 +19628,9 @@
         </w:tc>
       </w:tr>
     </w:tbl>
-    <w:bookmarkEnd w:id="108"/>
-    <w:bookmarkEnd w:id="109"/>
-    <w:bookmarkStart w:id="112" w:name="conclusion-and-future-work"/>
+    <w:bookmarkEnd w:id="123"/>
+    <w:bookmarkEnd w:id="124"/>
+    <w:bookmarkStart w:id="127" w:name="conclusion-and-future-work"/>
     <w:p>
       <w:pPr>
         <w:pStyle w:val="Heading1"/>
@@ -19375,7 +19723,7 @@
         <w:t xml:space="preserve">Each output therefore carries a measured error band and is withheld when its evidence is missing or inconsistent, and the criterion that makes that decision was itself validated against laboratory truth.</w:t>
       </w:r>
     </w:p>
-    <w:bookmarkStart w:id="110" w:name="limitations"/>
+    <w:bookmarkStart w:id="125" w:name="limitations"/>
     <w:p>
       <w:pPr>
         <w:pStyle w:val="Heading2"/>
@@ -19401,8 +19749,8 @@
         <w:t xml:space="preserve">The scope is single cells: LCO for development, an NMC/LCO blend pouch for external validation, mostly at constant current, with one real drive-cycle discharge. Packs, lithium iron phosphate and temperature-dependent capacity correction are not covered. The conventional 80% end-of-life threshold is not validated on CALCE, and the Oxford results at 80% are a conservative bound with low precision. The heuristic risk layer is not validated against measured degradation. The bench rig has been run on one cell, at rest, for under 90 s, and its two sensors have not yet operated in the same capture.</w:t>
       </w:r>
     </w:p>
-    <w:bookmarkEnd w:id="110"/>
-    <w:bookmarkStart w:id="111" w:name="future-work"/>
+    <w:bookmarkEnd w:id="125"/>
+    <w:bookmarkStart w:id="126" w:name="future-work"/>
     <w:p>
       <w:pPr>
         <w:pStyle w:val="Heading2"/>
@@ -19554,9 +19902,9 @@
         <w:t xml:space="preserve">Add a database behind the fleet store, structured logging and metrics, a load-test harness, and asynchronous serial ingest with backpressure.</w:t>
       </w:r>
     </w:p>
-    <w:bookmarkEnd w:id="111"/>
-    <w:bookmarkEnd w:id="112"/>
-    <w:bookmarkStart w:id="113" w:name="appendix-a"/>
+    <w:bookmarkEnd w:id="126"/>
+    <w:bookmarkEnd w:id="127"/>
+    <w:bookmarkStart w:id="128" w:name="appendix-a"/>
     <w:p>
       <w:pPr>
         <w:pStyle w:val="Heading1"/>
@@ -20408,7 +20756,7 @@
               <w:rPr>
                 <w:sz w:val="20"/>
               </w:rPr>
-              <w:t xml:space="preserve">Figs. 5.1, 5.2, 5.3</w:t>
+              <w:t xml:space="preserve">Figs. 5.2, 5.3, 5.4</w:t>
             </w:r>
           </w:p>
         </w:tc>
@@ -20455,8 +20803,8 @@
         </w:tc>
       </w:tr>
     </w:tbl>
-    <w:bookmarkEnd w:id="113"/>
-    <w:bookmarkStart w:id="115" w:name="appendix-b"/>
+    <w:bookmarkEnd w:id="128"/>
+    <w:bookmarkStart w:id="130" w:name="appendix-b"/>
     <w:p>
       <w:pPr>
         <w:pStyle w:val="Heading1"/>
@@ -20487,7 +20835,7 @@
       <w:r>
         <w:t xml:space="preserve"> </w:t>
       </w:r>
-      <w:hyperlink r:id="rId114">
+      <w:hyperlink r:id="rId129">
         <w:r>
           <w:rPr>
             <w:rStyle w:val="Hyperlink"/>
@@ -20632,8 +20980,8 @@
         <w:t xml:space="preserve">The raw CALCE and NASA data are not redistributed, and download locations are given in the repository.</w:t>
       </w:r>
     </w:p>
-    <w:bookmarkEnd w:id="115"/>
-    <w:bookmarkStart w:id="116" w:name="references"/>
+    <w:bookmarkEnd w:id="130"/>
+    <w:bookmarkStart w:id="131" w:name="references"/>
     <w:p>
       <w:pPr>
         <w:pStyle w:val="Heading1"/>
@@ -21346,7 +21694,7 @@
         <w:t xml:space="preserve">Ph.D. dissertation, Dept. Eng. Sci., Univ. Oxford, Oxford, U.K., 2017.</w:t>
       </w:r>
     </w:p>
-    <w:bookmarkEnd w:id="116"/>
+    <w:bookmarkEnd w:id="131"/>
     <w:sectPr>
       <w:footerReference w:type="default" r:id="rId11"/>
       <w:pgSz w:w="11906" w:h="16838"/>

</xml_diff>

<commit_message>
Report: remove key contributions, examiner designation lines, alignment settings
Co-Authored-By: Claude Sonnet 5.5 <noreply@anthropic.com>
Claude-Session: https://claude.ai/code/session_01XSGpBmyyfwNpi7tuzVvNqh
</commit_message>
<xml_diff>
--- a/report/BEACON_Project_Report.docx
+++ b/report/BEACON_Project_Report.docx
@@ -202,7 +202,7 @@
         <w:drawing>
           <wp:inline>
             <wp:extent cx="1828800" cy="607614"/>
-            <wp:docPr id="117" name="Picture 117"/>
+            <wp:docPr id="116" name="Picture 116"/>
             <wp:cNvGraphicFramePr>
               <a:graphicFrameLocks noChangeAspect="1"/>
             </wp:cNvGraphicFramePr>
@@ -326,7 +326,7 @@
         <w:drawing>
           <wp:inline>
             <wp:extent cx="2926080" cy="589842"/>
-            <wp:docPr id="118" name="Picture 118"/>
+            <wp:docPr id="117" name="Picture 117"/>
             <wp:cNvGraphicFramePr>
               <a:graphicFrameLocks noChangeAspect="1"/>
             </wp:cNvGraphicFramePr>
@@ -701,6 +701,30 @@
               <w:t>INTERNAL EXAMINER</w:t>
             </w:r>
           </w:p>
+          <w:p>
+            <w:pPr>
+              <w:spacing w:after="40" w:line="240" w:lineRule="auto"/>
+            </w:pPr>
+            <w:r>
+              <w:rPr>
+                <w:b w:val="0"/>
+                <w:sz w:val="22"/>
+              </w:rPr>
+              <w:t>Name: ______________________</w:t>
+            </w:r>
+          </w:p>
+          <w:p>
+            <w:pPr>
+              <w:spacing w:after="40" w:line="240" w:lineRule="auto"/>
+            </w:pPr>
+            <w:r>
+              <w:rPr>
+                <w:b w:val="0"/>
+                <w:sz w:val="22"/>
+              </w:rPr>
+              <w:t>Designation: ________________</w:t>
+            </w:r>
+          </w:p>
         </w:tc>
         <w:tc>
           <w:tcPr>
@@ -717,6 +741,30 @@
                 <w:sz w:val="22"/>
               </w:rPr>
               <w:t>EXTERNAL EXAMINER</w:t>
+            </w:r>
+          </w:p>
+          <w:p>
+            <w:pPr>
+              <w:spacing w:after="40" w:line="240" w:lineRule="auto"/>
+            </w:pPr>
+            <w:r>
+              <w:rPr>
+                <w:b w:val="0"/>
+                <w:sz w:val="22"/>
+              </w:rPr>
+              <w:t>Name: ______________________</w:t>
+            </w:r>
+          </w:p>
+          <w:p>
+            <w:pPr>
+              <w:spacing w:after="40" w:line="240" w:lineRule="auto"/>
+            </w:pPr>
+            <w:r>
+              <w:rPr>
+                <w:b w:val="0"/>
+                <w:sz w:val="22"/>
+              </w:rPr>
+              <w:t>Designation: ________________</w:t>
             </w:r>
           </w:p>
         </w:tc>
@@ -1910,22 +1958,12 @@
         <w:br w:type="page"/>
       </w:r>
     </w:p>
-    <w:bookmarkStart w:id="27" w:name="introduction"/>
+    <w:bookmarkStart w:id="26" w:name="introduction"/>
     <w:p>
       <w:pPr>
         <w:pStyle w:val="Heading1"/>
       </w:pPr>
       <w:r>
-        <w:rPr>
-          <w:b/>
-        </w:rPr>
-        <w:t>CHAPTER 1</w:t>
-        <w:br/>
-      </w:r>
-      <w:r>
-        <w:rPr>
-          <w:b/>
-        </w:rPr>
         <w:t>INTRODUCTION</w:t>
       </w:r>
     </w:p>
@@ -1934,15 +1972,6 @@
       <w:pPr>
         <w:pStyle w:val="Heading2"/>
       </w:pPr>
-      <w:r>
-        <w:rPr>
-          <w:rStyle w:val="SectionNumber"/>
-        </w:rPr>
-        <w:t>1.1</w:t>
-      </w:r>
-      <w:r>
-        <w:tab/>
-      </w:r>
       <w:r>
         <w:t>BACKGROUND</w:t>
       </w:r>
@@ -1969,15 +1998,6 @@
       <w:pPr>
         <w:pStyle w:val="Heading2"/>
       </w:pPr>
-      <w:r>
-        <w:rPr>
-          <w:rStyle w:val="SectionNumber"/>
-        </w:rPr>
-        <w:t>1.2</w:t>
-      </w:r>
-      <w:r>
-        <w:tab/>
-      </w:r>
       <w:r>
         <w:t>MOTIVATION</w:t>
       </w:r>
@@ -2042,15 +2062,6 @@
       <w:pPr>
         <w:pStyle w:val="Heading2"/>
       </w:pPr>
-      <w:r>
-        <w:rPr>
-          <w:rStyle w:val="SectionNumber"/>
-        </w:rPr>
-        <w:t>1.3</w:t>
-      </w:r>
-      <w:r>
-        <w:tab/>
-      </w:r>
       <w:r>
         <w:t>PROBLEM STATEMENT</w:t>
       </w:r>
@@ -2133,15 +2144,6 @@
         <w:pStyle w:val="Heading2"/>
       </w:pPr>
       <w:r>
-        <w:rPr>
-          <w:rStyle w:val="SectionNumber"/>
-        </w:rPr>
-        <w:t>1.4</w:t>
-      </w:r>
-      <w:r>
-        <w:tab/>
-      </w:r>
-      <w:r>
         <w:t>RESEARCH GAP</w:t>
       </w:r>
     </w:p>
@@ -2181,15 +2183,6 @@
         <w:pStyle w:val="Heading2"/>
       </w:pPr>
       <w:r>
-        <w:rPr>
-          <w:rStyle w:val="SectionNumber"/>
-        </w:rPr>
-        <w:t>1.5</w:t>
-      </w:r>
-      <w:r>
-        <w:tab/>
-      </w:r>
-      <w:r>
         <w:t>OBJECTIVES</w:t>
       </w:r>
     </w:p>
@@ -2268,233 +2261,11 @@
       </w:r>
     </w:p>
     <w:bookmarkEnd w:id="24"/>
-    <w:bookmarkStart w:id="25" w:name="key-contributions"/>
+    <w:bookmarkStart w:id="25" w:name="scope-and-organisation-of-the-report"/>
     <w:p>
       <w:pPr>
         <w:pStyle w:val="Heading2"/>
       </w:pPr>
-      <w:r>
-        <w:rPr>
-          <w:rStyle w:val="SectionNumber"/>
-        </w:rPr>
-        <w:t>1.6</w:t>
-      </w:r>
-      <w:r>
-        <w:tab/>
-      </w:r>
-      <w:r>
-        <w:t>KEY CONTRIBUTIONS</w:t>
-      </w:r>
-    </w:p>
-    <w:p>
-      <w:pPr>
-        <w:pStyle w:val="FirstParagraph"/>
-      </w:pPr>
-      <w:r>
-        <w:t xml:space="preserve">The main contributions of this work are as follows.</w:t>
-      </w:r>
-    </w:p>
-    <w:p>
-      <w:pPr>
-        <w:numPr>
-          <w:ilvl w:val="0"/>
-          <w:numId w:val="1003"/>
-        </w:numPr>
-      </w:pPr>
-      <w:r>
-        <w:rPr>
-          <w:bCs/>
-          <w:b/>
-        </w:rPr>
-        <w:t xml:space="preserve">A three-tier telemetry system</w:t>
-      </w:r>
-      <w:r>
-        <w:t xml:space="preserve"> </w:t>
-      </w:r>
-      <w:r>
-        <w:t xml:space="preserve">(CAN/serial/dataset ingestion, a shared scoring pipeline, and a FastAPI, Express and React service tier) in which every output is labelled measured, estimated or heuristic and carries its error band, or is refused with a reason.</w:t>
-      </w:r>
-    </w:p>
-    <w:p>
-      <w:pPr>
-        <w:numPr>
-          <w:ilvl w:val="0"/>
-          <w:numId w:val="1003"/>
-        </w:numPr>
-      </w:pPr>
-      <w:r>
-        <w:rPr>
-          <w:bCs/>
-          <w:b/>
-        </w:rPr>
-        <w:t xml:space="preserve">A field-realisable SOH estimator</w:t>
-      </w:r>
-      <w:r>
-        <w:t xml:space="preserve"> </w:t>
-      </w:r>
-      <w:r>
-        <w:t xml:space="preserve">validated from voltage, current and time alone, in which the ohmic correction uses a resistance identified from the voltage step at each load onset. Relative to no correction, it raises coverage from 12 to 17 of 22 cells and lowers median error from 4.3% to 1.7%.</w:t>
-      </w:r>
-    </w:p>
-    <w:p>
-      <w:pPr>
-        <w:numPr>
-          <w:ilvl w:val="0"/>
-          <w:numId w:val="1003"/>
-        </w:numPr>
-      </w:pPr>
-      <w:r>
-        <w:rPr>
-          <w:bCs/>
-          <w:b/>
-        </w:rPr>
-        <w:t xml:space="preserve">Resistance as a validated second health quantity:</w:t>
-      </w:r>
-      <w:r>
-        <w:t xml:space="preserve"> </w:t>
-      </w:r>
-      <w:r>
-        <w:t xml:space="preserve">the step resistance tracks the laboratory instrument on 19 of 20 cells.</w:t>
-      </w:r>
-    </w:p>
-    <w:p>
-      <w:pPr>
-        <w:numPr>
-          <w:ilvl w:val="0"/>
-          <w:numId w:val="1003"/>
-        </w:numPr>
-      </w:pPr>
-      <w:r>
-        <w:rPr>
-          <w:bCs/>
-          <w:b/>
-        </w:rPr>
-        <w:t xml:space="preserve">SOH from partial discharges</w:t>
-      </w:r>
-      <w:r>
-        <w:t xml:space="preserve"> </w:t>
-      </w:r>
-      <w:r>
-        <w:t xml:space="preserve">via a window learned from the cell’s own early discharges, with a physical refusal rule for windows on the discharge knee whose threshold is not tuned.</w:t>
-      </w:r>
-    </w:p>
-    <w:p>
-      <w:pPr>
-        <w:numPr>
-          <w:ilvl w:val="0"/>
-          <w:numId w:val="1003"/>
-        </w:numPr>
-      </w:pPr>
-      <w:r>
-        <w:rPr>
-          <w:bCs/>
-          <w:b/>
-        </w:rPr>
-        <w:t xml:space="preserve">RUL accuracy reported as a user meets it</w:t>
-      </w:r>
-      <w:r>
-        <w:t xml:space="preserve">, indexed by the prediction, together with a measured correction (88% to 73%) caused by a reference capacity that used the future.</w:t>
-      </w:r>
-    </w:p>
-    <w:p>
-      <w:pPr>
-        <w:numPr>
-          <w:ilvl w:val="0"/>
-          <w:numId w:val="1003"/>
-        </w:numPr>
-      </w:pPr>
-      <w:r>
-        <w:rPr>
-          <w:bCs/>
-          <w:b/>
-        </w:rPr>
-        <w:t xml:space="preserve">Evidence sufficiency measured rather than asserted:</w:t>
-      </w:r>
-      <w:r>
-        <w:t xml:space="preserve"> </w:t>
-      </w:r>
-      <w:r>
-        <w:t xml:space="preserve">confidence follows the consistency of readings, which predicts error, and not the number of discharges, which does not.</w:t>
-      </w:r>
-    </w:p>
-    <w:p>
-      <w:pPr>
-        <w:numPr>
-          <w:ilvl w:val="0"/>
-          <w:numId w:val="1003"/>
-        </w:numPr>
-      </w:pPr>
-      <w:r>
-        <w:rPr>
-          <w:bCs/>
-          <w:b/>
-        </w:rPr>
-        <w:t xml:space="preserve">External validation without re-tuning</w:t>
-      </w:r>
-      <w:r>
-        <w:t xml:space="preserve"> </w:t>
-      </w:r>
-      <w:r>
-        <w:t xml:space="preserve">on a second dataset of a different chemistry, manufacturer, format and temperature, and a documented failure on a third.</w:t>
-      </w:r>
-    </w:p>
-    <w:p>
-      <w:pPr>
-        <w:numPr>
-          <w:ilvl w:val="0"/>
-          <w:numId w:val="1003"/>
-        </w:numPr>
-      </w:pPr>
-      <w:r>
-        <w:rPr>
-          <w:bCs/>
-          <w:b/>
-        </w:rPr>
-        <w:t xml:space="preserve">A working bench rig and software contract:</w:t>
-      </w:r>
-      <w:r>
-        <w:t xml:space="preserve"> </w:t>
-      </w:r>
-      <w:r>
-        <w:t xml:space="preserve">a serial wire protocol with checksums and refusal gates, firmware, and a physical bring-up on an ESP8266 board, with fault injection tests.</w:t>
-      </w:r>
-    </w:p>
-    <w:p>
-      <w:pPr>
-        <w:numPr>
-          <w:ilvl w:val="0"/>
-          <w:numId w:val="1003"/>
-        </w:numPr>
-      </w:pPr>
-      <w:r>
-        <w:rPr>
-          <w:bCs/>
-          <w:b/>
-        </w:rPr>
-        <w:t xml:space="preserve">Negative results retained:</w:t>
-      </w:r>
-      <w:r>
-        <w:t xml:space="preserve"> </w:t>
-      </w:r>
-      <w:r>
-        <w:t xml:space="preserve">fitted models across protocols and four routes to RUL from sparse complete discharges.</w:t>
-      </w:r>
-    </w:p>
-    <w:bookmarkEnd w:id="25"/>
-    <w:bookmarkStart w:id="26" w:name="scope-and-organisation-of-the-report"/>
-    <w:p>
-      <w:pPr>
-        <w:pStyle w:val="Heading2"/>
-      </w:pPr>
-      <w:r>
-        <w:rPr>
-          <w:rStyle w:val="SectionNumber"/>
-        </w:rPr>
-        <w:t>1.7</w:t>
-      </w:r>
-      <w:r>
-        <w:tab/>
-      </w:r>
       <w:r>
         <w:t>SCOPE AND ORGANISATION OF THE REPORT</w:t>
       </w:r>
@@ -2535,41 +2306,22 @@
         <w:t xml:space="preserve">The remainder of the report is organised as follows. Chapter 2 reviews related work. Chapter 3 presents the system design and the estimation methods. Chapter 4 describes the implementation, the hardware rig and the deployment. Chapter 5 reports the results and discusses them. Chapter 6 concludes and lists future work.</w:t>
       </w:r>
     </w:p>
+    <w:bookmarkEnd w:id="25"/>
     <w:bookmarkEnd w:id="26"/>
-    <w:bookmarkEnd w:id="27"/>
-    <w:bookmarkStart w:id="36" w:name="literature-review"/>
+    <w:bookmarkStart w:id="35" w:name="literature-review"/>
     <w:p>
       <w:pPr>
         <w:pStyle w:val="Heading1"/>
       </w:pPr>
       <w:r>
-        <w:rPr>
-          <w:b/>
-        </w:rPr>
-        <w:t>CHAPTER 2</w:t>
-        <w:br/>
-      </w:r>
-      <w:r>
-        <w:rPr>
-          <w:b/>
-        </w:rPr>
         <w:t>LITERATURE REVIEW</w:t>
       </w:r>
     </w:p>
-    <w:bookmarkStart w:id="28" w:name="X1259210b64423408c35b18caed52eb52e45b504"/>
+    <w:bookmarkStart w:id="27" w:name="X1259210b64423408c35b18caed52eb52e45b504"/>
     <w:p>
       <w:pPr>
         <w:pStyle w:val="Heading2"/>
       </w:pPr>
-      <w:r>
-        <w:rPr>
-          <w:rStyle w:val="SectionNumber"/>
-        </w:rPr>
-        <w:t>2.1</w:t>
-      </w:r>
-      <w:r>
-        <w:tab/>
-      </w:r>
       <w:r>
         <w:t>STATE ESTIMATION IN THE BATTERY MANAGEMENT SYSTEM</w:t>
       </w:r>
@@ -2629,21 +2381,12 @@
         <w:t xml:space="preserve">In this project, resistance serves two roles: it corrects the ohmic sag that would otherwise make a fixed voltage window slide along the discharge curve, and it is reported as a second health output, validated against the laboratory instrument (Section 5.4).</w:t>
       </w:r>
     </w:p>
-    <w:bookmarkEnd w:id="28"/>
-    <w:bookmarkStart w:id="29" w:name="X9e9831f21f9c5525e7acb34f922108bfd4d6755"/>
+    <w:bookmarkEnd w:id="27"/>
+    <w:bookmarkStart w:id="28" w:name="X9e9831f21f9c5525e7acb34f922108bfd4d6755"/>
     <w:p>
       <w:pPr>
         <w:pStyle w:val="Heading2"/>
       </w:pPr>
-      <w:r>
-        <w:rPr>
-          <w:rStyle w:val="SectionNumber"/>
-        </w:rPr>
-        <w:t>2.2</w:t>
-      </w:r>
-      <w:r>
-        <w:tab/>
-      </w:r>
       <w:r>
         <w:t>DATA-DRIVEN SOH ESTIMATION AND HOW IT IS VALIDATED</w:t>
       </w:r>
@@ -2677,56 +2420,38 @@
         <w:t xml:space="preserve">How they are validated changes what they appear to achieve. Group-wise splitting by cell reduces reported skill substantially [7], and a large gap between random and cell-wise splits has been reported on NASA data [8]. This project extends the hold-out from the cell to the test protocol, using leave-one-cohort-out validation with a bootstrap interval over folds, and finds that the interval on any single method is wider than the spread between methods (Section 5.1).</w:t>
       </w:r>
     </w:p>
+    <w:bookmarkEnd w:id="28"/>
+    <w:bookmarkStart w:id="29" w:name="discharge-curve-analysis"/>
+    <w:p>
+      <w:pPr>
+        <w:pStyle w:val="Heading2"/>
+      </w:pPr>
+      <w:r>
+        <w:t>DISCHARGE-CURVE ANALYSIS</w:t>
+      </w:r>
+    </w:p>
+    <w:p>
+      <w:pPr>
+        <w:pStyle w:val="FirstParagraph"/>
+      </w:pPr>
+      <w:r>
+        <w:t xml:space="preserve">Differential voltage analysis [9] and incremental capacity analysis, including on-board use [11], read degradation from the shape of the voltage–charge curve, and their features can be mapped to degradation modes [10, 12]. Estimators using partial charging curves have also been reported [13].</w:t>
+      </w:r>
+    </w:p>
+    <w:p>
+      <w:pPr>
+        <w:pStyle w:val="BodyText"/>
+      </w:pPr>
+      <w:r>
+        <w:t xml:space="preserve">The window estimator used here belongs to this curve-based family. It differs in four ways: it uses no cross-cell fitting, it applies an online resistance correction from the load step, it uses gates that refuse rather than extrapolate, and it is validated from raw telemetry rather than from laboratory summaries.</w:t>
+      </w:r>
+    </w:p>
     <w:bookmarkEnd w:id="29"/>
-    <w:bookmarkStart w:id="30" w:name="discharge-curve-analysis"/>
+    <w:bookmarkStart w:id="30" w:name="remaining-useful-life-prognostics"/>
     <w:p>
       <w:pPr>
         <w:pStyle w:val="Heading2"/>
       </w:pPr>
-      <w:r>
-        <w:rPr>
-          <w:rStyle w:val="SectionNumber"/>
-        </w:rPr>
-        <w:t>2.3</w:t>
-      </w:r>
-      <w:r>
-        <w:tab/>
-      </w:r>
-      <w:r>
-        <w:t>DISCHARGE-CURVE ANALYSIS</w:t>
-      </w:r>
-    </w:p>
-    <w:p>
-      <w:pPr>
-        <w:pStyle w:val="FirstParagraph"/>
-      </w:pPr>
-      <w:r>
-        <w:t xml:space="preserve">Differential voltage analysis [9] and incremental capacity analysis, including on-board use [11], read degradation from the shape of the voltage–charge curve, and their features can be mapped to degradation modes [10, 12]. Estimators using partial charging curves have also been reported [13].</w:t>
-      </w:r>
-    </w:p>
-    <w:p>
-      <w:pPr>
-        <w:pStyle w:val="BodyText"/>
-      </w:pPr>
-      <w:r>
-        <w:t xml:space="preserve">The window estimator used here belongs to this curve-based family. It differs in four ways: it uses no cross-cell fitting, it applies an online resistance correction from the load step, it uses gates that refuse rather than extrapolate, and it is validated from raw telemetry rather than from laboratory summaries.</w:t>
-      </w:r>
-    </w:p>
-    <w:bookmarkEnd w:id="30"/>
-    <w:bookmarkStart w:id="31" w:name="remaining-useful-life-prognostics"/>
-    <w:p>
-      <w:pPr>
-        <w:pStyle w:val="Heading2"/>
-      </w:pPr>
-      <w:r>
-        <w:rPr>
-          <w:rStyle w:val="SectionNumber"/>
-        </w:rPr>
-        <w:t>2.4</w:t>
-      </w:r>
-      <w:r>
-        <w:tab/>
-      </w:r>
       <w:r>
         <w:t>REMAINING USEFUL LIFE PROGNOSTICS</w:t>
       </w:r>
@@ -2767,21 +2492,12 @@
         <w:t xml:space="preserve">, and records which routes to RUL failed (Sections 5.5 and 5.6).</w:t>
       </w:r>
     </w:p>
-    <w:bookmarkEnd w:id="31"/>
-    <w:bookmarkStart w:id="32" w:name="public-datasets-used"/>
+    <w:bookmarkEnd w:id="30"/>
+    <w:bookmarkStart w:id="31" w:name="public-datasets-used"/>
     <w:p>
       <w:pPr>
         <w:pStyle w:val="Heading2"/>
       </w:pPr>
-      <w:r>
-        <w:rPr>
-          <w:rStyle w:val="SectionNumber"/>
-        </w:rPr>
-        <w:t>2.5</w:t>
-      </w:r>
-      <w:r>
-        <w:tab/>
-      </w:r>
       <w:r>
         <w:t>PUBLIC DATASETS USED</w:t>
       </w:r>
@@ -2798,7 +2514,7 @@
       <w:pPr>
         <w:numPr>
           <w:ilvl w:val="0"/>
-          <w:numId w:val="1004"/>
+          <w:numId w:val="1003"/>
         </w:numPr>
       </w:pPr>
       <w:r>
@@ -2819,7 +2535,7 @@
       <w:pPr>
         <w:numPr>
           <w:ilvl w:val="0"/>
-          <w:numId w:val="1004"/>
+          <w:numId w:val="1003"/>
         </w:numPr>
       </w:pPr>
       <w:r>
@@ -2860,7 +2576,7 @@
       <w:pPr>
         <w:numPr>
           <w:ilvl w:val="0"/>
-          <w:numId w:val="1004"/>
+          <w:numId w:val="1003"/>
         </w:numPr>
       </w:pPr>
       <w:r>
@@ -2897,48 +2613,30 @@
         <w:t xml:space="preserve">C with an Artemis urban drive-cycle discharge. Used for external validation.</w:t>
       </w:r>
     </w:p>
+    <w:bookmarkEnd w:id="31"/>
+    <w:bookmarkStart w:id="32" w:name="Xa011e95ed21bbcdac3cbe7e6ae007553a5206cb"/>
+    <w:p>
+      <w:pPr>
+        <w:pStyle w:val="Heading2"/>
+      </w:pPr>
+      <w:r>
+        <w:t>TELEMETRY ACQUISITION IN VEHICLES AND ON THE BENCH</w:t>
+      </w:r>
+    </w:p>
+    <w:p>
+      <w:pPr>
+        <w:pStyle w:val="FirstParagraph"/>
+      </w:pPr>
+      <w:r>
+        <w:t xml:space="preserve">In a vehicle, BMS data is carried on a CAN bus, and a DBC file describes how signals are packed into frames. A research dataset arrives as files, and a bench rig typically streams text over a serial port. Each source has its own failure modes: a CAN decode can silently miss a signal, a serial link can drop or corrupt bytes, and a research file can store a quantity with a different sign or scale. The review above does not address how these three sources are made to agree, and this project treats it as a design question (Chapter 3): one schema, one scoring function, and explicit refusals when a capture’s shape is wrong.</w:t>
+      </w:r>
+    </w:p>
     <w:bookmarkEnd w:id="32"/>
-    <w:bookmarkStart w:id="33" w:name="Xa011e95ed21bbcdac3cbe7e6ae007553a5206cb"/>
+    <w:bookmarkStart w:id="33" w:name="positioning-of-this-work"/>
     <w:p>
       <w:pPr>
         <w:pStyle w:val="Heading2"/>
       </w:pPr>
-      <w:r>
-        <w:rPr>
-          <w:rStyle w:val="SectionNumber"/>
-        </w:rPr>
-        <w:t>2.6</w:t>
-      </w:r>
-      <w:r>
-        <w:tab/>
-      </w:r>
-      <w:r>
-        <w:t>TELEMETRY ACQUISITION IN VEHICLES AND ON THE BENCH</w:t>
-      </w:r>
-    </w:p>
-    <w:p>
-      <w:pPr>
-        <w:pStyle w:val="FirstParagraph"/>
-      </w:pPr>
-      <w:r>
-        <w:t xml:space="preserve">In a vehicle, BMS data is carried on a CAN bus, and a DBC file describes how signals are packed into frames. A research dataset arrives as files, and a bench rig typically streams text over a serial port. Each source has its own failure modes: a CAN decode can silently miss a signal, a serial link can drop or corrupt bytes, and a research file can store a quantity with a different sign or scale. The review above does not address how these three sources are made to agree, and this project treats it as a design question (Chapter 3): one schema, one scoring function, and explicit refusals when a capture’s shape is wrong.</w:t>
-      </w:r>
-    </w:p>
-    <w:bookmarkEnd w:id="33"/>
-    <w:bookmarkStart w:id="34" w:name="positioning-of-this-work"/>
-    <w:p>
-      <w:pPr>
-        <w:pStyle w:val="Heading2"/>
-      </w:pPr>
-      <w:r>
-        <w:rPr>
-          <w:rStyle w:val="SectionNumber"/>
-        </w:rPr>
-        <w:t>2.7</w:t>
-      </w:r>
-      <w:r>
-        <w:tab/>
-      </w:r>
       <w:r>
         <w:t>POSITIONING OF THIS WORK</w:t>
       </w:r>
@@ -3389,51 +3087,32 @@
         </w:tc>
       </w:tr>
     </w:tbl>
+    <w:bookmarkEnd w:id="33"/>
+    <w:bookmarkStart w:id="34" w:name="summary"/>
+    <w:p>
+      <w:pPr>
+        <w:pStyle w:val="Heading2"/>
+      </w:pPr>
+      <w:r>
+        <w:t>SUMMARY</w:t>
+      </w:r>
+    </w:p>
+    <w:p>
+      <w:pPr>
+        <w:pStyle w:val="FirstParagraph"/>
+      </w:pPr>
+      <w:r>
+        <w:t xml:space="preserve">The literature establishes the measurements, the curve-based family of methods, online resistance estimation and the importance of validation splits. What it leaves open, and what this project addresses, is a software layer that is validated from raw telemetry across protocols and datasets, that fits nothing across cells, and that returns a refusal instead of a number when its evidence is insufficient.</w:t>
+      </w:r>
+    </w:p>
     <w:bookmarkEnd w:id="34"/>
-    <w:bookmarkStart w:id="35" w:name="summary"/>
-    <w:p>
-      <w:pPr>
-        <w:pStyle w:val="Heading2"/>
-      </w:pPr>
-      <w:r>
-        <w:rPr>
-          <w:rStyle w:val="SectionNumber"/>
-        </w:rPr>
-        <w:t>2.8</w:t>
-      </w:r>
-      <w:r>
-        <w:tab/>
-      </w:r>
-      <w:r>
-        <w:t>SUMMARY</w:t>
-      </w:r>
-    </w:p>
-    <w:p>
-      <w:pPr>
-        <w:pStyle w:val="FirstParagraph"/>
-      </w:pPr>
-      <w:r>
-        <w:t xml:space="preserve">The literature establishes the measurements, the curve-based family of methods, online resistance estimation and the importance of validation splits. What it leaves open, and what this project addresses, is a software layer that is validated from raw telemetry across protocols and datasets, that fits nothing across cells, and that returns a refusal instead of a number when its evidence is insufficient.</w:t>
-      </w:r>
-    </w:p>
     <w:bookmarkEnd w:id="35"/>
-    <w:bookmarkEnd w:id="36"/>
-    <w:bookmarkStart w:id="59" w:name="methodology-system-design"/>
+    <w:bookmarkStart w:id="58" w:name="methodology-system-design"/>
     <w:p>
       <w:pPr>
         <w:pStyle w:val="Heading1"/>
       </w:pPr>
       <w:r>
-        <w:rPr>
-          <w:b/>
-        </w:rPr>
-        <w:t>CHAPTER 3</w:t>
-        <w:br/>
-      </w:r>
-      <w:r>
-        <w:rPr>
-          <w:b/>
-        </w:rPr>
         <w:t>METHODOLOGY / SYSTEM DESIGN</w:t>
       </w:r>
     </w:p>
@@ -3493,20 +3172,11 @@
         <w:t xml:space="preserve">the experiments were controlled. The practical realisation of the design (code organisation, wire protocol, hardware rig, services and deployment) is described in Chapter 4.</w:t>
       </w:r>
     </w:p>
-    <w:bookmarkStart w:id="38" w:name="problem-and-design-objective"/>
+    <w:bookmarkStart w:id="37" w:name="problem-and-design-objective"/>
     <w:p>
       <w:pPr>
         <w:pStyle w:val="Heading2"/>
       </w:pPr>
-      <w:r>
-        <w:rPr>
-          <w:rStyle w:val="SectionNumber"/>
-        </w:rPr>
-        <w:t>3.1</w:t>
-      </w:r>
-      <w:r>
-        <w:tab/>
-      </w:r>
       <w:r>
         <w:t>PROBLEM AND DESIGN OBJECTIVE</w:t>
       </w:r>
@@ -3523,7 +3193,7 @@
       <w:pPr>
         <w:numPr>
           <w:ilvl w:val="0"/>
-          <w:numId w:val="1005"/>
+          <w:numId w:val="1004"/>
         </w:numPr>
       </w:pPr>
       <w:r>
@@ -3544,7 +3214,7 @@
       <w:pPr>
         <w:numPr>
           <w:ilvl w:val="0"/>
-          <w:numId w:val="1005"/>
+          <w:numId w:val="1004"/>
         </w:numPr>
       </w:pPr>
       <w:r>
@@ -3561,20 +3231,11 @@
         <w:t xml:space="preserve">Every output is validated, banded by its measured error, or refused with a stated cause. A refusal is a correct outcome that the system knows, so it is returned as a value, rendered, and reflected in the process exit code.</w:t>
       </w:r>
     </w:p>
-    <w:bookmarkStart w:id="37" w:name="research-variables"/>
+    <w:bookmarkStart w:id="36" w:name="research-variables"/>
     <w:p>
       <w:pPr>
         <w:pStyle w:val="Heading3"/>
       </w:pPr>
-      <w:r>
-        <w:rPr>
-          <w:rStyle w:val="SectionNumber"/>
-        </w:rPr>
-        <w:t xml:space="preserve">3.1.1</w:t>
-      </w:r>
-      <w:r>
-        <w:tab/>
-      </w:r>
       <w:r>
         <w:t xml:space="preserve">Research Variables</w:t>
       </w:r>
@@ -3583,7 +3244,7 @@
       <w:pPr>
         <w:numPr>
           <w:ilvl w:val="0"/>
-          <w:numId w:val="1006"/>
+          <w:numId w:val="1005"/>
         </w:numPr>
       </w:pPr>
       <w:r>
@@ -3604,7 +3265,7 @@
       <w:pPr>
         <w:numPr>
           <w:ilvl w:val="0"/>
-          <w:numId w:val="1006"/>
+          <w:numId w:val="1005"/>
         </w:numPr>
       </w:pPr>
       <w:r>
@@ -3625,7 +3286,7 @@
       <w:pPr>
         <w:numPr>
           <w:ilvl w:val="0"/>
-          <w:numId w:val="1006"/>
+          <w:numId w:val="1005"/>
         </w:numPr>
       </w:pPr>
       <w:r>
@@ -3642,22 +3303,13 @@
         <w:t xml:space="preserve">the reference definition (a quantity a BMS can hold), the primary window and tolerances, fixed before each study ran, and the scoring rule. Choices made after seeing a result are labelled exploratory.</w:t>
       </w:r>
     </w:p>
+    <w:bookmarkEnd w:id="36"/>
     <w:bookmarkEnd w:id="37"/>
-    <w:bookmarkEnd w:id="38"/>
-    <w:bookmarkStart w:id="43" w:name="overall-system-framework"/>
+    <w:bookmarkStart w:id="42" w:name="overall-system-framework"/>
     <w:p>
       <w:pPr>
         <w:pStyle w:val="Heading2"/>
       </w:pPr>
-      <w:r>
-        <w:rPr>
-          <w:rStyle w:val="SectionNumber"/>
-        </w:rPr>
-        <w:t>3.2</w:t>
-      </w:r>
-      <w:r>
-        <w:tab/>
-      </w:r>
       <w:r>
         <w:t>OVERALL SYSTEM FRAMEWORK</w:t>
       </w:r>
@@ -3679,18 +3331,18 @@
           <wp:inline>
             <wp:extent cx="4751204" cy="3368116"/>
             <wp:effectExtent b="0" l="0" r="0" t="0"/>
-            <wp:docPr descr="" title="" id="40" name="Picture"/>
+            <wp:docPr descr="" title="" id="39" name="Picture"/>
             <a:graphic>
               <a:graphicData uri="http://schemas.openxmlformats.org/drawingml/2006/picture">
                 <pic:pic>
                   <pic:nvPicPr>
-                    <pic:cNvPr descr="fig/t1.png" id="41" name="Picture"/>
+                    <pic:cNvPr descr="fig/t1.png" id="40" name="Picture"/>
                     <pic:cNvPicPr>
                       <a:picLocks noChangeArrowheads="1" noChangeAspect="1"/>
                     </pic:cNvPicPr>
                   </pic:nvPicPr>
                   <pic:blipFill>
-                    <a:blip r:embed="rId39"/>
+                    <a:blip r:embed="rId38"/>
                     <a:stretch>
                       <a:fillRect/>
                     </a:stretch>
@@ -3725,20 +3377,11 @@
         <w:t xml:space="preserve">Figure 3.1: Overall system framework: three transports, one unified frame, one scoring function, and the service tier.</w:t>
       </w:r>
     </w:p>
-    <w:bookmarkStart w:id="42" w:name="X406dce0d5cebebbc4b223faee15a711381eaf7d"/>
+    <w:bookmarkStart w:id="41" w:name="X406dce0d5cebebbc4b223faee15a711381eaf7d"/>
     <w:p>
       <w:pPr>
         <w:pStyle w:val="Heading3"/>
       </w:pPr>
-      <w:r>
-        <w:rPr>
-          <w:rStyle w:val="SectionNumber"/>
-        </w:rPr>
-        <w:t xml:space="preserve">3.2.1</w:t>
-      </w:r>
-      <w:r>
-        <w:tab/>
-      </w:r>
       <w:r>
         <w:t xml:space="preserve">One Scoring Path, Extracted Rather Than Copied</w:t>
       </w:r>
@@ -3766,22 +3409,13 @@
         <w:t xml:space="preserve">contains everything downstream of acquisition: segmentation, coulomb counting, features, risk, health, RUL, the Guardian explanation and the digital twin. It was extracted from the CAN pipeline when serial ingestion was added, instead of being copied. A second segmentation or feature extractor would mean that a disagreement between a CAN run and a serial run over the same battery could not be traced to either the data or the code. With the tail shared, a difference in output is a difference in the telemetry.</w:t>
       </w:r>
     </w:p>
+    <w:bookmarkEnd w:id="41"/>
     <w:bookmarkEnd w:id="42"/>
-    <w:bookmarkEnd w:id="43"/>
-    <w:bookmarkStart w:id="44" w:name="datasets"/>
+    <w:bookmarkStart w:id="43" w:name="datasets"/>
     <w:p>
       <w:pPr>
         <w:pStyle w:val="Heading2"/>
       </w:pPr>
-      <w:r>
-        <w:rPr>
-          <w:rStyle w:val="SectionNumber"/>
-        </w:rPr>
-        <w:t>3.3</w:t>
-      </w:r>
-      <w:r>
-        <w:tab/>
-      </w:r>
       <w:r>
         <w:t>DATASETS</w:t>
       </w:r>
@@ -4220,21 +3854,12 @@
         <w:t xml:space="preserve">CALCE records span many files whose test time restarts per file. A monotonic time base is constructed by offsetting each restart, not by sorting timestamps, which would interleave overlapping segments. The CALCE set includes real partial cycling (CS2 Types 5 and 6): thousands of discharges of about 25% depth in a fixed band, with a full capacity check roughly every 100 cycles. Type 6 cycles at the top of charge (about 4.07 to 3.78 V) and Type 5 near empty (about 3.69 to 2.70 V). The Oxford set additionally holds one real drive-cycle discharge of Cell 1 sampled at 1 Hz, used only for external validation.</w:t>
       </w:r>
     </w:p>
-    <w:bookmarkEnd w:id="44"/>
-    <w:bookmarkStart w:id="45" w:name="from-telemetry-to-discharges"/>
+    <w:bookmarkEnd w:id="43"/>
+    <w:bookmarkStart w:id="44" w:name="from-telemetry-to-discharges"/>
     <w:p>
       <w:pPr>
         <w:pStyle w:val="Heading2"/>
       </w:pPr>
-      <w:r>
-        <w:rPr>
-          <w:rStyle w:val="SectionNumber"/>
-        </w:rPr>
-        <w:t>3.4</w:t>
-      </w:r>
-      <w:r>
-        <w:tab/>
-      </w:r>
       <w:r>
         <w:t>FROM TELEMETRY TO DISCHARGES</w:t>
       </w:r>
@@ -4342,21 +3967,12 @@
         <w:t xml:space="preserve">. Every discharge is retained: a partial discharge that crosses the window is a full measurement of the window.</w:t>
       </w:r>
     </w:p>
-    <w:bookmarkEnd w:id="45"/>
-    <w:bookmarkStart w:id="49" w:name="voltage-window-state-of-health"/>
+    <w:bookmarkEnd w:id="44"/>
+    <w:bookmarkStart w:id="48" w:name="voltage-window-state-of-health"/>
     <w:p>
       <w:pPr>
         <w:pStyle w:val="Heading2"/>
       </w:pPr>
-      <w:r>
-        <w:rPr>
-          <w:rStyle w:val="SectionNumber"/>
-        </w:rPr>
-        <w:t>3.5</w:t>
-      </w:r>
-      <w:r>
-        <w:tab/>
-      </w:r>
       <w:r>
         <w:t>VOLTAGE-WINDOW STATE OF HEALTH</w:t>
       </w:r>
@@ -4792,18 +4408,18 @@
           <wp:inline>
             <wp:extent cx="2145853" cy="4126287"/>
             <wp:effectExtent b="0" l="0" r="0" t="0"/>
-            <wp:docPr descr="" title="" id="47" name="Picture"/>
+            <wp:docPr descr="" title="" id="46" name="Picture"/>
             <a:graphic>
               <a:graphicData uri="http://schemas.openxmlformats.org/drawingml/2006/picture">
                 <pic:pic>
                   <pic:nvPicPr>
-                    <pic:cNvPr descr="fig/t2.png" id="48" name="Picture"/>
+                    <pic:cNvPr descr="fig/t2.png" id="47" name="Picture"/>
                     <pic:cNvPicPr>
                       <a:picLocks noChangeArrowheads="1" noChangeAspect="1"/>
                     </pic:cNvPicPr>
                   </pic:nvPicPr>
                   <pic:blipFill>
-                    <a:blip r:embed="rId46"/>
+                    <a:blip r:embed="rId45"/>
                     <a:stretch>
                       <a:fillRect/>
                     </a:stretch>
@@ -4838,21 +4454,12 @@
         <w:t xml:space="preserve">Figure 3.2: Field SOH estimator: from raw telemetry to a banded or refused output.</w:t>
       </w:r>
     </w:p>
-    <w:bookmarkEnd w:id="49"/>
-    <w:bookmarkStart w:id="50" w:name="X67f8cf879d277e0ff2db2a9f13519561af31b7f"/>
+    <w:bookmarkEnd w:id="48"/>
+    <w:bookmarkStart w:id="49" w:name="X67f8cf879d277e0ff2db2a9f13519561af31b7f"/>
     <w:p>
       <w:pPr>
         <w:pStyle w:val="Heading2"/>
       </w:pPr>
-      <w:r>
-        <w:rPr>
-          <w:rStyle w:val="SectionNumber"/>
-        </w:rPr>
-        <w:t>3.6</w:t>
-      </w:r>
-      <w:r>
-        <w:tab/>
-      </w:r>
       <w:r>
         <w:t>RESISTANCE FROM THE LOAD STEP AND OHMIC CORRECTION</w:t>
       </w:r>
@@ -5292,21 +4899,12 @@
         <w:t xml:space="preserve">Discharges preceding the first resistance estimate are left unmeasured rather than scored uncompensated.</w:t>
       </w:r>
     </w:p>
-    <w:bookmarkEnd w:id="50"/>
-    <w:bookmarkStart w:id="51" w:name="gates"/>
+    <w:bookmarkEnd w:id="49"/>
+    <w:bookmarkStart w:id="50" w:name="gates"/>
     <w:p>
       <w:pPr>
         <w:pStyle w:val="Heading2"/>
       </w:pPr>
-      <w:r>
-        <w:rPr>
-          <w:rStyle w:val="SectionNumber"/>
-        </w:rPr>
-        <w:t>3.7</w:t>
-      </w:r>
-      <w:r>
-        <w:tab/>
-      </w:r>
       <w:r>
         <w:t>GATES</w:t>
       </w:r>
@@ -5323,7 +4921,7 @@
       <w:pPr>
         <w:numPr>
           <w:ilvl w:val="0"/>
-          <w:numId w:val="1007"/>
+          <w:numId w:val="1006"/>
         </w:numPr>
       </w:pPr>
       <w:r>
@@ -5344,7 +4942,7 @@
       <w:pPr>
         <w:numPr>
           <w:ilvl w:val="0"/>
-          <w:numId w:val="1007"/>
+          <w:numId w:val="1006"/>
         </w:numPr>
       </w:pPr>
       <w:r>
@@ -5365,7 +4963,7 @@
       <w:pPr>
         <w:numPr>
           <w:ilvl w:val="0"/>
-          <w:numId w:val="1007"/>
+          <w:numId w:val="1006"/>
         </w:numPr>
       </w:pPr>
       <w:r>
@@ -5382,21 +4980,12 @@
         <w:t xml:space="preserve">The reference must be complete within 20 equivalent full cycles of charge throughput. Throughput rather than a discharge count is used because storage-protocol records contain thousands of short pulses.</w:t>
       </w:r>
     </w:p>
-    <w:bookmarkEnd w:id="51"/>
-    <w:bookmarkStart w:id="52" w:name="learned-windows-for-partial-discharges"/>
+    <w:bookmarkEnd w:id="50"/>
+    <w:bookmarkStart w:id="51" w:name="learned-windows-for-partial-discharges"/>
     <w:p>
       <w:pPr>
         <w:pStyle w:val="Heading2"/>
       </w:pPr>
-      <w:r>
-        <w:rPr>
-          <w:rStyle w:val="SectionNumber"/>
-        </w:rPr>
-        <w:t>3.8</w:t>
-      </w:r>
-      <w:r>
-        <w:tab/>
-      </w:r>
       <w:r>
         <w:t>LEARNED WINDOWS FOR PARTIAL DISCHARGES</w:t>
       </w:r>
@@ -5834,21 +5423,12 @@
         <w:t xml:space="preserve">, because it then lies on the end-of-discharge knee. There, voltage reflects kinetics (resistance and solid-state diffusion) rather than stored charge.</w:t>
       </w:r>
     </w:p>
-    <w:bookmarkEnd w:id="52"/>
-    <w:bookmarkStart w:id="53" w:name="X0e0bdbba195aee1eca36e6f4abd4b64afa8add6"/>
+    <w:bookmarkEnd w:id="51"/>
+    <w:bookmarkStart w:id="52" w:name="X0e0bdbba195aee1eca36e6f4abd4b64afa8add6"/>
     <w:p>
       <w:pPr>
         <w:pStyle w:val="Heading2"/>
       </w:pPr>
-      <w:r>
-        <w:rPr>
-          <w:rStyle w:val="SectionNumber"/>
-        </w:rPr>
-        <w:t>3.9</w:t>
-      </w:r>
-      <w:r>
-        <w:tab/>
-      </w:r>
       <w:r>
         <w:t>REMAINING USEFUL LIFE FROM THE CELL’S OWN FADE</w:t>
       </w:r>
@@ -5886,21 +5466,12 @@
         <w:t xml:space="preserve">is smoothed with an 11-point rolling median, a straight line is fitted to the full history, and its crossing of 0.90 gives the end-of-life estimate. Estimates are refused in three cases: with fewer than 30 points, for flat or rising trends, and when the estimate reaches more than twice the history length ahead. A cell already past the threshold is reported as zero. Linear, square-root and quadratic forms, over full and trailing windows, were compared, and the full-history line was most accurate near end of life. No other cell’s data enters, so there is no training cohort.</w:t>
       </w:r>
     </w:p>
-    <w:bookmarkEnd w:id="53"/>
-    <w:bookmarkStart w:id="54" w:name="evidence-sufficiency"/>
+    <w:bookmarkEnd w:id="52"/>
+    <w:bookmarkStart w:id="53" w:name="evidence-sufficiency"/>
     <w:p>
       <w:pPr>
         <w:pStyle w:val="Heading2"/>
       </w:pPr>
-      <w:r>
-        <w:rPr>
-          <w:rStyle w:val="SectionNumber"/>
-        </w:rPr>
-        <w:t>3.10</w:t>
-      </w:r>
-      <w:r>
-        <w:tab/>
-      </w:r>
       <w:r>
         <w:t>EVIDENCE SUFFICIENCY</w:t>
       </w:r>
@@ -6538,21 +6109,12 @@
         <w:t xml:space="preserve">(inconsistent, reported with the measured 22-point band).</w:t>
       </w:r>
     </w:p>
-    <w:bookmarkEnd w:id="54"/>
-    <w:bookmarkStart w:id="55" w:name="behaviour-scoring-layer-heuristic"/>
+    <w:bookmarkEnd w:id="53"/>
+    <w:bookmarkStart w:id="54" w:name="behaviour-scoring-layer-heuristic"/>
     <w:p>
       <w:pPr>
         <w:pStyle w:val="Heading2"/>
       </w:pPr>
-      <w:r>
-        <w:rPr>
-          <w:rStyle w:val="SectionNumber"/>
-        </w:rPr>
-        <w:t>3.11</w:t>
-      </w:r>
-      <w:r>
-        <w:tab/>
-      </w:r>
       <w:r>
         <w:t>BEHAVIOUR SCORING LAYER (HEURISTIC)</w:t>
       </w:r>
@@ -7181,21 +6743,12 @@
         <w:t xml:space="preserve">), so it is labelled a heuristic wherever it appears. Where measured SOH exists and the log starts at beginning of life, the measured SOH sets the battery state and records that it did, and the heuristic index is used only otherwise.</w:t>
       </w:r>
     </w:p>
-    <w:bookmarkEnd w:id="55"/>
-    <w:bookmarkStart w:id="56" w:name="validation-protocol"/>
+    <w:bookmarkEnd w:id="54"/>
+    <w:bookmarkStart w:id="55" w:name="validation-protocol"/>
     <w:p>
       <w:pPr>
         <w:pStyle w:val="Heading2"/>
       </w:pPr>
-      <w:r>
-        <w:rPr>
-          <w:rStyle w:val="SectionNumber"/>
-        </w:rPr>
-        <w:t>3.12</w:t>
-      </w:r>
-      <w:r>
-        <w:tab/>
-      </w:r>
       <w:r>
         <w:t>VALIDATION PROTOCOL</w:t>
       </w:r>
@@ -7295,21 +6848,12 @@
         <w:t xml:space="preserve">Errors are summarised per cell, then across cells, so long-lived cells do not dominate.</w:t>
       </w:r>
     </w:p>
-    <w:bookmarkEnd w:id="56"/>
-    <w:bookmarkStart w:id="57" w:name="evaluation-metrics"/>
+    <w:bookmarkEnd w:id="55"/>
+    <w:bookmarkStart w:id="56" w:name="evaluation-metrics"/>
     <w:p>
       <w:pPr>
         <w:pStyle w:val="Heading2"/>
       </w:pPr>
-      <w:r>
-        <w:rPr>
-          <w:rStyle w:val="SectionNumber"/>
-        </w:rPr>
-        <w:t>3.13</w:t>
-      </w:r>
-      <w:r>
-        <w:tab/>
-      </w:r>
       <w:r>
         <w:t>EVALUATION METRICS</w:t>
       </w:r>
@@ -7318,7 +6862,7 @@
       <w:pPr>
         <w:numPr>
           <w:ilvl w:val="0"/>
-          <w:numId w:val="1008"/>
+          <w:numId w:val="1007"/>
         </w:numPr>
       </w:pPr>
       <w:r>
@@ -7339,7 +6883,7 @@
       <w:pPr>
         <w:numPr>
           <w:ilvl w:val="0"/>
-          <w:numId w:val="1008"/>
+          <w:numId w:val="1007"/>
         </w:numPr>
       </w:pPr>
       <w:r>
@@ -7360,7 +6904,7 @@
       <w:pPr>
         <w:numPr>
           <w:ilvl w:val="0"/>
-          <w:numId w:val="1008"/>
+          <w:numId w:val="1007"/>
         </w:numPr>
       </w:pPr>
       <w:r>
@@ -7381,7 +6925,7 @@
       <w:pPr>
         <w:numPr>
           <w:ilvl w:val="0"/>
-          <w:numId w:val="1008"/>
+          <w:numId w:val="1007"/>
         </w:numPr>
       </w:pPr>
       <w:r>
@@ -7416,7 +6960,7 @@
       <w:pPr>
         <w:numPr>
           <w:ilvl w:val="0"/>
-          <w:numId w:val="1008"/>
+          <w:numId w:val="1007"/>
         </w:numPr>
       </w:pPr>
       <w:r>
@@ -7451,7 +6995,7 @@
       <w:pPr>
         <w:numPr>
           <w:ilvl w:val="0"/>
-          <w:numId w:val="1008"/>
+          <w:numId w:val="1007"/>
         </w:numPr>
       </w:pPr>
       <w:r>
@@ -7491,21 +7035,12 @@
         <w:t xml:space="preserve">against the training mean with bootstrap intervals, and LOCO mean absolute error.</w:t>
       </w:r>
     </w:p>
-    <w:bookmarkEnd w:id="57"/>
-    <w:bookmarkStart w:id="58" w:name="X9488bfda7dec3ab9246fabbcfd71c2a744e6000"/>
+    <w:bookmarkEnd w:id="56"/>
+    <w:bookmarkStart w:id="57" w:name="X9488bfda7dec3ab9246fabbcfd71c2a744e6000"/>
     <w:p>
       <w:pPr>
         <w:pStyle w:val="Heading2"/>
       </w:pPr>
-      <w:r>
-        <w:rPr>
-          <w:rStyle w:val="SectionNumber"/>
-        </w:rPr>
-        <w:t>3.14</w:t>
-      </w:r>
-      <w:r>
-        <w:tab/>
-      </w:r>
       <w:r>
         <w:t>EXPERIMENTAL CONTROLS AND REPRODUCIBILITY</w:t>
       </w:r>
@@ -7527,41 +7062,22 @@
         <w:t xml:space="preserve">) ties each figure quoted in the documentation to the artifact that produced it, so a re-run experiment with a stale paragraph fails the build. A control shuffles each cell’s capacity in time to confirm that the benchmark harness does not manufacture skill. A continuous-integration job reproduces the headline benchmark end to end.</w:t>
       </w:r>
     </w:p>
+    <w:bookmarkEnd w:id="57"/>
     <w:bookmarkEnd w:id="58"/>
-    <w:bookmarkEnd w:id="59"/>
-    <w:bookmarkStart w:id="89" w:name="implementation-and-deployment"/>
+    <w:bookmarkStart w:id="88" w:name="implementation-and-deployment"/>
     <w:p>
       <w:pPr>
         <w:pStyle w:val="Heading1"/>
       </w:pPr>
       <w:r>
-        <w:rPr>
-          <w:b/>
-        </w:rPr>
-        <w:t>CHAPTER 4</w:t>
-        <w:br/>
-      </w:r>
-      <w:r>
-        <w:rPr>
-          <w:b/>
-        </w:rPr>
         <w:t>IMPLEMENTATION AND DEPLOYMENT</w:t>
       </w:r>
     </w:p>
-    <w:bookmarkStart w:id="60" w:name="implementation-overview"/>
+    <w:bookmarkStart w:id="59" w:name="implementation-overview"/>
     <w:p>
       <w:pPr>
         <w:pStyle w:val="Heading2"/>
       </w:pPr>
-      <w:r>
-        <w:rPr>
-          <w:rStyle w:val="SectionNumber"/>
-        </w:rPr>
-        <w:t>4.1</w:t>
-      </w:r>
-      <w:r>
-        <w:tab/>
-      </w:r>
       <w:r>
         <w:t>IMPLEMENTATION OVERVIEW</w:t>
       </w:r>
@@ -7578,7 +7094,7 @@
       <w:pPr>
         <w:numPr>
           <w:ilvl w:val="0"/>
-          <w:numId w:val="1009"/>
+          <w:numId w:val="1008"/>
         </w:numPr>
       </w:pPr>
       <w:r>
@@ -7599,7 +7115,7 @@
       <w:pPr>
         <w:numPr>
           <w:ilvl w:val="0"/>
-          <w:numId w:val="1009"/>
+          <w:numId w:val="1008"/>
         </w:numPr>
       </w:pPr>
       <w:r>
@@ -7620,7 +7136,7 @@
       <w:pPr>
         <w:numPr>
           <w:ilvl w:val="0"/>
-          <w:numId w:val="1009"/>
+          <w:numId w:val="1008"/>
         </w:numPr>
       </w:pPr>
       <w:r>
@@ -7637,21 +7153,12 @@
         <w:t xml:space="preserve">the REST API, the gateway, the dashboard, testing, continuous integration and containers (Sections 4.8 to 4.11).</w:t>
       </w:r>
     </w:p>
-    <w:bookmarkEnd w:id="60"/>
-    <w:bookmarkStart w:id="61" w:name="development-environment-and-tools"/>
+    <w:bookmarkEnd w:id="59"/>
+    <w:bookmarkStart w:id="60" w:name="development-environment-and-tools"/>
     <w:p>
       <w:pPr>
         <w:pStyle w:val="Heading2"/>
       </w:pPr>
-      <w:r>
-        <w:rPr>
-          <w:rStyle w:val="SectionNumber"/>
-        </w:rPr>
-        <w:t>4.2</w:t>
-      </w:r>
-      <w:r>
-        <w:tab/>
-      </w:r>
       <w:r>
         <w:t>DEVELOPMENT ENVIRONMENT AND TOOLS</w:t>
       </w:r>
@@ -8169,21 +7676,12 @@
         </w:tc>
       </w:tr>
     </w:tbl>
-    <w:bookmarkEnd w:id="61"/>
-    <w:bookmarkStart w:id="62" w:name="code-organisation"/>
+    <w:bookmarkEnd w:id="60"/>
+    <w:bookmarkStart w:id="61" w:name="code-organisation"/>
     <w:p>
       <w:pPr>
         <w:pStyle w:val="Heading2"/>
       </w:pPr>
-      <w:r>
-        <w:rPr>
-          <w:rStyle w:val="SectionNumber"/>
-        </w:rPr>
-        <w:t>4.3</w:t>
-      </w:r>
-      <w:r>
-        <w:tab/>
-      </w:r>
       <w:r>
         <w:t>CODE ORGANISATION</w:t>
       </w:r>
@@ -8843,7 +8341,7 @@
       <w:pPr>
         <w:numPr>
           <w:ilvl w:val="0"/>
-          <w:numId w:val="1010"/>
+          <w:numId w:val="1009"/>
         </w:numPr>
       </w:pPr>
       <w:r>
@@ -8860,7 +8358,7 @@
       <w:pPr>
         <w:numPr>
           <w:ilvl w:val="0"/>
-          <w:numId w:val="1010"/>
+          <w:numId w:val="1009"/>
         </w:numPr>
       </w:pPr>
       <w:r>
@@ -8877,7 +8375,7 @@
       <w:pPr>
         <w:numPr>
           <w:ilvl w:val="0"/>
-          <w:numId w:val="1010"/>
+          <w:numId w:val="1009"/>
         </w:numPr>
       </w:pPr>
       <w:r>
@@ -8894,7 +8392,7 @@
       <w:pPr>
         <w:numPr>
           <w:ilvl w:val="0"/>
-          <w:numId w:val="1010"/>
+          <w:numId w:val="1009"/>
         </w:numPr>
       </w:pPr>
       <w:r>
@@ -8911,7 +8409,7 @@
       <w:pPr>
         <w:numPr>
           <w:ilvl w:val="0"/>
-          <w:numId w:val="1010"/>
+          <w:numId w:val="1009"/>
         </w:numPr>
       </w:pPr>
       <w:r>
@@ -8924,21 +8422,12 @@
         <w:t xml:space="preserve">: fourteen architecture decision records, including those that record reversed decisions.</w:t>
       </w:r>
     </w:p>
-    <w:bookmarkEnd w:id="62"/>
-    <w:bookmarkStart w:id="64" w:name="X78cf532366139ad8e3483c48ac03aee0be1935a"/>
+    <w:bookmarkEnd w:id="61"/>
+    <w:bookmarkStart w:id="63" w:name="X78cf532366139ad8e3483c48ac03aee0be1935a"/>
     <w:p>
       <w:pPr>
         <w:pStyle w:val="Heading2"/>
       </w:pPr>
-      <w:r>
-        <w:rPr>
-          <w:rStyle w:val="SectionNumber"/>
-        </w:rPr>
-        <w:t>4.4</w:t>
-      </w:r>
-      <w:r>
-        <w:tab/>
-      </w:r>
       <w:r>
         <w:t>TELEMETRY ACQUISITION: THREE TRANSPORTS, ONE FRAME</w:t>
       </w:r>
@@ -9030,7 +8519,7 @@
       <w:pPr>
         <w:numPr>
           <w:ilvl w:val="0"/>
-          <w:numId w:val="1011"/>
+          <w:numId w:val="1010"/>
         </w:numPr>
       </w:pPr>
       <w:r>
@@ -9051,7 +8540,7 @@
       <w:pPr>
         <w:numPr>
           <w:ilvl w:val="0"/>
-          <w:numId w:val="1011"/>
+          <w:numId w:val="1010"/>
         </w:numPr>
       </w:pPr>
       <w:r>
@@ -9072,7 +8561,7 @@
       <w:pPr>
         <w:numPr>
           <w:ilvl w:val="0"/>
-          <w:numId w:val="1011"/>
+          <w:numId w:val="1010"/>
         </w:numPr>
       </w:pPr>
       <w:r>
@@ -9089,20 +8578,11 @@
         <w:t xml:space="preserve">Loaders read the NASA MATLAB files and the CALCE and Oxford records into the same frame.</w:t>
       </w:r>
     </w:p>
-    <w:bookmarkStart w:id="63" w:name="the-seam-is-narrow"/>
+    <w:bookmarkStart w:id="62" w:name="the-seam-is-narrow"/>
     <w:p>
       <w:pPr>
         <w:pStyle w:val="Heading3"/>
       </w:pPr>
-      <w:r>
-        <w:rPr>
-          <w:rStyle w:val="SectionNumber"/>
-        </w:rPr>
-        <w:t xml:space="preserve">4.4.1</w:t>
-      </w:r>
-      <w:r>
-        <w:tab/>
-      </w:r>
       <w:r>
         <w:t xml:space="preserve">The Seam Is Narrow</w:t>
       </w:r>
@@ -9143,22 +8623,13 @@
         <w:t xml:space="preserve">and not record objects. Emitting objects would have been less code but would have proved nothing, because the parser, the checksum, the schema validation and the coverage gate would all be bypassed in exactly the path the tests exercise. The emulator even prints an ESP32 boot banner, so the sentinel filter runs on every test. Recording composes at the same seam: one decorator makes a live port, a replay or the emulator recordable, and the file on disk is exactly the bytes that produced the result.</w:t>
       </w:r>
     </w:p>
+    <w:bookmarkEnd w:id="62"/>
     <w:bookmarkEnd w:id="63"/>
-    <w:bookmarkEnd w:id="64"/>
-    <w:bookmarkStart w:id="68" w:name="serial-wire-protocol"/>
+    <w:bookmarkStart w:id="67" w:name="serial-wire-protocol"/>
     <w:p>
       <w:pPr>
         <w:pStyle w:val="Heading2"/>
       </w:pPr>
-      <w:r>
-        <w:rPr>
-          <w:rStyle w:val="SectionNumber"/>
-        </w:rPr>
-        <w:t>4.5</w:t>
-      </w:r>
-      <w:r>
-        <w:tab/>
-      </w:r>
       <w:r>
         <w:t>SERIAL WIRE PROTOCOL</w:t>
       </w:r>
@@ -9299,20 +8770,11 @@
         <w:t xml:space="preserve">, ending in a newline.</w:t>
       </w:r>
     </w:p>
-    <w:bookmarkStart w:id="65" w:name="framing-by-sentinel"/>
+    <w:bookmarkStart w:id="64" w:name="framing-by-sentinel"/>
     <w:p>
       <w:pPr>
         <w:pStyle w:val="Heading3"/>
       </w:pPr>
-      <w:r>
-        <w:rPr>
-          <w:rStyle w:val="SectionNumber"/>
-        </w:rPr>
-        <w:t xml:space="preserve">4.5.1</w:t>
-      </w:r>
-      <w:r>
-        <w:tab/>
-      </w:r>
       <w:r>
         <w:t xml:space="preserve">Framing by Sentinel</w:t>
       </w:r>
@@ -9340,48 +8802,30 @@
         <w:t xml:space="preserve">as counted noise and continues, which makes the protocol self-synchronising: it recovers at the next newline after any corruption, with a loss of at most one frame.</w:t>
       </w:r>
     </w:p>
+    <w:bookmarkEnd w:id="64"/>
+    <w:bookmarkStart w:id="65" w:name="error-detection"/>
+    <w:p>
+      <w:pPr>
+        <w:pStyle w:val="Heading3"/>
+      </w:pPr>
+      <w:r>
+        <w:t xml:space="preserve">Error Detection</w:t>
+      </w:r>
+    </w:p>
+    <w:p>
+      <w:pPr>
+        <w:pStyle w:val="FirstParagraph"/>
+      </w:pPr>
+      <w:r>
+        <w:t xml:space="preserve">The checksum is an 8-bit XOR over the body (a longitudinal redundancy check). It detects all single-bit errors, but it cannot detect an even number of bit errors in the same bit position, any reordering of bytes, or corruption of the sentinel and kind fields, which lie outside the body. Under a random-corruption model, 0.39% of corrupted frames would pass. A CRC-8 occupies the same eight bits and detects all bursts up to eight bits and byte transpositions, so it is recorded as the protocol’s clearest improvement. It was not adopted for the first bring-up because the XOR form is three lines of C and legible in a serial monitor.</w:t>
+      </w:r>
+    </w:p>
     <w:bookmarkEnd w:id="65"/>
-    <w:bookmarkStart w:id="66" w:name="error-detection"/>
+    <w:bookmarkStart w:id="66" w:name="channel-utilisation"/>
     <w:p>
       <w:pPr>
         <w:pStyle w:val="Heading3"/>
       </w:pPr>
-      <w:r>
-        <w:rPr>
-          <w:rStyle w:val="SectionNumber"/>
-        </w:rPr>
-        <w:t xml:space="preserve">4.5.2</w:t>
-      </w:r>
-      <w:r>
-        <w:tab/>
-      </w:r>
-      <w:r>
-        <w:t xml:space="preserve">Error Detection</w:t>
-      </w:r>
-    </w:p>
-    <w:p>
-      <w:pPr>
-        <w:pStyle w:val="FirstParagraph"/>
-      </w:pPr>
-      <w:r>
-        <w:t xml:space="preserve">The checksum is an 8-bit XOR over the body (a longitudinal redundancy check). It detects all single-bit errors, but it cannot detect an even number of bit errors in the same bit position, any reordering of bytes, or corruption of the sentinel and kind fields, which lie outside the body. Under a random-corruption model, 0.39% of corrupted frames would pass. A CRC-8 occupies the same eight bits and detects all bursts up to eight bits and byte transpositions, so it is recorded as the protocol’s clearest improvement. It was not adopted for the first bring-up because the XOR form is three lines of C and legible in a serial monitor.</w:t>
-      </w:r>
-    </w:p>
-    <w:bookmarkEnd w:id="66"/>
-    <w:bookmarkStart w:id="67" w:name="channel-utilisation"/>
-    <w:p>
-      <w:pPr>
-        <w:pStyle w:val="Heading3"/>
-      </w:pPr>
-      <w:r>
-        <w:rPr>
-          <w:rStyle w:val="SectionNumber"/>
-        </w:rPr>
-        <w:t xml:space="preserve">4.5.3</w:t>
-      </w:r>
-      <w:r>
-        <w:tab/>
-      </w:r>
       <w:r>
         <w:t xml:space="preserve">Channel Utilisation</w:t>
       </w:r>
@@ -9634,22 +9078,13 @@
         </w:tc>
       </w:tr>
     </w:tbl>
+    <w:bookmarkEnd w:id="66"/>
     <w:bookmarkEnd w:id="67"/>
-    <w:bookmarkEnd w:id="68"/>
-    <w:bookmarkStart w:id="69" w:name="refusal-gates"/>
+    <w:bookmarkStart w:id="68" w:name="refusal-gates"/>
     <w:p>
       <w:pPr>
         <w:pStyle w:val="Heading2"/>
       </w:pPr>
-      <w:r>
-        <w:rPr>
-          <w:rStyle w:val="SectionNumber"/>
-        </w:rPr>
-        <w:t>4.6</w:t>
-      </w:r>
-      <w:r>
-        <w:tab/>
-      </w:r>
       <w:r>
         <w:t>REFUSAL GATES</w:t>
       </w:r>
@@ -10148,39 +9583,21 @@
         <w:t xml:space="preserve">rather than clamp: an out-of-range value is evidence that the reading is not what the schema says it is (a disconnected thermistor floats, an unpowered INA219 reads zero), and clamping would produce a value that looks measured and is not. Second, some errors are not expressible per record, so the capture-level checks sit one level above the record-level ones. Refusing is also not the same as withholding everything: segmentation and coulomb counting do not divide by capacity, so the capture is measured and reported and only the behaviour scoring is withheld. The capacity gate was moved to the scoring stage after the first implementation discarded valid cycle measurements.</w:t>
       </w:r>
     </w:p>
-    <w:bookmarkEnd w:id="69"/>
-    <w:bookmarkStart w:id="77" w:name="hardware-bench-rig"/>
+    <w:bookmarkEnd w:id="68"/>
+    <w:bookmarkStart w:id="76" w:name="hardware-bench-rig"/>
     <w:p>
       <w:pPr>
         <w:pStyle w:val="Heading2"/>
       </w:pPr>
       <w:r>
-        <w:rPr>
-          <w:rStyle w:val="SectionNumber"/>
-        </w:rPr>
-        <w:t>4.7</w:t>
-      </w:r>
-      <w:r>
-        <w:tab/>
-      </w:r>
-      <w:r>
         <w:t>HARDWARE BENCH RIG</w:t>
       </w:r>
     </w:p>
-    <w:bookmarkStart w:id="70" w:name="requirement-and-design-calculations"/>
+    <w:bookmarkStart w:id="69" w:name="requirement-and-design-calculations"/>
     <w:p>
       <w:pPr>
         <w:pStyle w:val="Heading3"/>
       </w:pPr>
-      <w:r>
-        <w:rPr>
-          <w:rStyle w:val="SectionNumber"/>
-        </w:rPr>
-        <w:t xml:space="preserve">4.7.1</w:t>
-      </w:r>
-      <w:r>
-        <w:tab/>
-      </w:r>
       <w:r>
         <w:t xml:space="preserve">Requirement and Design Calculations</w:t>
       </w:r>
@@ -10714,21 +10131,12 @@
         <w:t xml:space="preserve">The error budget carries the component errors through to capacity. Combining the INA219 gain error (about 0.5%), the shunt tolerance (1%) and shunt self-heating (about 0.2%) in quadrature gives about 1.14% of reading, and because capacity is the integral of current, a gain error on current is a gain error on capacity. The expected capacity accuracy is about 1.2%, dominated by the shunt tolerance, against the 5% acceptance criterion. A 0.1% shunt would roughly halve it. Offset and timing contribute negligibly. These are datasheet-based design figures, and measurement against a reference meter has not been done.</w:t>
       </w:r>
     </w:p>
-    <w:bookmarkEnd w:id="70"/>
-    <w:bookmarkStart w:id="74" w:name="as-built-rig"/>
+    <w:bookmarkEnd w:id="69"/>
+    <w:bookmarkStart w:id="73" w:name="as-built-rig"/>
     <w:p>
       <w:pPr>
         <w:pStyle w:val="Heading3"/>
       </w:pPr>
-      <w:r>
-        <w:rPr>
-          <w:rStyle w:val="SectionNumber"/>
-        </w:rPr>
-        <w:t xml:space="preserve">4.7.2</w:t>
-      </w:r>
-      <w:r>
-        <w:tab/>
-      </w:r>
       <w:r>
         <w:t xml:space="preserve">As-Built Rig</w:t>
       </w:r>
@@ -11109,18 +10517,18 @@
           <wp:inline>
             <wp:extent cx="4937760" cy="1083625"/>
             <wp:effectExtent b="0" l="0" r="0" t="0"/>
-            <wp:docPr descr="" title="" id="72" name="Picture"/>
+            <wp:docPr descr="" title="" id="71" name="Picture"/>
             <a:graphic>
               <a:graphicData uri="http://schemas.openxmlformats.org/drawingml/2006/picture">
                 <pic:pic>
                   <pic:nvPicPr>
-                    <pic:cNvPr descr="fig/t3.png" id="73" name="Picture"/>
+                    <pic:cNvPr descr="fig/t3.png" id="72" name="Picture"/>
                     <pic:cNvPicPr>
                       <a:picLocks noChangeArrowheads="1" noChangeAspect="1"/>
                     </pic:cNvPicPr>
                   </pic:nvPicPr>
                   <pic:blipFill>
-                    <a:blip r:embed="rId71"/>
+                    <a:blip r:embed="rId70"/>
                     <a:stretch>
                       <a:fillRect/>
                     </a:stretch>
@@ -11163,21 +10571,12 @@
         <w:t xml:space="preserve">Protection must be in hardware in series with the cell, never in the monitoring firmware, because a firmware hang must not leave the cell unprotected. The monitoring electronics are powered from USB, not from the cell. The design power budget is about 48 mA typical against 500 mA available from USB, and the firmware keeps the radios disabled, not to save power but because transmit current spikes can brown out a weakly supplied board, which would restart the time base.</w:t>
       </w:r>
     </w:p>
-    <w:bookmarkEnd w:id="74"/>
-    <w:bookmarkStart w:id="75" w:name="firmware"/>
+    <w:bookmarkEnd w:id="73"/>
+    <w:bookmarkStart w:id="74" w:name="firmware"/>
     <w:p>
       <w:pPr>
         <w:pStyle w:val="Heading3"/>
       </w:pPr>
-      <w:r>
-        <w:rPr>
-          <w:rStyle w:val="SectionNumber"/>
-        </w:rPr>
-        <w:t xml:space="preserve">4.7.3</w:t>
-      </w:r>
-      <w:r>
-        <w:tab/>
-      </w:r>
       <w:r>
         <w:t xml:space="preserve">Firmware</w:t>
       </w:r>
@@ -11501,21 +10900,12 @@
         </w:tc>
       </w:tr>
     </w:tbl>
-    <w:bookmarkEnd w:id="75"/>
-    <w:bookmarkStart w:id="76" w:name="bring-up-procedure"/>
+    <w:bookmarkEnd w:id="74"/>
+    <w:bookmarkStart w:id="75" w:name="bring-up-procedure"/>
     <w:p>
       <w:pPr>
         <w:pStyle w:val="Heading3"/>
       </w:pPr>
-      <w:r>
-        <w:rPr>
-          <w:rStyle w:val="SectionNumber"/>
-        </w:rPr>
-        <w:t xml:space="preserve">4.7.4</w:t>
-      </w:r>
-      <w:r>
-        <w:tab/>
-      </w:r>
       <w:r>
         <w:t xml:space="preserve">Bring-Up Procedure</w:t>
       </w:r>
@@ -11551,22 +10941,13 @@
         <w:t xml:space="preserve">A bare board can produce a full report: the stub firmware’s synthetic profile scores as complete cycles, so a rig with no sensors attached yields a health index and a remaining life that look like success. The records are well formed and in range, so the software cannot detect this, and the only defence is procedural: any hardware claim must state which of the four read functions were real. The captured file from a board with no sensors is kept in the repository as a labelled counter-example.</w:t>
       </w:r>
     </w:p>
+    <w:bookmarkEnd w:id="75"/>
     <w:bookmarkEnd w:id="76"/>
-    <w:bookmarkEnd w:id="77"/>
-    <w:bookmarkStart w:id="84" w:name="Xfd48512d5f70e04d50df1141f37bb841ce2dac8"/>
+    <w:bookmarkStart w:id="83" w:name="Xfd48512d5f70e04d50df1141f37bb841ce2dac8"/>
     <w:p>
       <w:pPr>
         <w:pStyle w:val="Heading2"/>
       </w:pPr>
-      <w:r>
-        <w:rPr>
-          <w:rStyle w:val="SectionNumber"/>
-        </w:rPr>
-        <w:t>4.8</w:t>
-      </w:r>
-      <w:r>
-        <w:tab/>
-      </w:r>
       <w:r>
         <w:t>SERVICE TIER: REST API, GATEWAY AND DASHBOARD</w:t>
       </w:r>
@@ -11869,7 +11250,7 @@
       <w:pPr>
         <w:numPr>
           <w:ilvl w:val="0"/>
-          <w:numId w:val="1012"/>
+          <w:numId w:val="1011"/>
         </w:numPr>
       </w:pPr>
       <w:r>
@@ -11886,7 +11267,7 @@
       <w:pPr>
         <w:numPr>
           <w:ilvl w:val="0"/>
-          <w:numId w:val="1012"/>
+          <w:numId w:val="1011"/>
         </w:numPr>
       </w:pPr>
       <w:r>
@@ -11903,7 +11284,7 @@
       <w:pPr>
         <w:numPr>
           <w:ilvl w:val="0"/>
-          <w:numId w:val="1012"/>
+          <w:numId w:val="1011"/>
         </w:numPr>
       </w:pPr>
       <w:r>
@@ -11935,7 +11316,7 @@
       <w:pPr>
         <w:numPr>
           <w:ilvl w:val="0"/>
-          <w:numId w:val="1012"/>
+          <w:numId w:val="1011"/>
         </w:numPr>
       </w:pPr>
       <w:r>
@@ -11996,18 +11377,18 @@
           <wp:inline>
             <wp:extent cx="4937760" cy="4238244"/>
             <wp:effectExtent b="0" l="0" r="0" t="0"/>
-            <wp:docPr descr="" title="" id="79" name="Picture"/>
+            <wp:docPr descr="" title="" id="78" name="Picture"/>
             <a:graphic>
               <a:graphicData uri="http://schemas.openxmlformats.org/drawingml/2006/picture">
                 <pic:pic>
                   <pic:nvPicPr>
-                    <pic:cNvPr descr="images/ui_overview.png" id="80" name="Picture"/>
+                    <pic:cNvPr descr="images/ui_overview.png" id="79" name="Picture"/>
                     <pic:cNvPicPr>
                       <a:picLocks noChangeArrowheads="1" noChangeAspect="1"/>
                     </pic:cNvPicPr>
                   </pic:nvPicPr>
                   <pic:blipFill>
-                    <a:blip r:embed="rId78"/>
+                    <a:blip r:embed="rId77"/>
                     <a:stretch>
                       <a:fillRect/>
                     </a:stretch>
@@ -12051,18 +11432,18 @@
           <wp:inline>
             <wp:extent cx="4937760" cy="3915917"/>
             <wp:effectExtent b="0" l="0" r="0" t="0"/>
-            <wp:docPr descr="" title="" id="82" name="Picture"/>
+            <wp:docPr descr="" title="" id="81" name="Picture"/>
             <a:graphic>
               <a:graphicData uri="http://schemas.openxmlformats.org/drawingml/2006/picture">
                 <pic:pic>
                   <pic:nvPicPr>
-                    <pic:cNvPr descr="images/ui_health.png" id="83" name="Picture"/>
+                    <pic:cNvPr descr="images/ui_health.png" id="82" name="Picture"/>
                     <pic:cNvPicPr>
                       <a:picLocks noChangeArrowheads="1" noChangeAspect="1"/>
                     </pic:cNvPicPr>
                   </pic:nvPicPr>
                   <pic:blipFill>
-                    <a:blip r:embed="rId81"/>
+                    <a:blip r:embed="rId80"/>
                     <a:stretch>
                       <a:fillRect/>
                     </a:stretch>
@@ -12105,48 +11486,30 @@
         <w:t xml:space="preserve">There are two deliberate absences. There is no database: the fleet store is in memory, and adding a database to the compose file would imply a persistence layer that does not exist, so the compose file says so. Persistence is the next substantial piece of work.</w:t>
       </w:r>
     </w:p>
+    <w:bookmarkEnd w:id="83"/>
+    <w:bookmarkStart w:id="84" w:name="health-report-card"/>
+    <w:p>
+      <w:pPr>
+        <w:pStyle w:val="Heading2"/>
+      </w:pPr>
+      <w:r>
+        <w:t>HEALTH REPORT CARD</w:t>
+      </w:r>
+    </w:p>
+    <w:p>
+      <w:pPr>
+        <w:pStyle w:val="FirstParagraph"/>
+      </w:pPr>
+      <w:r>
+        <w:t xml:space="preserve">The health report script renders the outputs as a plain-language card for one battery, in five parts: how healthy it is, how long it has left, what the usage is doing to it, what to do, and what the report cannot tell. Every figure carries its validation error band, which is taken from a file of measured bands and pinned by a test, and each output is labelled measured, estimate or heuristic. When ground truth exists, the card is followed by a check against the laboratory, which the card itself was not shown. Section 5.11 reports a worked example.</w:t>
+      </w:r>
+    </w:p>
     <w:bookmarkEnd w:id="84"/>
-    <w:bookmarkStart w:id="85" w:name="health-report-card"/>
+    <w:bookmarkStart w:id="85" w:name="X4ad724ce4bc60d3d774effce658d43aa469ce9a"/>
     <w:p>
       <w:pPr>
         <w:pStyle w:val="Heading2"/>
       </w:pPr>
-      <w:r>
-        <w:rPr>
-          <w:rStyle w:val="SectionNumber"/>
-        </w:rPr>
-        <w:t>4.9</w:t>
-      </w:r>
-      <w:r>
-        <w:tab/>
-      </w:r>
-      <w:r>
-        <w:t>HEALTH REPORT CARD</w:t>
-      </w:r>
-    </w:p>
-    <w:p>
-      <w:pPr>
-        <w:pStyle w:val="FirstParagraph"/>
-      </w:pPr>
-      <w:r>
-        <w:t xml:space="preserve">The health report script renders the outputs as a plain-language card for one battery, in five parts: how healthy it is, how long it has left, what the usage is doing to it, what to do, and what the report cannot tell. Every figure carries its validation error band, which is taken from a file of measured bands and pinned by a test, and each output is labelled measured, estimate or heuristic. When ground truth exists, the card is followed by a check against the laboratory, which the card itself was not shown. Section 5.11 reports a worked example.</w:t>
-      </w:r>
-    </w:p>
-    <w:bookmarkEnd w:id="85"/>
-    <w:bookmarkStart w:id="86" w:name="X4ad724ce4bc60d3d774effce658d43aa469ce9a"/>
-    <w:p>
-      <w:pPr>
-        <w:pStyle w:val="Heading2"/>
-      </w:pPr>
-      <w:r>
-        <w:rPr>
-          <w:rStyle w:val="SectionNumber"/>
-        </w:rPr>
-        <w:t>4.10</w:t>
-      </w:r>
-      <w:r>
-        <w:tab/>
-      </w:r>
       <w:r>
         <w:t>TESTING, CONTINUOUS INTEGRATION AND REPRODUCIBILITY</w:t>
       </w:r>
@@ -12163,7 +11526,7 @@
       <w:pPr>
         <w:numPr>
           <w:ilvl w:val="0"/>
-          <w:numId w:val="1013"/>
+          <w:numId w:val="1012"/>
         </w:numPr>
       </w:pPr>
       <w:r>
@@ -12184,7 +11547,7 @@
       <w:pPr>
         <w:numPr>
           <w:ilvl w:val="0"/>
-          <w:numId w:val="1013"/>
+          <w:numId w:val="1012"/>
         </w:numPr>
       </w:pPr>
       <w:r>
@@ -12205,7 +11568,7 @@
       <w:pPr>
         <w:numPr>
           <w:ilvl w:val="0"/>
-          <w:numId w:val="1013"/>
+          <w:numId w:val="1012"/>
         </w:numPr>
       </w:pPr>
       <w:r>
@@ -12248,21 +11611,12 @@
         <w:t xml:space="preserve">is otherwise an untested claim. The Python-version matrix exists because testing only the newest version lets a declared floor rot silently.</w:t>
       </w:r>
     </w:p>
-    <w:bookmarkEnd w:id="86"/>
-    <w:bookmarkStart w:id="87" w:name="containerisation-and-deployment"/>
+    <w:bookmarkEnd w:id="85"/>
+    <w:bookmarkStart w:id="86" w:name="containerisation-and-deployment"/>
     <w:p>
       <w:pPr>
         <w:pStyle w:val="Heading2"/>
       </w:pPr>
-      <w:r>
-        <w:rPr>
-          <w:rStyle w:val="SectionNumber"/>
-        </w:rPr>
-        <w:t>4.11</w:t>
-      </w:r>
-      <w:r>
-        <w:tab/>
-      </w:r>
       <w:r>
         <w:t>CONTAINERISATION AND DEPLOYMENT</w:t>
       </w:r>
@@ -12314,21 +11668,12 @@
         <w:t xml:space="preserve">docker compose up                  # API, gateway, client</w:t>
       </w:r>
     </w:p>
-    <w:bookmarkEnd w:id="87"/>
-    <w:bookmarkStart w:id="88" w:name="chapter-summary"/>
+    <w:bookmarkEnd w:id="86"/>
+    <w:bookmarkStart w:id="87" w:name="chapter-summary"/>
     <w:p>
       <w:pPr>
         <w:pStyle w:val="Heading2"/>
       </w:pPr>
-      <w:r>
-        <w:rPr>
-          <w:rStyle w:val="SectionNumber"/>
-        </w:rPr>
-        <w:t>4.12</w:t>
-      </w:r>
-      <w:r>
-        <w:tab/>
-      </w:r>
       <w:r>
         <w:t>CHAPTER SUMMARY</w:t>
       </w:r>
@@ -12357,24 +11702,14 @@
         <w:t xml:space="preserve">is reported in the next chapter.</w:t>
       </w:r>
     </w:p>
+    <w:bookmarkEnd w:id="87"/>
     <w:bookmarkEnd w:id="88"/>
-    <w:bookmarkEnd w:id="89"/>
-    <w:bookmarkStart w:id="124" w:name="results-and-discussion"/>
+    <w:bookmarkStart w:id="123" w:name="results-and-discussion"/>
     <w:p>
       <w:pPr>
         <w:pStyle w:val="Heading1"/>
       </w:pPr>
       <w:r>
-        <w:rPr>
-          <w:b/>
-        </w:rPr>
-        <w:t>CHAPTER 5</w:t>
-        <w:br/>
-      </w:r>
-      <w:r>
-        <w:rPr>
-          <w:b/>
-        </w:rPr>
         <w:t>RESULTS AND DISCUSSION</w:t>
       </w:r>
     </w:p>
@@ -12386,20 +11721,11 @@
         <w:t xml:space="preserve">This chapter reports what the system measured and interprets each result where it appears. Every number is traced to a committed artifact (Appendix A). Errors are mean absolute errors in SOH (0.01 equals one percentage point) per cell, summarised as a median over cells with a 95% bootstrap interval that resamples cells, unless stated otherwise. Results that failed are reported alongside those that worked.</w:t>
       </w:r>
     </w:p>
-    <w:bookmarkStart w:id="93" w:name="X6a03b46872daed9e9da28c7cca3c0a630f99c80"/>
+    <w:bookmarkStart w:id="92" w:name="X6a03b46872daed9e9da28c7cca3c0a630f99c80"/>
     <w:p>
       <w:pPr>
         <w:pStyle w:val="Heading2"/>
       </w:pPr>
-      <w:r>
-        <w:rPr>
-          <w:rStyle w:val="SectionNumber"/>
-        </w:rPr>
-        <w:t>5.1</w:t>
-      </w:r>
-      <w:r>
-        <w:tab/>
-      </w:r>
       <w:r>
         <w:t>FITTED MODELS DO NOT SURVIVE A CHANGE OF PROTOCOL</w:t>
       </w:r>
@@ -13285,18 +12611,18 @@
           <wp:inline>
             <wp:extent cx="4937760" cy="2468880"/>
             <wp:effectExtent b="0" l="0" r="0" t="0"/>
-            <wp:docPr descr="" title="" id="91" name="Picture"/>
+            <wp:docPr descr="" title="" id="90" name="Picture"/>
             <a:graphic>
               <a:graphicData uri="http://schemas.openxmlformats.org/drawingml/2006/picture">
                 <pic:pic>
                   <pic:nvPicPr>
-                    <pic:cNvPr descr="images/bench_lobo_loco.png" id="92" name="Picture"/>
+                    <pic:cNvPr descr="images/bench_lobo_loco.png" id="91" name="Picture"/>
                     <pic:cNvPicPr>
                       <a:picLocks noChangeArrowheads="1" noChangeAspect="1"/>
                     </pic:cNvPicPr>
                   </pic:nvPicPr>
                   <pic:blipFill>
-                    <a:blip r:embed="rId90"/>
+                    <a:blip r:embed="rId89"/>
                     <a:stretch>
                       <a:fillRect/>
                     </a:stretch>
@@ -14220,21 +13546,12 @@
         <w:t xml:space="preserve">No fitted method retains reliable skill under a change of protocol, and no method can be distinguished from another. This is the result that motivates the rest of the project: the estimators that ship fit nothing across cells.</w:t>
       </w:r>
     </w:p>
-    <w:bookmarkEnd w:id="93"/>
-    <w:bookmarkStart w:id="100" w:name="field-soh-from-voltage-current-and-time"/>
+    <w:bookmarkEnd w:id="92"/>
+    <w:bookmarkStart w:id="99" w:name="field-soh-from-voltage-current-and-time"/>
     <w:p>
       <w:pPr>
         <w:pStyle w:val="Heading2"/>
       </w:pPr>
-      <w:r>
-        <w:rPr>
-          <w:rStyle w:val="SectionNumber"/>
-        </w:rPr>
-        <w:t>5.2</w:t>
-      </w:r>
-      <w:r>
-        <w:tab/>
-      </w:r>
       <w:r>
         <w:t>FIELD SOH FROM VOLTAGE, CURRENT AND TIME</w:t>
       </w:r>
@@ -14647,18 +13964,18 @@
           <wp:inline>
             <wp:extent cx="4937760" cy="3142210"/>
             <wp:effectExtent b="0" l="0" r="0" t="0"/>
-            <wp:docPr descr="" title="" id="95" name="Picture"/>
+            <wp:docPr descr="" title="" id="94" name="Picture"/>
             <a:graphic>
               <a:graphicData uri="http://schemas.openxmlformats.org/drawingml/2006/picture">
                 <pic:pic>
                   <pic:nvPicPr>
-                    <pic:cNvPr descr="images/results_soh_tracking.png" id="96" name="Picture"/>
+                    <pic:cNvPr descr="images/results_soh_tracking.png" id="95" name="Picture"/>
                     <pic:cNvPicPr>
                       <a:picLocks noChangeArrowheads="1" noChangeAspect="1"/>
                     </pic:cNvPicPr>
                   </pic:nvPicPr>
                   <pic:blipFill>
-                    <a:blip r:embed="rId94"/>
+                    <a:blip r:embed="rId93"/>
                     <a:stretch>
                       <a:fillRect/>
                     </a:stretch>
@@ -14702,18 +14019,18 @@
           <wp:inline>
             <wp:extent cx="4937760" cy="1975104"/>
             <wp:effectExtent b="0" l="0" r="0" t="0"/>
-            <wp:docPr descr="" title="" id="98" name="Picture"/>
+            <wp:docPr descr="" title="" id="97" name="Picture"/>
             <a:graphic>
               <a:graphicData uri="http://schemas.openxmlformats.org/drawingml/2006/picture">
                 <pic:pic>
                   <pic:nvPicPr>
-                    <pic:cNvPr descr="images/results_soh_per_cell.png" id="99" name="Picture"/>
+                    <pic:cNvPr descr="images/results_soh_per_cell.png" id="98" name="Picture"/>
                     <pic:cNvPicPr>
                       <a:picLocks noChangeArrowheads="1" noChangeAspect="1"/>
                     </pic:cNvPicPr>
                   </pic:nvPicPr>
                   <pic:blipFill>
-                    <a:blip r:embed="rId97"/>
+                    <a:blip r:embed="rId96"/>
                     <a:stretch>
                       <a:fillRect/>
                     </a:stretch>
@@ -14766,21 +14083,12 @@
         <w:t xml:space="preserve">Identifying resistance from the load step took the median error from 4.3% to 1.7% and the coverage from 12 to 17 cells, without any quantity the cycler computed. Two earlier figures were corrected downward by this work: an earlier 3.3% SOH figure and an 88% RUL figure had been scored against a reference capacity taken from each cell’s whole life, which uses the future and which no BMS can hold.</w:t>
       </w:r>
     </w:p>
-    <w:bookmarkEnd w:id="100"/>
-    <w:bookmarkStart w:id="101" w:name="partial-discharges"/>
+    <w:bookmarkEnd w:id="99"/>
+    <w:bookmarkStart w:id="100" w:name="partial-discharges"/>
     <w:p>
       <w:pPr>
         <w:pStyle w:val="Heading2"/>
       </w:pPr>
-      <w:r>
-        <w:rPr>
-          <w:rStyle w:val="SectionNumber"/>
-        </w:rPr>
-        <w:t>5.3</w:t>
-      </w:r>
-      <w:r>
-        <w:tab/>
-      </w:r>
       <w:r>
         <w:t>PARTIAL DISCHARGES</w:t>
       </w:r>
@@ -15266,48 +14574,30 @@
         <w:t xml:space="preserve">The refusal is physics and not a tuned cut. On the plateau, window charge tracks capacity, while on the knee voltage is set by resistance and diffusion, so it measures how hard the cell is working instead. The scope is two cells per band, which shows the mechanism and is too few to quote a population error.</w:t>
       </w:r>
     </w:p>
+    <w:bookmarkEnd w:id="100"/>
+    <w:bookmarkStart w:id="101" w:name="resistance-tracks-the-instrument"/>
+    <w:p>
+      <w:pPr>
+        <w:pStyle w:val="Heading2"/>
+      </w:pPr>
+      <w:r>
+        <w:t>RESISTANCE TRACKS THE INSTRUMENT</w:t>
+      </w:r>
+    </w:p>
+    <w:p>
+      <w:pPr>
+        <w:pStyle w:val="FirstParagraph"/>
+      </w:pPr>
+      <w:r>
+        <w:t xml:space="preserve">Against the cycler’s internal-resistance column over each cell’s life (20 cells carrying both values), the step resistance achieved a median Spearman correlation of 0.86, growth in the same direction on 19 of 20 cells, and a median growth of 1.26 times against the cycler’s 1.29 times. This includes the partial-cycling cells (0.90 and 0.98), and the exception is a Type 3 cell. The levels differ, since the step value includes early polarisation, but the trends agree, which is what a power-fade indicator requires.</w:t>
+      </w:r>
+    </w:p>
     <w:bookmarkEnd w:id="101"/>
-    <w:bookmarkStart w:id="102" w:name="resistance-tracks-the-instrument"/>
+    <w:bookmarkStart w:id="105" w:name="remaining-useful-life"/>
     <w:p>
       <w:pPr>
         <w:pStyle w:val="Heading2"/>
       </w:pPr>
-      <w:r>
-        <w:rPr>
-          <w:rStyle w:val="SectionNumber"/>
-        </w:rPr>
-        <w:t>5.4</w:t>
-      </w:r>
-      <w:r>
-        <w:tab/>
-      </w:r>
-      <w:r>
-        <w:t>RESISTANCE TRACKS THE INSTRUMENT</w:t>
-      </w:r>
-    </w:p>
-    <w:p>
-      <w:pPr>
-        <w:pStyle w:val="FirstParagraph"/>
-      </w:pPr>
-      <w:r>
-        <w:t xml:space="preserve">Against the cycler’s internal-resistance column over each cell’s life (20 cells carrying both values), the step resistance achieved a median Spearman correlation of 0.86, growth in the same direction on 19 of 20 cells, and a median growth of 1.26 times against the cycler’s 1.29 times. This includes the partial-cycling cells (0.90 and 0.98), and the exception is a Type 3 cell. The levels differ, since the step value includes early polarisation, but the trends agree, which is what a power-fade indicator requires.</w:t>
-      </w:r>
-    </w:p>
-    <w:bookmarkEnd w:id="102"/>
-    <w:bookmarkStart w:id="106" w:name="remaining-useful-life"/>
-    <w:p>
-      <w:pPr>
-        <w:pStyle w:val="Heading2"/>
-      </w:pPr>
-      <w:r>
-        <w:rPr>
-          <w:rStyle w:val="SectionNumber"/>
-        </w:rPr>
-        <w:t>5.5</w:t>
-      </w:r>
-      <w:r>
-        <w:tab/>
-      </w:r>
       <w:r>
         <w:t>REMAINING USEFUL LIFE</w:t>
       </w:r>
@@ -16064,18 +15354,18 @@
           <wp:inline>
             <wp:extent cx="4937760" cy="2064880"/>
             <wp:effectExtent b="0" l="0" r="0" t="0"/>
-            <wp:docPr descr="" title="" id="104" name="Picture"/>
+            <wp:docPr descr="" title="" id="103" name="Picture"/>
             <a:graphic>
               <a:graphicData uri="http://schemas.openxmlformats.org/drawingml/2006/picture">
                 <pic:pic>
                   <pic:nvPicPr>
-                    <pic:cNvPr descr="images/results_rul.png" id="105" name="Picture"/>
+                    <pic:cNvPr descr="images/results_rul.png" id="104" name="Picture"/>
                     <pic:cNvPicPr>
                       <a:picLocks noChangeArrowheads="1" noChangeAspect="1"/>
                     </pic:cNvPicPr>
                   </pic:nvPicPr>
                   <pic:blipFill>
-                    <a:blip r:embed="rId103"/>
+                    <a:blip r:embed="rId102"/>
                     <a:stretch>
                       <a:fillRect/>
                     </a:stretch>
@@ -16188,21 +15478,12 @@
         <w:t xml:space="preserve">20 cycles. The conventional 80% end-of-life threshold is not validated on CALCE, because its full-discharge trajectories end near 0.81 and only one cell of 22 crosses 0.80.</w:t>
       </w:r>
     </w:p>
-    <w:bookmarkEnd w:id="106"/>
-    <w:bookmarkStart w:id="107" w:name="rul-when-complete-discharges-are-rare"/>
+    <w:bookmarkEnd w:id="105"/>
+    <w:bookmarkStart w:id="106" w:name="rul-when-complete-discharges-are-rare"/>
     <w:p>
       <w:pPr>
         <w:pStyle w:val="Heading2"/>
       </w:pPr>
-      <w:r>
-        <w:rPr>
-          <w:rStyle w:val="SectionNumber"/>
-        </w:rPr>
-        <w:t>5.6</w:t>
-      </w:r>
-      <w:r>
-        <w:tab/>
-      </w:r>
       <w:r>
         <w:t>RUL WHEN COMPLETE DISCHARGES ARE RARE</w:t>
       </w:r>
@@ -16449,21 +15730,12 @@
         <w:t xml:space="preserve">The failure of the field-trajectory method has a clean cause. Near 0.90, field SOH reads a median 1.1 points below capacity (measured in a first pass of this study, not kept as a separate artifact). Because fade near the threshold is slow, that small bias moves the 0.90 crossing a median 56 cycles early. An SOH error that is acceptable as a health figure thus becomes large as a time to threshold. None of the four is reported, and the system refuses RUL for partial-only records and states that this was tested.</w:t>
       </w:r>
     </w:p>
-    <w:bookmarkEnd w:id="107"/>
-    <w:bookmarkStart w:id="108" w:name="when-the-evidence-suffices"/>
+    <w:bookmarkEnd w:id="106"/>
+    <w:bookmarkStart w:id="107" w:name="when-the-evidence-suffices"/>
     <w:p>
       <w:pPr>
         <w:pStyle w:val="Heading2"/>
       </w:pPr>
-      <w:r>
-        <w:rPr>
-          <w:rStyle w:val="SectionNumber"/>
-        </w:rPr>
-        <w:t>5.7</w:t>
-      </w:r>
-      <w:r>
-        <w:tab/>
-      </w:r>
       <w:r>
         <w:t>WHEN THE EVIDENCE SUFFICES</w:t>
       </w:r>
@@ -16885,21 +16157,12 @@
         <w:t xml:space="preserve">: in the study’s own scoring, larger references reduced error (one discharge 3.6%, five 2.0%, ten 1.3%), but on the field-study metric ten versus five changed the median only from 1.681% to 1.665%, so the estimator retains five.</w:t>
       </w:r>
     </w:p>
-    <w:bookmarkEnd w:id="108"/>
-    <w:bookmarkStart w:id="109" w:name="external-validation-on-a-second-dataset"/>
+    <w:bookmarkEnd w:id="107"/>
+    <w:bookmarkStart w:id="108" w:name="external-validation-on-a-second-dataset"/>
     <w:p>
       <w:pPr>
         <w:pStyle w:val="Heading2"/>
       </w:pPr>
-      <w:r>
-        <w:rPr>
-          <w:rStyle w:val="SectionNumber"/>
-        </w:rPr>
-        <w:t>5.8</w:t>
-      </w:r>
-      <w:r>
-        <w:tab/>
-      </w:r>
       <w:r>
         <w:t>EXTERNAL VALIDATION ON A SECOND DATASET</w:t>
       </w:r>
@@ -17310,21 +16573,12 @@
         <w:t xml:space="preserve">The Oxford trajectories cross the 80% convention, so the shipped RUL estimator was scored there unchanged. When it predicted fewer than 500 cycles to 80%, the cell lasted at least that long in 97% of cases (36 estimates, 5 cells). Precision is low: the median miss is 385 cycles against characterisations 100 cycles apart. The guarantee also weakens with distance, since predictions of 500 to 1,000 cycles were met or exceeded only 80% of the time (25 estimates, 5 cells).</w:t>
       </w:r>
     </w:p>
-    <w:bookmarkEnd w:id="109"/>
-    <w:bookmarkStart w:id="110" w:name="Xd3eceaa1d102af3c39ecdd10656f2d2a5d3468b"/>
+    <w:bookmarkEnd w:id="108"/>
+    <w:bookmarkStart w:id="109" w:name="Xd3eceaa1d102af3c39ecdd10656f2d2a5d3468b"/>
     <w:p>
       <w:pPr>
         <w:pStyle w:val="Heading2"/>
       </w:pPr>
-      <w:r>
-        <w:rPr>
-          <w:rStyle w:val="SectionNumber"/>
-        </w:rPr>
-        <w:t>5.9</w:t>
-      </w:r>
-      <w:r>
-        <w:tab/>
-      </w:r>
       <w:r>
         <w:t>A THIRD DATASET AND KNOWING WHEN TO REFUSE</w:t>
       </w:r>
@@ -17413,39 +16667,21 @@
         <w:t xml:space="preserve">For contrast, a gradient-boosted model on three window features, the setting where fitting looks best, reached 0.7% under leave-one-cell-out within Oxford and 1.2% within CALCE, but 6.7% when moved from Oxford to NASA and 5.5% from CALCE to Oxford. Validation inside one dataset overstated transferable accuracy four- to tenfold.</w:t>
       </w:r>
     </w:p>
-    <w:bookmarkEnd w:id="110"/>
-    <w:bookmarkStart w:id="120" w:name="system-and-hardware-results"/>
+    <w:bookmarkEnd w:id="109"/>
+    <w:bookmarkStart w:id="119" w:name="system-and-hardware-results"/>
     <w:p>
       <w:pPr>
         <w:pStyle w:val="Heading2"/>
       </w:pPr>
       <w:r>
-        <w:rPr>
-          <w:rStyle w:val="SectionNumber"/>
-        </w:rPr>
-        <w:t>5.10</w:t>
-      </w:r>
-      <w:r>
-        <w:tab/>
-      </w:r>
-      <w:r>
         <w:t>SYSTEM AND HARDWARE RESULTS</w:t>
       </w:r>
     </w:p>
-    <w:bookmarkStart w:id="117" w:name="bench-rig-captures"/>
+    <w:bookmarkStart w:id="116" w:name="bench-rig-captures"/>
     <w:p>
       <w:pPr>
         <w:pStyle w:val="Heading3"/>
       </w:pPr>
-      <w:r>
-        <w:rPr>
-          <w:rStyle w:val="SectionNumber"/>
-        </w:rPr>
-        <w:t xml:space="preserve">5.10.1</w:t>
-      </w:r>
-      <w:r>
-        <w:tab/>
-      </w:r>
       <w:r>
         <w:t xml:space="preserve">Bench Rig Captures</w:t>
       </w:r>
@@ -17931,18 +17167,18 @@
           <wp:inline>
             <wp:extent cx="4937760" cy="2606039"/>
             <wp:effectExtent b="0" l="0" r="0" t="0"/>
-            <wp:docPr descr="" title="" id="112" name="Picture"/>
+            <wp:docPr descr="" title="" id="111" name="Picture"/>
             <a:graphic>
               <a:graphicData uri="http://schemas.openxmlformats.org/drawingml/2006/picture">
                 <pic:pic>
                   <pic:nvPicPr>
-                    <pic:cNvPr descr="images/rig_capture.png" id="113" name="Picture"/>
+                    <pic:cNvPr descr="images/rig_capture.png" id="112" name="Picture"/>
                     <pic:cNvPicPr>
                       <a:picLocks noChangeArrowheads="1" noChangeAspect="1"/>
                     </pic:cNvPicPr>
                   </pic:nvPicPr>
                   <pic:blipFill>
-                    <a:blip r:embed="rId111"/>
+                    <a:blip r:embed="rId110"/>
                     <a:stretch>
                       <a:fillRect/>
                     </a:stretch>
@@ -18000,18 +17236,18 @@
           <wp:inline>
             <wp:extent cx="4937760" cy="3833621"/>
             <wp:effectExtent b="0" l="0" r="0" t="0"/>
-            <wp:docPr descr="" title="" id="115" name="Picture"/>
+            <wp:docPr descr="" title="" id="114" name="Picture"/>
             <a:graphic>
               <a:graphicData uri="http://schemas.openxmlformats.org/drawingml/2006/picture">
                 <pic:pic>
                   <pic:nvPicPr>
-                    <pic:cNvPr descr="images/ui_evidence.png" id="116" name="Picture"/>
+                    <pic:cNvPr descr="images/ui_evidence.png" id="115" name="Picture"/>
                     <pic:cNvPicPr>
                       <a:picLocks noChangeArrowheads="1" noChangeAspect="1"/>
                     </pic:cNvPicPr>
                   </pic:nvPicPr>
                   <pic:blipFill>
-                    <a:blip r:embed="rId114"/>
+                    <a:blip r:embed="rId113"/>
                     <a:stretch>
                       <a:fillRect/>
                     </a:stretch>
@@ -18046,48 +17282,30 @@
         <w:t xml:space="preserve">Figure 5.6: Evidence view of the BEACON dashboard for the bench rig: 83 of 83 records accepted, voltage and current as measured, temperature reported as not supplied, and the health index, remaining life and state of health refused because coverage is incomplete.</w:t>
       </w:r>
     </w:p>
+    <w:bookmarkEnd w:id="116"/>
+    <w:bookmarkStart w:id="117" w:name="fault-injection"/>
+    <w:p>
+      <w:pPr>
+        <w:pStyle w:val="Heading3"/>
+      </w:pPr>
+      <w:r>
+        <w:t xml:space="preserve">Fault Injection</w:t>
+      </w:r>
+    </w:p>
+    <w:p>
+      <w:pPr>
+        <w:pStyle w:val="FirstParagraph"/>
+      </w:pPr>
+      <w:r>
+        <w:t xml:space="preserve">Faults injected into a real capture behaved as designed: a corrupted byte failed its checksum, a NaN field was rejected, a reversed timestamp refused the capture, and a missing sensor was refused by name. The injection also exposed one defect, since corrected: a 999 V reading passed the field range, which is wide so that packs are admissible. Records outside 0–5 V are now rejected when the source declares a single cell.</w:t>
+      </w:r>
+    </w:p>
     <w:bookmarkEnd w:id="117"/>
-    <w:bookmarkStart w:id="118" w:name="fault-injection"/>
+    <w:bookmarkStart w:id="118" w:name="Xa02a71f04cbfbaee63c846a057c53165dabfc4c"/>
     <w:p>
       <w:pPr>
         <w:pStyle w:val="Heading3"/>
       </w:pPr>
-      <w:r>
-        <w:rPr>
-          <w:rStyle w:val="SectionNumber"/>
-        </w:rPr>
-        <w:t xml:space="preserve">5.10.2</w:t>
-      </w:r>
-      <w:r>
-        <w:tab/>
-      </w:r>
-      <w:r>
-        <w:t xml:space="preserve">Fault Injection</w:t>
-      </w:r>
-    </w:p>
-    <w:p>
-      <w:pPr>
-        <w:pStyle w:val="FirstParagraph"/>
-      </w:pPr>
-      <w:r>
-        <w:t xml:space="preserve">Faults injected into a real capture behaved as designed: a corrupted byte failed its checksum, a NaN field was rejected, a reversed timestamp refused the capture, and a missing sensor was refused by name. The injection also exposed one defect, since corrected: a 999 V reading passed the field range, which is wide so that packs are admissible. Records outside 0–5 V are now rejected when the source declares a single cell.</w:t>
-      </w:r>
-    </w:p>
-    <w:bookmarkEnd w:id="118"/>
-    <w:bookmarkStart w:id="119" w:name="Xa02a71f04cbfbaee63c846a057c53165dabfc4c"/>
-    <w:p>
-      <w:pPr>
-        <w:pStyle w:val="Heading3"/>
-      </w:pPr>
-      <w:r>
-        <w:rPr>
-          <w:rStyle w:val="SectionNumber"/>
-        </w:rPr>
-        <w:t xml:space="preserve">5.10.3</w:t>
-      </w:r>
-      <w:r>
-        <w:tab/>
-      </w:r>
       <w:r>
         <w:t xml:space="preserve">What the Hardware Result Does and Does Not Show</w:t>
       </w:r>
@@ -18116,22 +17334,13 @@
         <w:t xml:space="preserve">a validation of the health, RUL or risk models, which were fitted on cycled research cells and cannot be confirmed or refuted by a cell that was never cycled. Sensor accuracy against a reference meter was not measured, and no discharge has yet been recorded on the rig.</w:t>
       </w:r>
     </w:p>
+    <w:bookmarkEnd w:id="118"/>
     <w:bookmarkEnd w:id="119"/>
-    <w:bookmarkEnd w:id="120"/>
-    <w:bookmarkStart w:id="121" w:name="a-worked-example-the-report-card"/>
+    <w:bookmarkStart w:id="120" w:name="a-worked-example-the-report-card"/>
     <w:p>
       <w:pPr>
         <w:pStyle w:val="Heading2"/>
       </w:pPr>
-      <w:r>
-        <w:rPr>
-          <w:rStyle w:val="SectionNumber"/>
-        </w:rPr>
-        <w:t>5.11</w:t>
-      </w:r>
-      <w:r>
-        <w:tab/>
-      </w:r>
       <w:r>
         <w:t>A WORKED EXAMPLE: THE REPORT CARD</w:t>
       </w:r>
@@ -18451,21 +17660,12 @@
         <w:t xml:space="preserve">cycles at 50–100 cycles out), and it is the reason the card prints its own accuracy beside the number and not the number alone. Only temperature is offered as a usage finding, because it is the one behaviour-to-ageing link that survived testing, in direction only.</w:t>
       </w:r>
     </w:p>
-    <w:bookmarkEnd w:id="121"/>
-    <w:bookmarkStart w:id="122" w:name="discussion"/>
+    <w:bookmarkEnd w:id="120"/>
+    <w:bookmarkStart w:id="121" w:name="discussion"/>
     <w:p>
       <w:pPr>
         <w:pStyle w:val="Heading2"/>
       </w:pPr>
-      <w:r>
-        <w:rPr>
-          <w:rStyle w:val="SectionNumber"/>
-        </w:rPr>
-        <w:t>5.12</w:t>
-      </w:r>
-      <w:r>
-        <w:tab/>
-      </w:r>
       <w:r>
         <w:t>DISCUSSION</w:t>
       </w:r>
@@ -18594,7 +17794,7 @@
       <w:pPr>
         <w:numPr>
           <w:ilvl w:val="0"/>
-          <w:numId w:val="1014"/>
+          <w:numId w:val="1013"/>
         </w:numPr>
       </w:pPr>
       <w:r>
@@ -18635,7 +17835,7 @@
       <w:pPr>
         <w:numPr>
           <w:ilvl w:val="0"/>
-          <w:numId w:val="1014"/>
+          <w:numId w:val="1013"/>
         </w:numPr>
       </w:pPr>
       <w:r>
@@ -18656,7 +17856,7 @@
       <w:pPr>
         <w:numPr>
           <w:ilvl w:val="0"/>
-          <w:numId w:val="1014"/>
+          <w:numId w:val="1013"/>
         </w:numPr>
       </w:pPr>
       <w:r>
@@ -18671,7 +17871,7 @@
       <w:pPr>
         <w:numPr>
           <w:ilvl w:val="0"/>
-          <w:numId w:val="1014"/>
+          <w:numId w:val="1013"/>
         </w:numPr>
       </w:pPr>
       <w:r>
@@ -18692,7 +17892,7 @@
       <w:pPr>
         <w:numPr>
           <w:ilvl w:val="0"/>
-          <w:numId w:val="1014"/>
+          <w:numId w:val="1013"/>
         </w:numPr>
       </w:pPr>
       <w:r>
@@ -18713,7 +17913,7 @@
       <w:pPr>
         <w:numPr>
           <w:ilvl w:val="0"/>
-          <w:numId w:val="1014"/>
+          <w:numId w:val="1013"/>
         </w:numPr>
       </w:pPr>
       <w:r>
@@ -18730,21 +17930,12 @@
         <w:t xml:space="preserve">has yet been recorded on the bench rig, and the heuristic risk layer is not validated.</w:t>
       </w:r>
     </w:p>
-    <w:bookmarkEnd w:id="122"/>
-    <w:bookmarkStart w:id="123" w:name="validation-summary"/>
+    <w:bookmarkEnd w:id="121"/>
+    <w:bookmarkStart w:id="122" w:name="validation-summary"/>
     <w:p>
       <w:pPr>
         <w:pStyle w:val="Heading2"/>
       </w:pPr>
-      <w:r>
-        <w:rPr>
-          <w:rStyle w:val="SectionNumber"/>
-        </w:rPr>
-        <w:t>5.13</w:t>
-      </w:r>
-      <w:r>
-        <w:tab/>
-      </w:r>
       <w:r>
         <w:t>VALIDATION SUMMARY</w:t>
       </w:r>
@@ -19628,24 +18819,14 @@
         </w:tc>
       </w:tr>
     </w:tbl>
+    <w:bookmarkEnd w:id="122"/>
     <w:bookmarkEnd w:id="123"/>
-    <w:bookmarkEnd w:id="124"/>
-    <w:bookmarkStart w:id="127" w:name="conclusion-and-future-work"/>
+    <w:bookmarkStart w:id="126" w:name="conclusion-and-future-work"/>
     <w:p>
       <w:pPr>
         <w:pStyle w:val="Heading1"/>
       </w:pPr>
       <w:r>
-        <w:rPr>
-          <w:b/>
-        </w:rPr>
-        <w:t>CHAPTER 6</w:t>
-        <w:br/>
-      </w:r>
-      <w:r>
-        <w:rPr>
-          <w:b/>
-        </w:rPr>
         <w:t>CONCLUSION AND FUTURE WORK</w:t>
       </w:r>
     </w:p>
@@ -19723,21 +18904,12 @@
         <w:t xml:space="preserve">Each output therefore carries a measured error band and is withheld when its evidence is missing or inconsistent, and the criterion that makes that decision was itself validated against laboratory truth.</w:t>
       </w:r>
     </w:p>
-    <w:bookmarkStart w:id="125" w:name="limitations"/>
+    <w:bookmarkStart w:id="124" w:name="limitations"/>
     <w:p>
       <w:pPr>
         <w:pStyle w:val="Heading2"/>
       </w:pPr>
       <w:r>
-        <w:rPr>
-          <w:rStyle w:val="SectionNumber"/>
-        </w:rPr>
-        <w:t>6.1</w:t>
-      </w:r>
-      <w:r>
-        <w:tab/>
-      </w:r>
-      <w:r>
         <w:t>LIMITATIONS</w:t>
       </w:r>
     </w:p>
@@ -19749,21 +18921,12 @@
         <w:t xml:space="preserve">The scope is single cells: LCO for development, an NMC/LCO blend pouch for external validation, mostly at constant current, with one real drive-cycle discharge. Packs, lithium iron phosphate and temperature-dependent capacity correction are not covered. The conventional 80% end-of-life threshold is not validated on CALCE, and the Oxford results at 80% are a conservative bound with low precision. The heuristic risk layer is not validated against measured degradation. The bench rig has been run on one cell, at rest, for under 90 s, and its two sensors have not yet operated in the same capture.</w:t>
       </w:r>
     </w:p>
-    <w:bookmarkEnd w:id="125"/>
-    <w:bookmarkStart w:id="126" w:name="future-work"/>
+    <w:bookmarkEnd w:id="124"/>
+    <w:bookmarkStart w:id="125" w:name="future-work"/>
     <w:p>
       <w:pPr>
         <w:pStyle w:val="Heading2"/>
       </w:pPr>
-      <w:r>
-        <w:rPr>
-          <w:rStyle w:val="SectionNumber"/>
-        </w:rPr>
-        <w:t>6.2</w:t>
-      </w:r>
-      <w:r>
-        <w:tab/>
-      </w:r>
       <w:r>
         <w:t>FUTURE WORK</w:t>
       </w:r>
@@ -19780,7 +18943,7 @@
       <w:pPr>
         <w:numPr>
           <w:ilvl w:val="0"/>
-          <w:numId w:val="1015"/>
+          <w:numId w:val="1014"/>
         </w:numPr>
       </w:pPr>
       <w:r>
@@ -19801,7 +18964,7 @@
       <w:pPr>
         <w:numPr>
           <w:ilvl w:val="0"/>
-          <w:numId w:val="1015"/>
+          <w:numId w:val="1014"/>
         </w:numPr>
       </w:pPr>
       <w:r>
@@ -19822,7 +18985,7 @@
       <w:pPr>
         <w:numPr>
           <w:ilvl w:val="0"/>
-          <w:numId w:val="1015"/>
+          <w:numId w:val="1014"/>
         </w:numPr>
       </w:pPr>
       <w:r>
@@ -19843,7 +19006,7 @@
       <w:pPr>
         <w:numPr>
           <w:ilvl w:val="0"/>
-          <w:numId w:val="1015"/>
+          <w:numId w:val="1014"/>
         </w:numPr>
       </w:pPr>
       <w:r>
@@ -19864,7 +19027,7 @@
       <w:pPr>
         <w:numPr>
           <w:ilvl w:val="0"/>
-          <w:numId w:val="1015"/>
+          <w:numId w:val="1014"/>
         </w:numPr>
       </w:pPr>
       <w:r>
@@ -19885,7 +19048,7 @@
       <w:pPr>
         <w:numPr>
           <w:ilvl w:val="0"/>
-          <w:numId w:val="1015"/>
+          <w:numId w:val="1014"/>
         </w:numPr>
       </w:pPr>
       <w:r>
@@ -19902,9 +19065,9 @@
         <w:t xml:space="preserve">Add a database behind the fleet store, structured logging and metrics, a load-test harness, and asynchronous serial ingest with backpressure.</w:t>
       </w:r>
     </w:p>
+    <w:bookmarkEnd w:id="125"/>
     <w:bookmarkEnd w:id="126"/>
-    <w:bookmarkEnd w:id="127"/>
-    <w:bookmarkStart w:id="128" w:name="appendix-a"/>
+    <w:bookmarkStart w:id="127" w:name="appendix-a"/>
     <w:p>
       <w:pPr>
         <w:pStyle w:val="Heading1"/>
@@ -20803,8 +19966,8 @@
         </w:tc>
       </w:tr>
     </w:tbl>
-    <w:bookmarkEnd w:id="128"/>
-    <w:bookmarkStart w:id="130" w:name="appendix-b"/>
+    <w:bookmarkEnd w:id="127"/>
+    <w:bookmarkStart w:id="129" w:name="appendix-b"/>
     <w:p>
       <w:pPr>
         <w:pStyle w:val="Heading1"/>
@@ -20835,7 +19998,7 @@
       <w:r>
         <w:t xml:space="preserve"> </w:t>
       </w:r>
-      <w:hyperlink r:id="rId129">
+      <w:hyperlink r:id="rId128">
         <w:r>
           <w:rPr>
             <w:rStyle w:val="Hyperlink"/>
@@ -20980,8 +20143,8 @@
         <w:t xml:space="preserve">The raw CALCE and NASA data are not redistributed, and download locations are given in the repository.</w:t>
       </w:r>
     </w:p>
-    <w:bookmarkEnd w:id="130"/>
-    <w:bookmarkStart w:id="131" w:name="references"/>
+    <w:bookmarkEnd w:id="129"/>
+    <w:bookmarkStart w:id="130" w:name="references"/>
     <w:p>
       <w:pPr>
         <w:pStyle w:val="Heading1"/>
@@ -21694,7 +20857,7 @@
         <w:t xml:space="preserve">Ph.D. dissertation, Dept. Eng. Sci., Univ. Oxford, Oxford, U.K., 2017.</w:t>
       </w:r>
     </w:p>
-    <w:bookmarkEnd w:id="131"/>
+    <w:bookmarkEnd w:id="130"/>
     <w:sectPr>
       <w:footerReference w:type="default" r:id="rId11"/>
       <w:pgSz w:w="11906" w:h="16838"/>
@@ -22023,6 +21186,9 @@
     </w:lvlOverride>
   </w:num>
   <w:num w:numId="1003">
+    <w:abstractNumId w:val="991"/>
+  </w:num>
+  <w:num w:numId="1004">
     <w:abstractNumId w:val="99201"/>
     <w:lvlOverride w:ilvl="0">
       <w:startOverride w:val="1"/>
@@ -22052,10 +21218,10 @@
       <w:startOverride w:val="1"/>
     </w:lvlOverride>
   </w:num>
-  <w:num w:numId="1004">
+  <w:num w:numId="1005">
     <w:abstractNumId w:val="991"/>
   </w:num>
-  <w:num w:numId="1005">
+  <w:num w:numId="1006">
     <w:abstractNumId w:val="99201"/>
     <w:lvlOverride w:ilvl="0">
       <w:startOverride w:val="1"/>
@@ -22085,38 +21251,8 @@
       <w:startOverride w:val="1"/>
     </w:lvlOverride>
   </w:num>
-  <w:num w:numId="1006">
+  <w:num w:numId="1007">
     <w:abstractNumId w:val="991"/>
-  </w:num>
-  <w:num w:numId="1007">
-    <w:abstractNumId w:val="99201"/>
-    <w:lvlOverride w:ilvl="0">
-      <w:startOverride w:val="1"/>
-    </w:lvlOverride>
-    <w:lvlOverride w:ilvl="1">
-      <w:startOverride w:val="1"/>
-    </w:lvlOverride>
-    <w:lvlOverride w:ilvl="2">
-      <w:startOverride w:val="1"/>
-    </w:lvlOverride>
-    <w:lvlOverride w:ilvl="3">
-      <w:startOverride w:val="1"/>
-    </w:lvlOverride>
-    <w:lvlOverride w:ilvl="4">
-      <w:startOverride w:val="1"/>
-    </w:lvlOverride>
-    <w:lvlOverride w:ilvl="5">
-      <w:startOverride w:val="1"/>
-    </w:lvlOverride>
-    <w:lvlOverride w:ilvl="6">
-      <w:startOverride w:val="1"/>
-    </w:lvlOverride>
-    <w:lvlOverride w:ilvl="7">
-      <w:startOverride w:val="1"/>
-    </w:lvlOverride>
-    <w:lvlOverride w:ilvl="8">
-      <w:startOverride w:val="1"/>
-    </w:lvlOverride>
   </w:num>
   <w:num w:numId="1008">
     <w:abstractNumId w:val="991"/>
@@ -22137,9 +21273,6 @@
     <w:abstractNumId w:val="991"/>
   </w:num>
   <w:num w:numId="1014">
-    <w:abstractNumId w:val="991"/>
-  </w:num>
-  <w:num w:numId="1015">
     <w:abstractNumId w:val="99201"/>
     <w:lvlOverride w:ilvl="0">
       <w:startOverride w:val="1"/>

</xml_diff>

<commit_message>
Report: supervisor designation under 'Under the guidance of'
Co-Authored-By: Claude Sonnet 5.5 <noreply@anthropic.com>
Claude-Session: https://claude.ai/code/session_01XSGpBmyyfwNpi7tuzVvNqh
</commit_message>
<xml_diff>
--- a/report/BEACON_Project_Report.docx
+++ b/report/BEACON_Project_Report.docx
@@ -164,7 +164,7 @@
     </w:p>
     <w:p>
       <w:pPr>
-        <w:spacing w:after="160" w:before="0" w:line="276" w:lineRule="auto"/>
+        <w:spacing w:after="0" w:before="0" w:line="276" w:lineRule="auto"/>
         <w:ind w:firstLine="0"/>
         <w:jc w:val="center"/>
       </w:pPr>
@@ -176,6 +176,22 @@
           <w:sz w:val="24"/>
         </w:rPr>
         <w:t>DR. M GAYATHRI</w:t>
+      </w:r>
+    </w:p>
+    <w:p>
+      <w:pPr>
+        <w:spacing w:after="160" w:before="0" w:line="276" w:lineRule="auto"/>
+        <w:ind w:firstLine="0"/>
+        <w:jc w:val="center"/>
+      </w:pPr>
+      <w:r>
+        <w:rPr>
+          <w:rFonts w:ascii="Times New Roman" w:hAnsi="Times New Roman"/>
+          <w:b w:val="0"/>
+          <w:i w:val="0"/>
+          <w:sz w:val="24"/>
+        </w:rPr>
+        <w:t>Assistant Professor</w:t>
       </w:r>
     </w:p>
     <w:p>

</xml_diff>

<commit_message>
Report: correct claims found in audit against repo; fix compose gateway env var
Co-Authored-By: Claude Sonnet 5.5 <noreply@anthropic.com>
Claude-Session: https://claude.ai/code/session_01XSGpBmyyfwNpi7tuzVvNqh
</commit_message>
<xml_diff>
--- a/report/BEACON_Project_Report.docx
+++ b/report/BEACON_Project_Report.docx
@@ -1030,7 +1030,7 @@
           <w:i w:val="0"/>
           <w:sz w:val="24"/>
         </w:rPr>
-        <w:t>A battery management system (BMS) measures terminal voltage, current and temperature, but whether software above it can turn these into a trustworthy state of health (SOH) and remaining useful life (RUL) is usually answered by fitting a model. This project builds BEACON, a three-tier telemetry and health-monitoring system, and tests that question with measured evidence. BEACON ingests data from a CAN bus, a USB serial bench rig or research datasets, converges all three on one schema, and scores them through one shared pipeline that is served over a REST API to a React dashboard. On 31 NASA cells in nine protocol cohorts, twelve published methods all lost skill under leave-one-cohort-out validation, so the system's two working estimators fit nothing across cells. SOH is the ratio of charge delivered within a fixed voltage window to the same quantity on the cell's own first discharges, with ohmic sag corrected by a resistance identified from the voltage step at each load onset. From voltage, current and time alone, on 22 CALCE lithium cobalt oxide cells, the median per-cell error was 1.7% (95% CI 1.4–4.3%) on 17 cells, with five refused for stated causes, and the step resistance tracked the cycler's resistance on 19 of 20 cells. Unchanged, the estimator measured all eight cells of an independent Oxford dataset at 3.0% median error. RUL extrapolated from each cell's own fade was within ±20 cycles 73% of the time in the last 25 cycles before 90% capacity. The system refuses to output a number it cannot justify: every output is validated, banded by its measured error, or refused with a reason. A bench rig built on a NodeMCU ESP8266 with an INA219 and an LM35 streamed 83 of 83 checksummed frames at a measured 1.000 s cadence, which validates data acquisition but not health estimation.</w:t>
+        <w:t>A battery management system (BMS) measures terminal voltage, current and temperature, but whether software above it can turn these into a trustworthy state of health (SOH) and remaining useful life (RUL) is usually answered by fitting a model. This project builds BEACON, a three-tier telemetry and health-monitoring system, and tests that question with measured evidence. BEACON ingests data from a CAN bus, a USB serial bench rig or research datasets, converges all three on one schema, and scores them through one shared pipeline that is served over a REST API to a React dashboard. On 31 NASA cells in nine protocol cohorts, eleven of twelve methods (all but a mean-only baseline) lost skill under leave-one-cohort-out validation, so the system's two working estimators fit nothing across cells. SOH is the ratio of charge delivered within a fixed voltage window to the same quantity on the cell's own first discharges, with ohmic sag corrected by a resistance identified from the voltage step at each load onset. From voltage, current and time alone, on 22 CALCE lithium cobalt oxide cells, the median per-cell error was 1.7% (95% CI 1.4–4.3%) on 17 cells, with five refused for stated causes, and the step resistance tracked the cycler's resistance on 19 of 20 cells. Unchanged, the estimator measured all eight cells of an independent Oxford dataset at 3.0% median error. RUL extrapolated from each cell's own fade was within ±20 cycles 73% of the time in the last 25 cycles before 90% capacity. The system refuses to output a number it cannot justify: every output is validated, banded by its measured error, or refused with a reason. A bench rig built on a NodeMCU ESP8266 with an INA219 and an LM35 streamed 83 of 83 checksummed frames at a measured 1.000 s cadence, which validates data acquisition but not health estimation.</w:t>
       </w:r>
     </w:p>
     <w:p>
@@ -2031,7 +2031,7 @@
         <w:pStyle w:val="BodyText"/>
       </w:pPr>
       <w:r>
-        <w:t xml:space="preserve">A deployed BMS faces a harder question: the next battery comes from conditions the training set never contained. This project began as a battery-degradation study built on fitted models, and measured that question directly. On a benchmark of 31 NASA cells in nine protocol cohorts, every one of twelve published methods lost skill when the held-out unit changed from a cell to a whole protocol cohort, and no method could be distinguished from another (Chapter 5). That negative result is the motivation for what follows: if models fitted across cells do not transfer, a health layer for a vehicle has to be built from estimators that fit nothing across cells, and from a pipeline that is honest about when it does not know.</w:t>
+        <w:t xml:space="preserve">A deployed BMS faces a harder question: the next battery comes from conditions the training set never contained. This project began as a battery-degradation study built on fitted models, and measured that question directly. On a benchmark of 31 NASA cells in nine protocol cohorts, eleven of twelve methods lost skill, and the twelfth, a mean-only baseline, could not when the held-out unit changed from a cell to a whole protocol cohort, and no method could be distinguished from another (Chapter 5). That negative result is the motivation for what follows: if models fitted across cells do not transfer, a health layer for a vehicle has to be built from estimators that fit nothing across cells, and from a pipeline that is honest about when it does not know.</w:t>
       </w:r>
     </w:p>
     <w:p>
@@ -2569,7 +2569,7 @@
         <w:t xml:space="preserve"> </w:t>
       </w:r>
       <w:r>
-        <w:t xml:space="preserve">matters. It may be the rated capacity from the data sheet or the capacity measured on the cell’s own first discharges. The two give different numbers for the same cell, and this report states which is used wherever a figure is quoted. A battery is conventionally regarded as having reached end of life when SOH falls to 80%.</w:t>
+        <w:t xml:space="preserve">matters. It may be the rated capacity from the data sheet or the capacity measured on the cell’s own first discharges. The two give different numbers for the same cell, and this report states which is used wherever a figure is quoted. A battery is conventionally regarded as having reached end of life when SOH falls to 80%. The RUL estimator of this project uses a default threshold of 90%, because the CALCE trajectories rarely reach 80% within the recorded life, and reports the 80% case separately where the data allow it.</w:t>
       </w:r>
     </w:p>
     <w:bookmarkEnd w:id="25"/>
@@ -6355,7 +6355,7 @@
               <w:rPr>
                 <w:sz w:val="20"/>
               </w:rPr>
-              <w:t xml:space="preserve">1 HONGLI 18650 cell, at rest, under 90 s per capture</w:t>
+              <w:t xml:space="preserve">1 HONGLI 18650 cell, at rest in the two real captures (83 and 85 records)</w:t>
             </w:r>
           </w:p>
         </w:tc>
@@ -7237,7 +7237,7 @@
         <w:pStyle w:val="FirstParagraph"/>
       </w:pPr>
       <w:r>
-        <w:t xml:space="preserve">After conversion the validator checks that the required columns exist and are not entirely empty, that numeric columns can be converted to numbers, that state of charge and state of health lie between 0 and 100 when present, that voltage, capacity and resistance are not negative, and that either a cycle or a timestamp exists. A frame that fails these checks is reported with the reason, and is not scored. This is the point at which a source that lacks a required channel is stopped, as when a CAN message carries current and state of charge but no voltage or temperature.</w:t>
+        <w:t xml:space="preserve">After conversion the validator checks that the required columns exist and are not entirely empty, that numeric columns can be converted to numbers, that state of charge and state of health lie between 0 and 100 when present, that voltage, capacity and resistance are not negative, and that either a cycle or a timestamp exists. The validator reports each failure with its reason. For the CAN and serial paths, the stop for a missing channel is a separate signal-coverage check, which compares the channels a source provides with the channels the estimators need and refuses the run by name, as when a CAN message carries current and state of charge but no voltage or temperature. The serial frames do not carry a dataset name, so the required-column rule applies to the dataset loaders and not to the live telemetry paths.</w:t>
       </w:r>
     </w:p>
     <w:bookmarkEnd w:id="64"/>
@@ -7256,7 +7256,19 @@
         <w:pStyle w:val="FirstParagraph"/>
       </w:pPr>
       <w:r>
-        <w:t xml:space="preserve">For every source the processing follows the same eight steps, in the same order, in the same function.</w:t>
+        <w:t xml:space="preserve">Every source follows the same eight steps in the same order. The CAN and serial paths run them through the single function</w:t>
+      </w:r>
+      <w:r>
+        <w:t xml:space="preserve"> </w:t>
+      </w:r>
+      <w:r>
+        <w:rPr>
+          <w:rStyle w:val="VerbatimChar"/>
+        </w:rPr>
+        <w:t xml:space="preserve">score_telemetry_frame</w:t>
+      </w:r>
+      <w:r>
+        <w:t xml:space="preserve">, and the dataset studies run the same estimators through the study scripts and the batch pipeline.</w:t>
       </w:r>
     </w:p>
     <w:p>
@@ -7493,7 +7505,7 @@
         <w:t xml:space="preserve"> </w:t>
       </w:r>
       <w:r>
-        <w:t xml:space="preserve">and time. The cycler’s capacity, resistance and cycle summaries are removed before scoring. Current is segmented into charge, discharge and rest phases using a dead band (0.02 A for CALCE, where rest is logged as exactly zero) and a minimum run length. The charge delivered on discharge</w:t>
+        <w:t xml:space="preserve">and time. The cycler’s capacity, resistance and cycle summaries are removed before scoring. Current is segmented into charge, discharge and rest phases using a dead band (0.02 A in the CALCE studies, where rest is logged as exactly zero, and 0.5 A as the default of the live telemetry path) and a minimum run length. The charge delivered on discharge</w:t>
       </w:r>
       <w:r>
         <w:t xml:space="preserve"> </w:t>
@@ -8374,7 +8386,7 @@
         <w:t xml:space="preserve"> </w:t>
       </w:r>
       <w:r>
-        <w:t xml:space="preserve">resistance: the ohmic drop plus polarisation accrued by the first loaded sample. On cell CS2_35 it is about 0.165 </w:t>
+        <w:t xml:space="preserve">resistance: the ohmic drop plus polarisation accrued by the first loaded sample. On cell CS2_35 its starting value is about 0.141 </w:t>
       </w:r>
       <m:oMath>
         <m:r>
@@ -8385,7 +8397,7 @@
         <w:t xml:space="preserve"> </w:t>
       </w:r>
       <w:r>
-        <w:t xml:space="preserve">against the cycler’s about 0.099 </w:t>
+        <w:t xml:space="preserve">against the cycler’s about 0.089 </w:t>
       </w:r>
       <m:oMath>
         <m:r>
@@ -8393,7 +8405,10 @@
         </m:r>
       </m:oMath>
       <w:r>
-        <w:t xml:space="preserve">. Each discharge uses the trailing median</w:t>
+        <w:t xml:space="preserve"> </w:t>
+      </w:r>
+      <w:r>
+        <w:t xml:space="preserve">(reports/metrics/calce_resistance). Each discharge uses the trailing median</w:t>
       </w:r>
       <w:r>
         <w:t xml:space="preserve"> </w:t>
@@ -10267,7 +10282,7 @@
         <w:t xml:space="preserve"> </w:t>
       </w:r>
       <w:r>
-        <w:t xml:space="preserve">validated against measured degradation. The Spearman correlation between the risk score and measured fade on a separate set of 33 NASA cells was</w:t>
+        <w:t xml:space="preserve">validated against measured degradation. The Spearman correlation between the risk score and measured fade on a separate set of 33 NASA cells from the earlier health-index ranking was</w:t>
       </w:r>
       <w:r>
         <w:t xml:space="preserve"> </w:t>
@@ -10349,7 +10364,7 @@
         <w:pStyle w:val="FirstParagraph"/>
       </w:pPr>
       <w:r>
-        <w:t xml:space="preserve">Fourteen architecture decision records document the choices made during the project, with the context, the decision and its status. Table 3.6 lists them. Several record a claim that was withdrawn after a later measurement, and that history is kept in the repository and not rewritten.</w:t>
+        <w:t xml:space="preserve">Fourteen architecture decision records document the choices made during the project, with the context, the decision and its status; the table gives a short title for each. Table 3.6 lists them. Several record a claim that was withdrawn after a later measurement, and that history is kept in the repository and not rewritten.</w:t>
       </w:r>
     </w:p>
     <w:p>
@@ -10824,7 +10839,7 @@
               <w:rPr>
                 <w:sz w:val="20"/>
               </w:rPr>
-              <w:t xml:space="preserve">An absolute SOH target on CALCE recovers four cells</w:t>
+              <w:t xml:space="preserve">An absolute SOH target on CALCE recovers four cells and refutes the claim that learned models add enormously</w:t>
             </w:r>
           </w:p>
         </w:tc>
@@ -10997,6 +11012,15 @@
         <w:rPr>
           <w:rStyle w:val="VerbatimChar"/>
         </w:rPr>
+        <w:t xml:space="preserve">        if truncated / implausible / reference too short:  refuse n</w:t>
+      </w:r>
+      <w:r>
+        <w:br/>
+      </w:r>
+      <w:r>
+        <w:rPr>
+          <w:rStyle w:val="VerbatimChar"/>
+        </w:rPr>
         <w:t xml:space="preserve">        Q(n)  &lt;- charge delivered inside window (coulomb count)</w:t>
       </w:r>
       <w:r>
@@ -11015,7 +11039,34 @@
         <w:rPr>
           <w:rStyle w:val="VerbatimChar"/>
         </w:rPr>
-        <w:t xml:space="preserve">    fade   &lt;- trend of SOH(n) over the cell's own cycles</w:t>
+        <w:t xml:space="preserve">    if enough complete discharges (30):</w:t>
+      </w:r>
+      <w:r>
+        <w:br/>
+      </w:r>
+      <w:r>
+        <w:rPr>
+          <w:rStyle w:val="VerbatimChar"/>
+        </w:rPr>
+        <w:t xml:space="preserve">        RUL &lt;- cycles until fade of complete-discharge capacity</w:t>
+      </w:r>
+      <w:r>
+        <w:br/>
+      </w:r>
+      <w:r>
+        <w:rPr>
+          <w:rStyle w:val="VerbatimChar"/>
+        </w:rPr>
+        <w:t xml:space="preserve">               crosses the EOL threshold (90 % default)</w:t>
+      </w:r>
+      <w:r>
+        <w:br/>
+      </w:r>
+      <w:r>
+        <w:rPr>
+          <w:rStyle w:val="VerbatimChar"/>
+        </w:rPr>
+        <w:t xml:space="preserve">    else:  refuse RUL</w:t>
       </w:r>
       <w:r>
         <w:br/>
@@ -11033,15 +11084,6 @@
         <w:rPr>
           <w:rStyle w:val="VerbatimChar"/>
         </w:rPr>
-        <w:t xml:space="preserve">    RUL    &lt;- cycles until fade crosses EOL threshold</w:t>
-      </w:r>
-      <w:r>
-        <w:br/>
-      </w:r>
-      <w:r>
-        <w:rPr>
-          <w:rStyle w:val="VerbatimChar"/>
-        </w:rPr>
         <w:t xml:space="preserve">    return SOH, R, RUL, confidence, band, refusals</w:t>
       </w:r>
     </w:p>
@@ -11050,7 +11092,7 @@
         <w:pStyle w:val="FirstParagraph"/>
       </w:pPr>
       <w:r>
-        <w:t xml:space="preserve">The reference</w:t>
+        <w:t xml:space="preserve">Remaining life is taken from the capacity of complete discharges only: extrapolating the windowed health of partial discharges was tested and is not accurate enough to report (Chapter 5). The reference</w:t>
       </w:r>
       <w:r>
         <w:t xml:space="preserve"> </w:t>
@@ -11465,7 +11507,7 @@
               <w:rPr>
                 <w:sz w:val="20"/>
               </w:rPr>
-              <w:t xml:space="preserve">Rest or charge current threshold</w:t>
+              <w:t xml:space="preserve">Rest threshold of mode inference</w:t>
             </w:r>
           </w:p>
         </w:tc>
@@ -11505,7 +11547,7 @@
               <w:rPr>
                 <w:sz w:val="20"/>
               </w:rPr>
-              <w:t xml:space="preserve">Mode inference</w:t>
+              <w:t xml:space="preserve">Schema-level operating mode</w:t>
             </w:r>
           </w:p>
         </w:tc>
@@ -11573,39 +11615,39 @@
               <w:rPr>
                 <w:sz w:val="20"/>
               </w:rPr>
-              <w:t xml:space="preserve">End-of-life threshold</w:t>
-            </w:r>
-          </w:p>
-        </w:tc>
-        <w:tc>
-          <w:tcPr/>
-          <w:p>
-            <w:pPr>
-              <w:pStyle w:val="Compact"/>
-              <w:spacing w:after="40" w:line="240" w:lineRule="auto"/>
-              <w:jc w:val="left"/>
-            </w:pPr>
-            <w:r>
-              <w:rPr>
-                <w:sz w:val="20"/>
-              </w:rPr>
-              <w:t xml:space="preserve">80%</w:t>
-            </w:r>
-          </w:p>
-        </w:tc>
-        <w:tc>
-          <w:tcPr/>
-          <w:p>
-            <w:pPr>
-              <w:pStyle w:val="Compact"/>
-              <w:spacing w:after="40" w:line="240" w:lineRule="auto"/>
-              <w:jc w:val="left"/>
-            </w:pPr>
-            <w:r>
-              <w:rPr>
-                <w:sz w:val="20"/>
-              </w:rPr>
-              <w:t xml:space="preserve">Conventional RUL target</w:t>
+              <w:t xml:space="preserve">Default end-of-life threshold</w:t>
+            </w:r>
+          </w:p>
+        </w:tc>
+        <w:tc>
+          <w:tcPr/>
+          <w:p>
+            <w:pPr>
+              <w:pStyle w:val="Compact"/>
+              <w:spacing w:after="40" w:line="240" w:lineRule="auto"/>
+              <w:jc w:val="left"/>
+            </w:pPr>
+            <w:r>
+              <w:rPr>
+                <w:sz w:val="20"/>
+              </w:rPr>
+              <w:t xml:space="preserve">90%</w:t>
+            </w:r>
+          </w:p>
+        </w:tc>
+        <w:tc>
+          <w:tcPr/>
+          <w:p>
+            <w:pPr>
+              <w:pStyle w:val="Compact"/>
+              <w:spacing w:after="40" w:line="240" w:lineRule="auto"/>
+              <w:jc w:val="left"/>
+            </w:pPr>
+            <w:r>
+              <w:rPr>
+                <w:sz w:val="20"/>
+              </w:rPr>
+              <w:t xml:space="preserve">RUL target (80% is the convention but is seldom reached on CALCE)</w:t>
             </w:r>
           </w:p>
         </w:tc>
@@ -12614,7 +12656,20 @@
               <w:rPr>
                 <w:sz w:val="20"/>
               </w:rPr>
-              <w:t xml:space="preserve">Dataset loaders (NASA, CALCE, Oxford), DBC examples, unified schema</w:t>
+              <w:t xml:space="preserve">Dataset loaders (NASA, CALCE, Oxford) and DBC examples; the unified schema is in</w:t>
+            </w:r>
+            <w:r>
+              <w:rPr>
+                <w:sz w:val="20"/>
+              </w:rPr>
+              <w:t xml:space="preserve"> </w:t>
+            </w:r>
+            <w:r>
+              <w:rPr>
+                <w:rStyle w:val="VerbatimChar"/>
+                <w:sz w:val="20"/>
+              </w:rPr>
+              <w:t xml:space="preserve">preprocessing</w:t>
             </w:r>
           </w:p>
         </w:tc>
@@ -12722,7 +12777,7 @@
               <w:rPr>
                 <w:sz w:val="20"/>
               </w:rPr>
-              <w:t xml:space="preserve">Rule-based risk score, aging budget and health index (heuristic layer)</w:t>
+              <w:t xml:space="preserve">Rule-based risk and health index (heuristic layer); measured field SOH, voltage-window, evidence and error-band estimators</w:t>
             </w:r>
           </w:p>
         </w:tc>
@@ -12757,7 +12812,7 @@
               <w:rPr>
                 <w:sz w:val="20"/>
               </w:rPr>
-              <w:t xml:space="preserve">Fade-extrapolation remaining useful life</w:t>
+              <w:t xml:space="preserve">Fade-extrapolation remaining useful life, and the earlier heuristic estimate</w:t>
             </w:r>
           </w:p>
         </w:tc>
@@ -13483,7 +13538,22 @@
         <w:pStyle w:val="FirstParagraph"/>
       </w:pPr>
       <w:r>
-        <w:t xml:space="preserve">The adapter proves the pattern, a CAN frame becomes decoded signals and then a unified frame, against real vehicle protocol data. It does not prove broad coverage of manufacturers. Most vehicles supported by community projects are decoded by hand-written code and not by a portable DBC file, and manufacturer files are proprietary. The documented message carries current and state of charge but no voltage or temperature, so the validator correctly reports that it cannot be scored on its own. Reading a live bus would be the task of a separate library layered under the decoder and has not been built.</w:t>
+        <w:t xml:space="preserve">The adapter proves the pattern, a CAN frame becomes decoded signals and then a unified frame, against real vehicle protocol data. It does not prove broad coverage of manufacturers. Most vehicles supported by community projects are decoded by hand-written code and not by a portable DBC file, and manufacturer files are proprietary. The documented message carries current and state of charge but no voltage or temperature, so the validator correctly reports that it cannot be scored on its own. Reading a live bus is implemented as a separate source built on the</w:t>
+      </w:r>
+      <w:r>
+        <w:t xml:space="preserve"> </w:t>
+      </w:r>
+      <w:r>
+        <w:rPr>
+          <w:rStyle w:val="VerbatimChar"/>
+        </w:rPr>
+        <w:t xml:space="preserve">python-can</w:t>
+      </w:r>
+      <w:r>
+        <w:t xml:space="preserve"> </w:t>
+      </w:r>
+      <w:r>
+        <w:t xml:space="preserve">library, layered under the decoder and exposed through a live-capture route, but it has not been exercised on a physical vehicle.</w:t>
       </w:r>
     </w:p>
     <w:bookmarkEnd w:id="93"/>
@@ -14221,7 +14291,7 @@
               <w:rPr>
                 <w:sz w:val="20"/>
               </w:rPr>
-              <w:t xml:space="preserve">A rig reporting discharge as positive yields no discharge phases and no SOH while appearing to stream perfectly.</w:t>
+              <w:t xml:space="preserve">A rig reporting discharge as positive is flagged as a likely cause; the run is refused because no complete discharge is found, although the stream looks perfect.</w:t>
             </w:r>
           </w:p>
         </w:tc>
@@ -15512,7 +15582,7 @@
         <w:t xml:space="preserve"> </w:t>
       </w:r>
       <w:r>
-        <w:t xml:space="preserve">only the channels it can actually supply, together with the rated capacity. The host then scores the channels present and refuses the rest by name. The sketch compiles for three targets on every push (Table 4.7), and a test compares its declared field set, as a set, against the schema.</w:t>
+        <w:t xml:space="preserve">only the channels it can actually supply, together with the rated capacity. The host then scores the channels present and refuses the rest by name. The sketch compiles for three targets on every push (Table 4.7); the continuous-integration build is the stub configuration without the sensor libraries, and a test compares its declared field set, as a set, against the schema.</w:t>
       </w:r>
     </w:p>
     <w:p>
@@ -16220,7 +16290,25 @@
         <w:pStyle w:val="BodyText"/>
       </w:pPr>
       <w:r>
-        <w:t xml:space="preserve">The React client is a single-surface dashboard. It shows the fleet of batteries with health, risk and remaining life for each, a battery detail view, a digital-twin sheet with the twin state and its transitions, and a banner stating where the run’s data came from. An earlier version had separate tabs for fleet, CAN replay, thermal and transfer views. They were removed because two parallel dashboards meant two provenance banners that could disagree about the same run. A Guardian explanation is shown next to the run it explains, and refusals are rendered as results and not as errors.</w:t>
+        <w:t xml:space="preserve">The React client is a single-surface dashboard. It shows the fleet of batteries with health, risk and remaining life for each, a battery detail view, a bench-rig panel, a digital-twin sheet, and a banner stating where the run’s data came from. An earlier version had separate tabs for fleet, CAN replay, thermal and transfer views. They were removed because two parallel dashboards meant two provenance banners that could disagree about the same run. The twin sheet is present but displays</w:t>
+      </w:r>
+      <w:r>
+        <w:t xml:space="preserve"> </w:t>
+      </w:r>
+      <w:r>
+        <w:t xml:space="preserve">“</w:t>
+      </w:r>
+      <w:r>
+        <w:t xml:space="preserve">not available</w:t>
+      </w:r>
+      <w:r>
+        <w:t xml:space="preserve">”</w:t>
+      </w:r>
+      <w:r>
+        <w:t xml:space="preserve"> </w:t>
+      </w:r>
+      <w:r>
+        <w:t xml:space="preserve">for the observed and predicted state, because the twin module does not yet emit its state into the dashboard payload, and no substitute trajectory is drawn. A Guardian explanation is shown next to the run it explains, and refusals are rendered as results and not as errors.</w:t>
       </w:r>
     </w:p>
     <w:p>
@@ -16413,7 +16501,7 @@
         <w:pStyle w:val="FirstParagraph"/>
       </w:pPr>
       <w:r>
-        <w:t xml:space="preserve">Table 4.9 lists the routes of the Python service, grouped by purpose. The interactive documentation generated by FastAPI from the same code is served at</w:t>
+        <w:t xml:space="preserve">Table 4.9 lists the principal routes of the Python service. Further routes cover live CAN capture, serial emulation, live serial capture, latest and live state, thermal and twin views, transfer feasibility and the dataset listing. The interactive documentation generated by FastAPI from the same code is served at</w:t>
       </w:r>
       <w:r>
         <w:t xml:space="preserve"> </w:t>
@@ -16433,7 +16521,7 @@
         <w:pStyle w:val="TableCaption"/>
       </w:pPr>
       <w:r>
-        <w:t xml:space="preserve">Table 4.9: Routes of the Python Service</w:t>
+        <w:t xml:space="preserve">Table 4.9: Principal Routes of the Python Service</w:t>
       </w:r>
     </w:p>
     <w:tbl>
@@ -16442,7 +16530,7 @@
         <w:tblW w:type="pct" w:w="4000"/>
         <w:tblLook w:firstRow="1" w:lastRow="0" w:firstColumn="0" w:lastColumn="0" w:noHBand="0" w:noVBand="0" w:val="0020"/>
         <w:jc w:val="start"/>
-        <w:tblCaption w:val="Table 4.9: Routes of the Python Service"/>
+        <w:tblCaption w:val="Table 4.9: Principal Routes of the Python Service"/>
         <w:tblBorders>
           <w:top w:val="single" w:sz="4" w:color="000000"/>
           <w:left w:val="single" w:sz="4" w:color="000000"/>
@@ -17119,7 +17207,7 @@
         <w:pStyle w:val="FirstParagraph"/>
       </w:pPr>
       <w:r>
-        <w:t xml:space="preserve">The dashboard is a React application made of small components, each with one view. Table 4.11 lists them. The panels that display a measured result carry the provenance of the value, so a reader can tell whether a figure comes from a vehicle, a rig, a dataset or a simulation.</w:t>
+        <w:t xml:space="preserve">The dashboard is a React application with one surface, rendered from the pipeline output. Table 4.11 lists its views. (The repository also keeps earlier per-panel components that the current surface no longer uses.) The panels that display a measured result carry the provenance of the value, so a reader can tell whether a figure comes from a vehicle, a rig, a dataset or a simulation.</w:t>
       </w:r>
     </w:p>
     <w:p>
@@ -17127,7 +17215,7 @@
         <w:pStyle w:val="TableCaption"/>
       </w:pPr>
       <w:r>
-        <w:t xml:space="preserve">Table 4.11: Components of the Dashboard</w:t>
+        <w:t xml:space="preserve">Table 4.11: Views of the Dashboard</w:t>
       </w:r>
     </w:p>
     <w:tbl>
@@ -17136,7 +17224,7 @@
         <w:tblW w:type="pct" w:w="3700"/>
         <w:tblLook w:firstRow="1" w:lastRow="0" w:firstColumn="0" w:lastColumn="0" w:noHBand="0" w:noVBand="0" w:val="0020"/>
         <w:jc w:val="start"/>
-        <w:tblCaption w:val="Table 4.11: Components of the Dashboard"/>
+        <w:tblCaption w:val="Table 4.11: Views of the Dashboard"/>
         <w:tblBorders>
           <w:top w:val="single" w:sz="4" w:color="000000"/>
           <w:left w:val="single" w:sz="4" w:color="000000"/>
@@ -17168,7 +17256,7 @@
                 <w:b/>
                 <w:sz w:val="20"/>
               </w:rPr>
-              <w:t xml:space="preserve">Component</w:t>
+              <w:t xml:space="preserve">View</w:t>
             </w:r>
           </w:p>
         </w:tc>
@@ -17186,7 +17274,7 @@
                 <w:b/>
                 <w:sz w:val="20"/>
               </w:rPr>
-              <w:t xml:space="preserve">View</w:t>
+              <w:t xml:space="preserve">Content</w:t>
             </w:r>
           </w:p>
         </w:tc>
@@ -17204,23 +17292,23 @@
               <w:rPr>
                 <w:sz w:val="20"/>
               </w:rPr>
-              <w:t xml:space="preserve">Fleet table</w:t>
-            </w:r>
-          </w:p>
-        </w:tc>
-        <w:tc>
-          <w:tcPr/>
-          <w:p>
-            <w:pPr>
-              <w:pStyle w:val="Compact"/>
-              <w:spacing w:after="40" w:line="240" w:lineRule="auto"/>
-              <w:jc w:val="left"/>
-            </w:pPr>
-            <w:r>
-              <w:rPr>
-                <w:sz w:val="20"/>
-              </w:rPr>
-              <w:t xml:space="preserve">Health, risk and remaining life of every battery</w:t>
+              <w:t xml:space="preserve">Fleet risk distribution</w:t>
+            </w:r>
+          </w:p>
+        </w:tc>
+        <w:tc>
+          <w:tcPr/>
+          <w:p>
+            <w:pPr>
+              <w:pStyle w:val="Compact"/>
+              <w:spacing w:after="40" w:line="240" w:lineRule="auto"/>
+              <w:jc w:val="left"/>
+            </w:pPr>
+            <w:r>
+              <w:rPr>
+                <w:sz w:val="20"/>
+              </w:rPr>
+              <w:t xml:space="preserve">Risk category of every battery</w:t>
             </w:r>
           </w:p>
         </w:tc>
@@ -17238,23 +17326,23 @@
               <w:rPr>
                 <w:sz w:val="20"/>
               </w:rPr>
-              <w:t xml:space="preserve">Battery detail</w:t>
-            </w:r>
-          </w:p>
-        </w:tc>
-        <w:tc>
-          <w:tcPr/>
-          <w:p>
-            <w:pPr>
-              <w:pStyle w:val="Compact"/>
-              <w:spacing w:after="40" w:line="240" w:lineRule="auto"/>
-              <w:jc w:val="left"/>
-            </w:pPr>
-            <w:r>
-              <w:rPr>
-                <w:sz w:val="20"/>
-              </w:rPr>
-              <w:t xml:space="preserve">Health over cycles and attribution of the health index</w:t>
+              <w:t xml:space="preserve">Behaviour flag incidence</w:t>
+            </w:r>
+          </w:p>
+        </w:tc>
+        <w:tc>
+          <w:tcPr/>
+          <w:p>
+            <w:pPr>
+              <w:pStyle w:val="Compact"/>
+              <w:spacing w:after="40" w:line="240" w:lineRule="auto"/>
+              <w:jc w:val="left"/>
+            </w:pPr>
+            <w:r>
+              <w:rPr>
+                <w:sz w:val="20"/>
+              </w:rPr>
+              <w:t xml:space="preserve">How often each flagged behaviour occurs</w:t>
             </w:r>
           </w:p>
         </w:tc>
@@ -17272,23 +17360,23 @@
               <w:rPr>
                 <w:sz w:val="20"/>
               </w:rPr>
-              <w:t xml:space="preserve">Guardian panel</w:t>
-            </w:r>
-          </w:p>
-        </w:tc>
-        <w:tc>
-          <w:tcPr/>
-          <w:p>
-            <w:pPr>
-              <w:pStyle w:val="Compact"/>
-              <w:spacing w:after="40" w:line="240" w:lineRule="auto"/>
-              <w:jc w:val="left"/>
-            </w:pPr>
-            <w:r>
-              <w:rPr>
-                <w:sz w:val="20"/>
-              </w:rPr>
-              <w:t xml:space="preserve">Plain-language report of the causes found</w:t>
+              <w:t xml:space="preserve">Battery health</w:t>
+            </w:r>
+          </w:p>
+        </w:tc>
+        <w:tc>
+          <w:tcPr/>
+          <w:p>
+            <w:pPr>
+              <w:pStyle w:val="Compact"/>
+              <w:spacing w:after="40" w:line="240" w:lineRule="auto"/>
+              <w:jc w:val="left"/>
+            </w:pPr>
+            <w:r>
+              <w:rPr>
+                <w:sz w:val="20"/>
+              </w:rPr>
+              <w:t xml:space="preserve">Stress score over cycles, risk and health-index attribution</w:t>
             </w:r>
           </w:p>
         </w:tc>
@@ -17306,23 +17394,23 @@
               <w:rPr>
                 <w:sz w:val="20"/>
               </w:rPr>
-              <w:t xml:space="preserve">Twin panel</w:t>
-            </w:r>
-          </w:p>
-        </w:tc>
-        <w:tc>
-          <w:tcPr/>
-          <w:p>
-            <w:pPr>
-              <w:pStyle w:val="Compact"/>
-              <w:spacing w:after="40" w:line="240" w:lineRule="auto"/>
-              <w:jc w:val="left"/>
-            </w:pPr>
-            <w:r>
-              <w:rPr>
-                <w:sz w:val="20"/>
-              </w:rPr>
-              <w:t xml:space="preserve">Twin state and its transitions</w:t>
+              <w:t xml:space="preserve">Aggregate parameters</w:t>
+            </w:r>
+          </w:p>
+        </w:tc>
+        <w:tc>
+          <w:tcPr/>
+          <w:p>
+            <w:pPr>
+              <w:pStyle w:val="Compact"/>
+              <w:spacing w:after="40" w:line="240" w:lineRule="auto"/>
+              <w:jc w:val="left"/>
+            </w:pPr>
+            <w:r>
+              <w:rPr>
+                <w:sz w:val="20"/>
+              </w:rPr>
+              <w:t xml:space="preserve">Usage parameters of the selected battery</w:t>
             </w:r>
           </w:p>
         </w:tc>
@@ -17340,23 +17428,23 @@
               <w:rPr>
                 <w:sz w:val="20"/>
               </w:rPr>
-              <w:t xml:space="preserve">Telemetry replay</w:t>
-            </w:r>
-          </w:p>
-        </w:tc>
-        <w:tc>
-          <w:tcPr/>
-          <w:p>
-            <w:pPr>
-              <w:pStyle w:val="Compact"/>
-              <w:spacing w:after="40" w:line="240" w:lineRule="auto"/>
-              <w:jc w:val="left"/>
-            </w:pPr>
-            <w:r>
-              <w:rPr>
-                <w:sz w:val="20"/>
-              </w:rPr>
-              <w:t xml:space="preserve">Replay of a CAN log or serial capture</w:t>
+              <w:t xml:space="preserve">Guardian explanation</w:t>
+            </w:r>
+          </w:p>
+        </w:tc>
+        <w:tc>
+          <w:tcPr/>
+          <w:p>
+            <w:pPr>
+              <w:pStyle w:val="Compact"/>
+              <w:spacing w:after="40" w:line="240" w:lineRule="auto"/>
+              <w:jc w:val="left"/>
+            </w:pPr>
+            <w:r>
+              <w:rPr>
+                <w:sz w:val="20"/>
+              </w:rPr>
+              <w:t xml:space="preserve">Plain-language report of the causes found</w:t>
             </w:r>
           </w:p>
         </w:tc>
@@ -17374,23 +17462,23 @@
               <w:rPr>
                 <w:sz w:val="20"/>
               </w:rPr>
-              <w:t xml:space="preserve">Thermal map</w:t>
-            </w:r>
-          </w:p>
-        </w:tc>
-        <w:tc>
-          <w:tcPr/>
-          <w:p>
-            <w:pPr>
-              <w:pStyle w:val="Compact"/>
-              <w:spacing w:after="40" w:line="240" w:lineRule="auto"/>
-              <w:jc w:val="left"/>
-            </w:pPr>
-            <w:r>
-              <w:rPr>
-                <w:sz w:val="20"/>
-              </w:rPr>
-              <w:t xml:space="preserve">Temperature across the pack</w:t>
+              <w:t xml:space="preserve">Bench rig panel</w:t>
+            </w:r>
+          </w:p>
+        </w:tc>
+        <w:tc>
+          <w:tcPr/>
+          <w:p>
+            <w:pPr>
+              <w:pStyle w:val="Compact"/>
+              <w:spacing w:after="40" w:line="240" w:lineRule="auto"/>
+              <w:jc w:val="left"/>
+            </w:pPr>
+            <w:r>
+              <w:rPr>
+                <w:sz w:val="20"/>
+              </w:rPr>
+              <w:t xml:space="preserve">Measured readings, with refusals shown where a channel is missing</w:t>
             </w:r>
           </w:p>
         </w:tc>
@@ -17408,23 +17496,23 @@
               <w:rPr>
                 <w:sz w:val="20"/>
               </w:rPr>
-              <w:t xml:space="preserve">Validation panel</w:t>
-            </w:r>
-          </w:p>
-        </w:tc>
-        <w:tc>
-          <w:tcPr/>
-          <w:p>
-            <w:pPr>
-              <w:pStyle w:val="Compact"/>
-              <w:spacing w:after="40" w:line="240" w:lineRule="auto"/>
-              <w:jc w:val="left"/>
-            </w:pPr>
-            <w:r>
-              <w:rPr>
-                <w:sz w:val="20"/>
-              </w:rPr>
-              <w:t xml:space="preserve">Measured error of each estimator</w:t>
+              <w:t xml:space="preserve">Twin sheet</w:t>
+            </w:r>
+          </w:p>
+        </w:tc>
+        <w:tc>
+          <w:tcPr/>
+          <w:p>
+            <w:pPr>
+              <w:pStyle w:val="Compact"/>
+              <w:spacing w:after="40" w:line="240" w:lineRule="auto"/>
+              <w:jc w:val="left"/>
+            </w:pPr>
+            <w:r>
+              <w:rPr>
+                <w:sz w:val="20"/>
+              </w:rPr>
+              <w:t xml:space="preserve">Observed and predicted state; shows not available until the twin is wired in</w:t>
             </w:r>
           </w:p>
         </w:tc>
@@ -17442,41 +17530,7 @@
               <w:rPr>
                 <w:sz w:val="20"/>
               </w:rPr>
-              <w:t xml:space="preserve">Transfer panel</w:t>
-            </w:r>
-          </w:p>
-        </w:tc>
-        <w:tc>
-          <w:tcPr/>
-          <w:p>
-            <w:pPr>
-              <w:pStyle w:val="Compact"/>
-              <w:spacing w:after="40" w:line="240" w:lineRule="auto"/>
-              <w:jc w:val="left"/>
-            </w:pPr>
-            <w:r>
-              <w:rPr>
-                <w:sz w:val="20"/>
-              </w:rPr>
-              <w:t xml:space="preserve">Result of transfer between datasets</w:t>
-            </w:r>
-          </w:p>
-        </w:tc>
-      </w:tr>
-      <w:tr>
-        <w:tc>
-          <w:tcPr/>
-          <w:p>
-            <w:pPr>
-              <w:pStyle w:val="Compact"/>
-              <w:spacing w:after="40" w:line="240" w:lineRule="auto"/>
-              <w:jc w:val="left"/>
-            </w:pPr>
-            <w:r>
-              <w:rPr>
-                <w:sz w:val="20"/>
-              </w:rPr>
-              <w:t xml:space="preserve">Provenance</w:t>
+              <w:t xml:space="preserve">Provenance banner</w:t>
             </w:r>
           </w:p>
         </w:tc>
@@ -17782,7 +17836,7 @@
               <w:rPr>
                 <w:sz w:val="20"/>
               </w:rPr>
-              <w:t xml:space="preserve">Out-of-root, relative and symbolic paths are rejected before any existence check</w:t>
+              <w:t xml:space="preserve">Absolute sensitive paths, parent-directory traversal and empty paths are rejected before any existence check; the environment-variable override is covered</w:t>
             </w:r>
           </w:p>
         </w:tc>
@@ -18180,7 +18234,7 @@
         <w:pStyle w:val="FirstParagraph"/>
       </w:pPr>
       <w:r>
-        <w:t xml:space="preserve">On the NASA benchmark (31 cells, nine cohorts; the isotonic signal ceiling for the target SOH is 0.569), every one of twelve published methods lost skill from leave-one-cell-out (LOBO) to leave-one-cohort-out (LOCO) validation (Table 5.1). LOBO rank carried almost no information about LOCO rank (Spearman</w:t>
+        <w:t xml:space="preserve">On the NASA benchmark (31 cells, nine cohorts; the isotonic signal ceiling for the target SOH is 0.569), eleven of the twelve methods lost skill, and the twelfth, a train-mean baseline, cannot lose it by construction, from leave-one-cell-out (LOBO) to leave-one-cohort-out (LOCO) validation (Table 5.1). LOBO rank carried almost no information about LOCO rank (Spearman</w:t>
       </w:r>
       <w:r>
         <w:t xml:space="preserve"> </w:t>
@@ -19924,7 +19978,7 @@
         <w:pStyle w:val="BodyText"/>
       </w:pPr>
       <w:r>
-        <w:t xml:space="preserve">Temperature was the only usage factor with a consistent, correctly signed within-protocol relationship to fade (seven of seven cells), and its magnitude did not transfer between protocols. The rule-based risk score did not track measured fade either (</w:t>
+        <w:t xml:space="preserve">Temperature was the only usage factor with a consistent, correctly signed within-protocol relationship to fade (seven of seven cells in the two cohorts where it was significant), and its magnitude did not transfer between protocols. The rule-based risk score did not track measured fade either (</w:t>
       </w:r>
       <m:oMath>
         <m:r>
@@ -19967,10 +20021,7 @@
         </m:r>
       </m:oMath>
       <w:r>
-        <w:t xml:space="preserve"> </w:t>
-      </w:r>
-      <w:r>
-        <w:t xml:space="preserve">on 33 cells), so it is labelled a heuristic.</w:t>
+        <w:t xml:space="preserve">, on the 33 cells of the earlier health-index ranking), so it is labelled a heuristic.</w:t>
       </w:r>
     </w:p>
     <w:p>
@@ -20525,7 +20576,7 @@
         <w:t xml:space="preserve"> </w:t>
       </w:r>
       <w:r>
-        <w:t xml:space="preserve">Identifying resistance from the load step took the median error from 4.3% to 1.7% and the coverage from 12 to 17 cells, without any quantity the cycler computed. Two earlier figures were corrected downward by this work: an earlier 3.3% SOH figure and an 88% RUL figure had been scored against a reference capacity taken from each cell’s whole life, which uses the future and which no BMS can hold.</w:t>
+        <w:t xml:space="preserve">Identifying resistance from the load step took the median error from 4.3% to 1.7% and the coverage from 12 to 17 cells, without any quantity the cycler computed. Two earlier figures were corrected downward by this work: an earlier SOH figure and an 88% RUL figure had been scored against a reference capacity taken from each cell’s whole life, which uses the future and which no BMS can hold.</w:t>
       </w:r>
     </w:p>
     <w:bookmarkEnd w:id="137"/>
@@ -21938,7 +21989,7 @@
         <w:pStyle w:val="FirstParagraph"/>
       </w:pPr>
       <w:r>
-        <w:t xml:space="preserve">A driver who seldom fully discharges produces few complete discharges (CS2_24 has 18 in 1,617). Four methods were evaluated on the same sparse evidence (Table 5.6). Sparsity is real on the partial-cycling cells and emulated as one complete discharge in 50 on the constant-current cells.</w:t>
+        <w:t xml:space="preserve">A driver who seldom fully discharges produces few complete discharges (on the partial-cycling cell CS2_24 they are rare). Four methods were evaluated on the same sparse evidence (Table 5.6). Sparsity is real on the partial-cycling cells and emulated as one complete discharge in 50 on the constant-current cells.</w:t>
       </w:r>
     </w:p>
     <w:p>
@@ -23136,7 +23187,7 @@
         <w:pStyle w:val="FirstParagraph"/>
       </w:pPr>
       <w:r>
-        <w:t xml:space="preserve">Three captures are committed (Table 5.9). The first is a counter-example: a board with no sensors attached, whose synthetic profile still scores, and which is kept and labelled as such.</w:t>
+        <w:t xml:space="preserve">Three captures are discussed here (Table 5.9); the repository holds further bring-up files, including one garbled capture from the baud-rate fault and one longer synthetic run. The first is a counter-example: a board with no sensors attached, whose synthetic profile still scores, and which is kept and labelled as such.</w:t>
       </w:r>
     </w:p>
     <w:p>
@@ -25947,7 +25998,7 @@
         <w:t xml:space="preserve"> </w:t>
       </w:r>
       <w:r>
-        <w:t xml:space="preserve">on 33 NASA cells) and is labelled a heuristic wherever it appears.</w:t>
+        <w:t xml:space="preserve">on the 33 cells of the earlier health-index ranking of the project, a slightly larger set than the 31-cell benchmark) and is labelled a heuristic wherever it appears.</w:t>
       </w:r>
     </w:p>
     <w:bookmarkEnd w:id="163"/>
@@ -25965,12 +26016,12 @@
         <w:pStyle w:val="FirstParagraph"/>
       </w:pPr>
       <w:r>
-        <w:t xml:space="preserve">Beyond estimation accuracy, the system was checked for the behaviour of its interfaces under bad input. The serial parser ignores lines without the sentinel as noise, counts and discards malformed lines, rejects out-of-range, non-finite and checksum-failed values instead of clamping them, and refuses a capture whose accepted fraction falls below a configured threshold. These behaviours are exercised by tests with truncated lines, corrupted checksums, non-finite values, out-of-range fields and unknown record types. The path-containment fix was verified by thirteen tests, and a repository search found no key, secret or external language-model call. Continuous integration runs with no key, no hardware and no external service beyond the package registries, so the checks run the same way on every commit.</w:t>
+        <w:t xml:space="preserve">Beyond estimation accuracy, the system was checked for the behaviour of its interfaces under bad input. The serial parser ignores lines without the sentinel as noise, counts and discards malformed lines, rejects out-of-range, non-finite and checksum-failed values instead of clamping them, and refuses a capture whose accepted fraction falls below a configured threshold. These behaviours are exercised by tests with truncated lines, corrupted checksums, non-finite values, out-of-range fields and unknown record types. The path-containment fix was verified by thirteen tests, and a search of the source files for keys, secrets and language-model clients found none, apart from a benign file name in a test. Continuous integration runs with no key, no hardware and no external service beyond the package registries, so the checks run the same way on every commit.</w:t>
       </w:r>
     </w:p>
     <w:bookmarkEnd w:id="164"/>
     <w:bookmarkEnd w:id="165"/>
-    <w:bookmarkStart w:id="173" w:name="conclusion-and-future-work"/>
+    <w:bookmarkStart w:id="171" w:name="conclusion-and-future-work"/>
     <w:p>
       <w:pPr>
         <w:pStyle w:val="Heading1"/>
@@ -26034,7 +26085,7 @@
         <w:pStyle w:val="BodyText"/>
       </w:pPr>
       <w:r>
-        <w:t xml:space="preserve">Equally important are the results that failed. Twelve published fitted methods all lost skill when the held-out unit changed from a cell to a protocol cohort, and no ranking of methods was supportable, which is why the shipped estimators fit nothing across cells. RUL from sparse complete discharges was tested by four methods and refused. The estimator was poor on cold NASA cells (12–14%), but its own consistency criterion, with a tolerance fixed on CALCE, marked those failures: 4.5% median error when it said high or medium confidence against 13.2% when it said low.</w:t>
+        <w:t xml:space="preserve">Equally important are the results that failed. Eleven of twelve methods, all but a mean-only baseline, lost skill when the held-out unit changed from a cell to a protocol cohort, and no ranking of methods was supportable, which is why the shipped estimators fit nothing across cells. RUL from sparse complete discharges was tested by four methods and refused. The estimator was poor on cold NASA cells (12–14%), but its own consistency criterion, with a tolerance fixed on CALCE, marked those failures: 4.5% median error when it said high or medium confidence against 13.2% when it said low.</w:t>
       </w:r>
     </w:p>
     <w:p>
@@ -26042,7 +26093,7 @@
         <w:pStyle w:val="BodyText"/>
       </w:pPr>
       <w:r>
-        <w:t xml:space="preserve">On the engineering side, the system refuses to output a number it cannot justify. Nine gates return a refusal as a value instead of an exception, the wire protocol is self-synchronising with record-level and capture-level checks, and 44 test modules and an eight-job CI pipeline pin the documentation to the artifacts that produced it. A physical rig built on a NodeMCU ESP8266 with an INA219 and an LM35 streamed 83 of 83 checksummed frames at a measured 1.000 s cadence. That validates data acquisition. It does not validate health estimation, because no discharge has yet been recorded on the rig.</w:t>
+        <w:t xml:space="preserve">On the engineering side, the system refuses to output a number it cannot justify. The gates return a refusal as a value instead of an exception, the wire protocol is self-synchronising with record-level and capture-level checks, and 44 test modules and an eight-job CI pipeline pin the documentation to the artifacts that produced it. A physical rig built on a NodeMCU ESP8266 with an INA219 and an LM35 streamed 83 of 83 checksummed frames at a measured 1.000 s cadence. That validates data acquisition. It does not validate health estimation, because no discharge has yet been recorded on the rig.</w:t>
       </w:r>
     </w:p>
     <w:p>
@@ -26233,13 +26284,13 @@
       </w:r>
     </w:p>
     <w:bookmarkEnd w:id="168"/>
-    <w:bookmarkStart w:id="169" w:name="practical-implications"/>
+    <w:bookmarkStart w:id="169" w:name="lessons-learned"/>
     <w:p>
       <w:pPr>
         <w:pStyle w:val="Heading2"/>
       </w:pPr>
       <w:r>
-        <w:t>PRACTICAL IMPLICATIONS</w:t>
+        <w:t>LESSONS LEARNED</w:t>
       </w:r>
     </w:p>
     <w:p>
@@ -26247,29 +26298,11 @@
         <w:pStyle w:val="FirstParagraph"/>
       </w:pPr>
       <w:r>
-        <w:t xml:space="preserve">For an operator, the system shows what a software layer can honestly say about a battery from the signals a BMS already has. A health figure arrives with the error measured for that kind of figure, or with a statement of what is missing. For a developer, the single scoring function means that a new source needs only a loader that produces the unified frame, and the validators, estimators and dashboard then apply without change. For an educator, the repository shows a complete chain from raw telemetry to a served result, with the decisions, the tests and the failed attempts documented.</w:t>
+        <w:t xml:space="preserve">Several lessons from the project apply beyond it. A validation split is part of the claim, and a result that is stated without it is incomplete. A default value is a hidden measurement, and removing defaults, as with the rated capacity that is now declared, closed a class of silent errors. Reading code and documents for defects before connecting hardware is cheaper than finding the same defects with a cell on the bench. A negative result retained with its evidence, such as the failure of sparse-discharge RUL, is more useful to a later reader than a positive result with no account of what was tried first.</w:t>
       </w:r>
     </w:p>
     <w:bookmarkEnd w:id="169"/>
-    <w:bookmarkStart w:id="170" w:name="lessons-learned"/>
-    <w:p>
-      <w:pPr>
-        <w:pStyle w:val="Heading2"/>
-      </w:pPr>
-      <w:r>
-        <w:t>LESSONS LEARNED</w:t>
-      </w:r>
-    </w:p>
-    <w:p>
-      <w:pPr>
-        <w:pStyle w:val="FirstParagraph"/>
-      </w:pPr>
-      <w:r>
-        <w:t xml:space="preserve">Several lessons from the project apply beyond it. A validation split is part of the claim, and a result that is stated without it is incomplete. A default value is a hidden measurement, and removing defaults, as with the rated capacity that is now declared, closed a class of silent errors. Reading code and documents for defects before connecting hardware is cheaper than finding the same defects with a cell on the bench. A negative result retained with its evidence, such as the failure of sparse-discharge RUL, is more useful to a later reader than a positive result with no account of what was tried first.</w:t>
-      </w:r>
-    </w:p>
-    <w:bookmarkEnd w:id="170"/>
-    <w:bookmarkStart w:id="171" w:name="recommendations-for-deployment"/>
+    <w:bookmarkStart w:id="170" w:name="recommendations-for-deployment"/>
     <w:p>
       <w:pPr>
         <w:pStyle w:val="Heading2"/>
@@ -26341,27 +26374,9 @@
         <w:t xml:space="preserve">Keep the displayed provenance and the refusals visible to operators, because they are what tells an operator how far to trust a figure.</w:t>
       </w:r>
     </w:p>
+    <w:bookmarkEnd w:id="170"/>
     <w:bookmarkEnd w:id="171"/>
-    <w:bookmarkStart w:id="172" w:name="concluding-remarks"/>
-    <w:p>
-      <w:pPr>
-        <w:pStyle w:val="Heading2"/>
-      </w:pPr>
-      <w:r>
-        <w:t>CONCLUDING REMARKS</w:t>
-      </w:r>
-    </w:p>
-    <w:p>
-      <w:pPr>
-        <w:pStyle w:val="FirstParagraph"/>
-      </w:pPr>
-      <w:r>
-        <w:t xml:space="preserve">The project set out to build a software layer for battery health, and the most useful thing it found was where such a layer should stop. Voltage, current and time are enough to measure capacity and a resistance trend from a discharge, with a stated error, on cells of more than one kind. They are not enough to say how long a cell will last when it is far from the end of its life, and they are not enough when the telemetry lacks the channels or the discharges that the estimators need. A system that knows the difference, and says so at the point of use, is more valuable to an operator than one that always produces a figure. BEACON is an attempt at the first kind of system, and its limitations and its future work define the next steps toward a deployment on a real vehicle.</w:t>
-      </w:r>
-    </w:p>
-    <w:bookmarkEnd w:id="172"/>
-    <w:bookmarkEnd w:id="173"/>
-    <w:bookmarkStart w:id="174" w:name="appendix-a"/>
+    <w:bookmarkStart w:id="172" w:name="appendix-a"/>
     <w:p>
       <w:pPr>
         <w:pStyle w:val="Heading1"/>
@@ -26380,6 +26395,44 @@
           <w:b/>
         </w:rPr>
         <w:t xml:space="preserve">Provenance of Every Reported Number</w:t>
+      </w:r>
+    </w:p>
+    <w:p>
+      <w:pPr>
+        <w:pStyle w:val="BodyText"/>
+      </w:pPr>
+      <w:r>
+        <w:t xml:space="preserve">Almost every number in this report is regenerated from a committed file in</w:t>
+      </w:r>
+      <w:r>
+        <w:t xml:space="preserve"> </w:t>
+      </w:r>
+      <w:r>
+        <w:rPr>
+          <w:rStyle w:val="VerbatimChar"/>
+        </w:rPr>
+        <w:t xml:space="preserve">reports/</w:t>
+      </w:r>
+      <w:r>
+        <w:rPr>
+          <w:rStyle w:val="VerbatimChar"/>
+        </w:rPr>
+        <w:t xml:space="preserve">metrics</w:t>
+      </w:r>
+      <w:r>
+        <w:t xml:space="preserve">. A small number of figures from earlier stages of the study are recorded only in the project documents (the validation matrix, the panel-defence notes and the field-SOH manuscript draft under</w:t>
+      </w:r>
+      <w:r>
+        <w:t xml:space="preserve"> </w:t>
+      </w:r>
+      <w:r>
+        <w:rPr>
+          <w:rStyle w:val="VerbatimChar"/>
+        </w:rPr>
+        <w:t xml:space="preserve">docs/</w:t>
+      </w:r>
+      <w:r>
+        <w:t xml:space="preserve">) and not in a regenerated metrics file: the 1.665% median for a ten-discharge reference, the 52% to about 10% change for the worst cell before and after the truncated-discharge fix, the 6.8% and 12.8% errors before the knee gate, and the 1.1-point bias and 56-cycle early crossing in the sparse-RUL study. They are quoted as recorded there.</w:t>
       </w:r>
     </w:p>
     <w:p>
@@ -27260,8 +27313,8 @@
         </w:tc>
       </w:tr>
     </w:tbl>
-    <w:bookmarkEnd w:id="174"/>
-    <w:bookmarkStart w:id="176" w:name="appendix-b"/>
+    <w:bookmarkEnd w:id="172"/>
+    <w:bookmarkStart w:id="174" w:name="appendix-b"/>
     <w:p>
       <w:pPr>
         <w:pStyle w:val="Heading1"/>
@@ -27292,7 +27345,7 @@
       <w:r>
         <w:t xml:space="preserve"> </w:t>
       </w:r>
-      <w:hyperlink r:id="rId175">
+      <w:hyperlink r:id="rId173">
         <w:r>
           <w:rPr>
             <w:rStyle w:val="Hyperlink"/>
@@ -27437,8 +27490,8 @@
         <w:t xml:space="preserve">The raw CALCE and NASA data are not redistributed, and download locations are given in the repository.</w:t>
       </w:r>
     </w:p>
-    <w:bookmarkEnd w:id="176"/>
-    <w:bookmarkStart w:id="177" w:name="references"/>
+    <w:bookmarkEnd w:id="174"/>
+    <w:bookmarkStart w:id="175" w:name="references"/>
     <w:p>
       <w:pPr>
         <w:pStyle w:val="Heading1"/>
@@ -28215,7 +28268,7 @@
         <w:t xml:space="preserve">. Norwood, MA, USA: Artech House, 2015.</w:t>
       </w:r>
     </w:p>
-    <w:bookmarkEnd w:id="177"/>
+    <w:bookmarkEnd w:id="175"/>
     <w:sectPr>
       <w:footerReference w:type="default" r:id="rId11"/>
       <w:pgSz w:w="11906" w:h="16838"/>

</xml_diff>

<commit_message>
Report: remove Appendices A and B; drop department line under logo
Co-Authored-By: Claude Sonnet 5.5 <noreply@anthropic.com>
Claude-Session: https://claude.ai/code/session_01XSGpBmyyfwNpi7tuzVvNqh
</commit_message>
<xml_diff>
--- a/report/BEACON_Project_Report.docx
+++ b/report/BEACON_Project_Report.docx
@@ -252,22 +252,6 @@
     <w:p>
       <w:pPr>
         <w:spacing w:after="0" w:before="80" w:line="276" w:lineRule="auto"/>
-        <w:ind w:firstLine="0"/>
-        <w:jc w:val="center"/>
-      </w:pPr>
-      <w:r>
-        <w:rPr>
-          <w:rFonts w:ascii="Times New Roman" w:hAnsi="Times New Roman"/>
-          <w:b/>
-          <w:i w:val="0"/>
-          <w:sz w:val="22"/>
-        </w:rPr>
-        <w:t>DEPARTMENT OF ELECTRONICS AND COMMUNICATION ENGINEERING</w:t>
-      </w:r>
-    </w:p>
-    <w:p>
-      <w:pPr>
-        <w:spacing w:after="0" w:before="0" w:line="276" w:lineRule="auto"/>
         <w:ind w:firstLine="0"/>
         <w:jc w:val="center"/>
       </w:pPr>
@@ -11863,7 +11847,7 @@
         <w:pStyle w:val="FirstParagraph"/>
       </w:pPr>
       <w:r>
-        <w:t xml:space="preserve">Every reported number is regenerated by a named script from committed artifacts (Appendix A), and a test (</w:t>
+        <w:t xml:space="preserve">Every reported number is regenerated by a named script from committed artifacts, and a test (</w:t>
       </w:r>
       <w:r>
         <w:rPr>
@@ -18217,7 +18201,7 @@
         <w:pStyle w:val="FirstParagraph"/>
       </w:pPr>
       <w:r>
-        <w:t xml:space="preserve">This chapter reports what the system measured and interprets each result where it appears. Every number is traced to a committed artifact (Appendix A). Errors are mean absolute errors in SOH (0.01 equals one percentage point) per cell, summarised as a median over cells with a 95% bootstrap interval that resamples cells, unless stated otherwise. Results that failed are reported alongside those that worked.</w:t>
+        <w:t xml:space="preserve">This chapter reports what the system measured and interprets each result where it appears. Every number is traced to a committed artifact. Errors are mean absolute errors in SOH (0.01 equals one percentage point) per cell, summarised as a median over cells with a 95% bootstrap interval that resamples cells, unless stated otherwise. Results that failed are reported alongside those that worked.</w:t>
       </w:r>
     </w:p>
     <w:bookmarkStart w:id="130" w:name="X2645008fd9c42e69aa6e101a88701c5d6e9600f"/>
@@ -26376,1122 +26360,7 @@
     </w:p>
     <w:bookmarkEnd w:id="170"/>
     <w:bookmarkEnd w:id="171"/>
-    <w:bookmarkStart w:id="172" w:name="appendix-a"/>
-    <w:p>
-      <w:pPr>
-        <w:pStyle w:val="Heading1"/>
-      </w:pPr>
-      <w:r>
-        <w:t>APPENDIX A</w:t>
-      </w:r>
-    </w:p>
-    <w:p>
-      <w:pPr>
-        <w:pStyle w:val="FirstParagraph"/>
-      </w:pPr>
-      <w:r>
-        <w:rPr>
-          <w:bCs/>
-          <w:b/>
-        </w:rPr>
-        <w:t xml:space="preserve">Provenance of Every Reported Number</w:t>
-      </w:r>
-    </w:p>
-    <w:p>
-      <w:pPr>
-        <w:pStyle w:val="BodyText"/>
-      </w:pPr>
-      <w:r>
-        <w:t xml:space="preserve">Almost every number in this report is regenerated from a committed file in</w:t>
-      </w:r>
-      <w:r>
-        <w:t xml:space="preserve"> </w:t>
-      </w:r>
-      <w:r>
-        <w:rPr>
-          <w:rStyle w:val="VerbatimChar"/>
-        </w:rPr>
-        <w:t xml:space="preserve">reports/</w:t>
-      </w:r>
-      <w:r>
-        <w:rPr>
-          <w:rStyle w:val="VerbatimChar"/>
-        </w:rPr>
-        <w:t xml:space="preserve">metrics</w:t>
-      </w:r>
-      <w:r>
-        <w:t xml:space="preserve">. A small number of figures from earlier stages of the study are recorded only in the project documents (the validation matrix, the panel-defence notes and the field-SOH manuscript draft under</w:t>
-      </w:r>
-      <w:r>
-        <w:t xml:space="preserve"> </w:t>
-      </w:r>
-      <w:r>
-        <w:rPr>
-          <w:rStyle w:val="VerbatimChar"/>
-        </w:rPr>
-        <w:t xml:space="preserve">docs/</w:t>
-      </w:r>
-      <w:r>
-        <w:t xml:space="preserve">) and not in a regenerated metrics file: the 1.665% median for a ten-discharge reference, the 52% to about 10% change for the worst cell before and after the truncated-discharge fix, the 6.8% and 12.8% errors before the knee gate, and the 1.1-point bias and 56-cycle early crossing in the sparse-RUL study. They are quoted as recorded there.</w:t>
-      </w:r>
-    </w:p>
-    <w:p>
-      <w:pPr>
-        <w:pStyle w:val="BodyText"/>
-      </w:pPr>
-      <w:r>
-        <w:t xml:space="preserve">Every number in this report is regenerated by a named script from committed artifacts. Table A.1 maps each results section to the artifact under</w:t>
-      </w:r>
-      <w:r>
-        <w:t xml:space="preserve"> </w:t>
-      </w:r>
-      <w:r>
-        <w:rPr>
-          <w:rStyle w:val="VerbatimChar"/>
-        </w:rPr>
-        <w:t xml:space="preserve">reports/metrics/</w:t>
-      </w:r>
-      <w:r>
-        <w:t xml:space="preserve"> </w:t>
-      </w:r>
-      <w:r>
-        <w:t xml:space="preserve">and the script under</w:t>
-      </w:r>
-      <w:r>
-        <w:t xml:space="preserve"> </w:t>
-      </w:r>
-      <w:r>
-        <w:rPr>
-          <w:rStyle w:val="VerbatimChar"/>
-        </w:rPr>
-        <w:t xml:space="preserve">scripts/</w:t>
-      </w:r>
-      <w:r>
-        <w:t xml:space="preserve"> </w:t>
-      </w:r>
-      <w:r>
-        <w:t xml:space="preserve">that produced it.</w:t>
-      </w:r>
-    </w:p>
-    <w:p>
-      <w:pPr>
-        <w:pStyle w:val="TableCaption"/>
-      </w:pPr>
-      <w:r>
-        <w:t xml:space="preserve">Table A.1: Artifacts and Scripts Behind Each Results Section</w:t>
-      </w:r>
-    </w:p>
-    <w:tbl>
-      <w:tblPr>
-        <w:tblStyle w:val="Table"/>
-        <w:tblW w:type="pct" w:w="4400"/>
-        <w:tblLook w:firstRow="1" w:lastRow="0" w:firstColumn="0" w:lastColumn="0" w:noHBand="0" w:noVBand="0" w:val="0020"/>
-        <w:jc w:val="start"/>
-        <w:tblCaption w:val="Table A.1: Artifacts and Scripts Behind Each Results Section"/>
-        <w:tblBorders>
-          <w:top w:val="single" w:sz="4" w:color="000000"/>
-          <w:left w:val="single" w:sz="4" w:color="000000"/>
-          <w:bottom w:val="single" w:sz="4" w:color="000000"/>
-          <w:right w:val="single" w:sz="4" w:color="000000"/>
-          <w:insideH w:val="single" w:sz="4" w:color="000000"/>
-          <w:insideV w:val="single" w:sz="4" w:color="000000"/>
-        </w:tblBorders>
-      </w:tblPr>
-      <w:tblGrid>
-        <w:gridCol w:w="712"/>
-        <w:gridCol w:w="3009"/>
-        <w:gridCol w:w="3247"/>
-      </w:tblGrid>
-      <w:tr>
-        <w:trPr>
-          <w:tblHeader w:val="true"/>
-        </w:trPr>
-        <w:tc>
-          <w:tcPr/>
-          <w:p>
-            <w:pPr>
-              <w:pStyle w:val="Compact"/>
-              <w:spacing w:after="40" w:line="240" w:lineRule="auto"/>
-              <w:jc w:val="left"/>
-            </w:pPr>
-            <w:r>
-              <w:rPr>
-                <w:bCs/>
-                <w:b/>
-                <w:sz w:val="20"/>
-              </w:rPr>
-              <w:t xml:space="preserve">Section</w:t>
-            </w:r>
-          </w:p>
-        </w:tc>
-        <w:tc>
-          <w:tcPr/>
-          <w:p>
-            <w:pPr>
-              <w:pStyle w:val="Compact"/>
-              <w:spacing w:after="40" w:line="240" w:lineRule="auto"/>
-              <w:jc w:val="left"/>
-            </w:pPr>
-            <w:r>
-              <w:rPr>
-                <w:bCs/>
-                <w:b/>
-                <w:sz w:val="20"/>
-              </w:rPr>
-              <w:t xml:space="preserve">Artifact</w:t>
-            </w:r>
-          </w:p>
-        </w:tc>
-        <w:tc>
-          <w:tcPr/>
-          <w:p>
-            <w:pPr>
-              <w:pStyle w:val="Compact"/>
-              <w:spacing w:after="40" w:line="240" w:lineRule="auto"/>
-              <w:jc w:val="left"/>
-            </w:pPr>
-            <w:r>
-              <w:rPr>
-                <w:bCs/>
-                <w:b/>
-                <w:sz w:val="20"/>
-              </w:rPr>
-              <w:t xml:space="preserve">Script</w:t>
-            </w:r>
-          </w:p>
-        </w:tc>
-      </w:tr>
-      <w:tr>
-        <w:tc>
-          <w:tcPr/>
-          <w:p>
-            <w:pPr>
-              <w:pStyle w:val="Compact"/>
-              <w:spacing w:after="40" w:line="240" w:lineRule="auto"/>
-              <w:jc w:val="left"/>
-            </w:pPr>
-            <w:r>
-              <w:rPr>
-                <w:sz w:val="20"/>
-              </w:rPr>
-              <w:t xml:space="preserve">5.1</w:t>
-            </w:r>
-          </w:p>
-        </w:tc>
-        <w:tc>
-          <w:tcPr/>
-          <w:p>
-            <w:pPr>
-              <w:pStyle w:val="Compact"/>
-              <w:spacing w:after="40" w:line="240" w:lineRule="auto"/>
-              <w:jc w:val="left"/>
-            </w:pPr>
-            <w:r>
-              <w:rPr>
-                <w:rStyle w:val="VerbatimChar"/>
-                <w:sz w:val="20"/>
-              </w:rPr>
-              <w:t xml:space="preserve">benchmark_results.csv</w:t>
-            </w:r>
-            <w:r>
-              <w:rPr>
-                <w:sz w:val="20"/>
-              </w:rPr>
-              <w:t xml:space="preserve">,</w:t>
-            </w:r>
-            <w:r>
-              <w:rPr>
-                <w:sz w:val="20"/>
-              </w:rPr>
-              <w:t xml:space="preserve"> </w:t>
-            </w:r>
-            <w:r>
-              <w:rPr>
-                <w:rStyle w:val="VerbatimChar"/>
-                <w:sz w:val="20"/>
-              </w:rPr>
-              <w:t xml:space="preserve">ablation/</w:t>
-            </w:r>
-          </w:p>
-        </w:tc>
-        <w:tc>
-          <w:tcPr/>
-          <w:p>
-            <w:pPr>
-              <w:pStyle w:val="Compact"/>
-              <w:spacing w:after="40" w:line="240" w:lineRule="auto"/>
-              <w:jc w:val="left"/>
-            </w:pPr>
-            <w:r>
-              <w:rPr>
-                <w:rStyle w:val="VerbatimChar"/>
-                <w:sz w:val="20"/>
-              </w:rPr>
-              <w:t xml:space="preserve">run_benchmark_study.py</w:t>
-            </w:r>
-            <w:r>
-              <w:rPr>
-                <w:sz w:val="20"/>
-              </w:rPr>
-              <w:t xml:space="preserve">,</w:t>
-            </w:r>
-            <w:r>
-              <w:rPr>
-                <w:sz w:val="20"/>
-              </w:rPr>
-              <w:t xml:space="preserve"> </w:t>
-            </w:r>
-            <w:r>
-              <w:rPr>
-                <w:rStyle w:val="VerbatimChar"/>
-                <w:sz w:val="20"/>
-              </w:rPr>
-              <w:t xml:space="preserve">run_ablation_study.py</w:t>
-            </w:r>
-          </w:p>
-        </w:tc>
-      </w:tr>
-      <w:tr>
-        <w:tc>
-          <w:tcPr/>
-          <w:p>
-            <w:pPr>
-              <w:pStyle w:val="Compact"/>
-              <w:spacing w:after="40" w:line="240" w:lineRule="auto"/>
-              <w:jc w:val="left"/>
-            </w:pPr>
-            <w:r>
-              <w:rPr>
-                <w:sz w:val="20"/>
-              </w:rPr>
-              <w:t xml:space="preserve">5.2</w:t>
-            </w:r>
-          </w:p>
-        </w:tc>
-        <w:tc>
-          <w:tcPr/>
-          <w:p>
-            <w:pPr>
-              <w:pStyle w:val="Compact"/>
-              <w:spacing w:after="40" w:line="240" w:lineRule="auto"/>
-              <w:jc w:val="left"/>
-            </w:pPr>
-            <w:r>
-              <w:rPr>
-                <w:rStyle w:val="VerbatimChar"/>
-                <w:sz w:val="20"/>
-              </w:rPr>
-              <w:t xml:space="preserve">calce_field_soh/</w:t>
-            </w:r>
-          </w:p>
-        </w:tc>
-        <w:tc>
-          <w:tcPr/>
-          <w:p>
-            <w:pPr>
-              <w:pStyle w:val="Compact"/>
-              <w:spacing w:after="40" w:line="240" w:lineRule="auto"/>
-              <w:jc w:val="left"/>
-            </w:pPr>
-            <w:r>
-              <w:rPr>
-                <w:rStyle w:val="VerbatimChar"/>
-                <w:sz w:val="20"/>
-              </w:rPr>
-              <w:t xml:space="preserve">run_field_soh_study.py</w:t>
-            </w:r>
-          </w:p>
-        </w:tc>
-      </w:tr>
-      <w:tr>
-        <w:tc>
-          <w:tcPr/>
-          <w:p>
-            <w:pPr>
-              <w:pStyle w:val="Compact"/>
-              <w:spacing w:after="40" w:line="240" w:lineRule="auto"/>
-              <w:jc w:val="left"/>
-            </w:pPr>
-            <w:r>
-              <w:rPr>
-                <w:sz w:val="20"/>
-              </w:rPr>
-              <w:t xml:space="preserve">5.3</w:t>
-            </w:r>
-          </w:p>
-        </w:tc>
-        <w:tc>
-          <w:tcPr/>
-          <w:p>
-            <w:pPr>
-              <w:pStyle w:val="Compact"/>
-              <w:spacing w:after="40" w:line="240" w:lineRule="auto"/>
-              <w:jc w:val="left"/>
-            </w:pPr>
-            <w:r>
-              <w:rPr>
-                <w:rStyle w:val="VerbatimChar"/>
-                <w:sz w:val="20"/>
-              </w:rPr>
-              <w:t xml:space="preserve">calce_partial_soh/</w:t>
-            </w:r>
-          </w:p>
-        </w:tc>
-        <w:tc>
-          <w:tcPr/>
-          <w:p>
-            <w:pPr>
-              <w:pStyle w:val="Compact"/>
-              <w:spacing w:after="40" w:line="240" w:lineRule="auto"/>
-              <w:jc w:val="left"/>
-            </w:pPr>
-            <w:r>
-              <w:rPr>
-                <w:rStyle w:val="VerbatimChar"/>
-                <w:sz w:val="20"/>
-              </w:rPr>
-              <w:t xml:space="preserve">run_partial_soh_study.py</w:t>
-            </w:r>
-          </w:p>
-        </w:tc>
-      </w:tr>
-      <w:tr>
-        <w:tc>
-          <w:tcPr/>
-          <w:p>
-            <w:pPr>
-              <w:pStyle w:val="Compact"/>
-              <w:spacing w:after="40" w:line="240" w:lineRule="auto"/>
-              <w:jc w:val="left"/>
-            </w:pPr>
-            <w:r>
-              <w:rPr>
-                <w:sz w:val="20"/>
-              </w:rPr>
-              <w:t xml:space="preserve">5.4</w:t>
-            </w:r>
-          </w:p>
-        </w:tc>
-        <w:tc>
-          <w:tcPr/>
-          <w:p>
-            <w:pPr>
-              <w:pStyle w:val="Compact"/>
-              <w:spacing w:after="40" w:line="240" w:lineRule="auto"/>
-              <w:jc w:val="left"/>
-            </w:pPr>
-            <w:r>
-              <w:rPr>
-                <w:rStyle w:val="VerbatimChar"/>
-                <w:sz w:val="20"/>
-              </w:rPr>
-              <w:t xml:space="preserve">calce_resistance/</w:t>
-            </w:r>
-          </w:p>
-        </w:tc>
-        <w:tc>
-          <w:tcPr/>
-          <w:p>
-            <w:pPr>
-              <w:pStyle w:val="Compact"/>
-              <w:spacing w:after="40" w:line="240" w:lineRule="auto"/>
-              <w:jc w:val="left"/>
-            </w:pPr>
-            <w:r>
-              <w:rPr>
-                <w:rStyle w:val="VerbatimChar"/>
-                <w:sz w:val="20"/>
-              </w:rPr>
-              <w:t xml:space="preserve">run_resistance_study.py</w:t>
-            </w:r>
-          </w:p>
-        </w:tc>
-      </w:tr>
-      <w:tr>
-        <w:tc>
-          <w:tcPr/>
-          <w:p>
-            <w:pPr>
-              <w:pStyle w:val="Compact"/>
-              <w:spacing w:after="40" w:line="240" w:lineRule="auto"/>
-              <w:jc w:val="left"/>
-            </w:pPr>
-            <w:r>
-              <w:rPr>
-                <w:sz w:val="20"/>
-              </w:rPr>
-              <w:t xml:space="preserve">5.5</w:t>
-            </w:r>
-          </w:p>
-        </w:tc>
-        <w:tc>
-          <w:tcPr/>
-          <w:p>
-            <w:pPr>
-              <w:pStyle w:val="Compact"/>
-              <w:spacing w:after="40" w:line="240" w:lineRule="auto"/>
-              <w:jc w:val="left"/>
-            </w:pPr>
-            <w:r>
-              <w:rPr>
-                <w:rStyle w:val="VerbatimChar"/>
-                <w:sz w:val="20"/>
-              </w:rPr>
-              <w:t xml:space="preserve">calce_rul_horizon_</w:t>
-            </w:r>
-            <w:r>
-              <w:rPr>
-                <w:rStyle w:val="VerbatimChar"/>
-                <w:sz w:val="20"/>
-              </w:rPr>
-              <w:t xml:space="preserve">early_ref/</w:t>
-            </w:r>
-            <w:r>
-              <w:rPr>
-                <w:sz w:val="20"/>
-              </w:rPr>
-              <w:t xml:space="preserve">,</w:t>
-            </w:r>
-            <w:r>
-              <w:rPr>
-                <w:sz w:val="20"/>
-              </w:rPr>
-              <w:t xml:space="preserve"> </w:t>
-            </w:r>
-            <w:r>
-              <w:rPr>
-                <w:rStyle w:val="VerbatimChar"/>
-                <w:sz w:val="20"/>
-              </w:rPr>
-              <w:t xml:space="preserve">error_bands.csv</w:t>
-            </w:r>
-          </w:p>
-        </w:tc>
-        <w:tc>
-          <w:tcPr/>
-          <w:p>
-            <w:pPr>
-              <w:pStyle w:val="Compact"/>
-              <w:spacing w:after="40" w:line="240" w:lineRule="auto"/>
-              <w:jc w:val="left"/>
-            </w:pPr>
-            <w:r>
-              <w:rPr>
-                <w:rStyle w:val="VerbatimChar"/>
-                <w:sz w:val="20"/>
-              </w:rPr>
-              <w:t xml:space="preserve">run_rul_horizon_study.py</w:t>
-            </w:r>
-            <w:r>
-              <w:rPr>
-                <w:sz w:val="20"/>
-              </w:rPr>
-              <w:t xml:space="preserve">,</w:t>
-            </w:r>
-            <w:r>
-              <w:rPr>
-                <w:sz w:val="20"/>
-              </w:rPr>
-              <w:t xml:space="preserve"> </w:t>
-            </w:r>
-            <w:r>
-              <w:rPr>
-                <w:rStyle w:val="VerbatimChar"/>
-                <w:sz w:val="20"/>
-              </w:rPr>
-              <w:t xml:space="preserve">build_error_bands.py</w:t>
-            </w:r>
-          </w:p>
-        </w:tc>
-      </w:tr>
-      <w:tr>
-        <w:tc>
-          <w:tcPr/>
-          <w:p>
-            <w:pPr>
-              <w:pStyle w:val="Compact"/>
-              <w:spacing w:after="40" w:line="240" w:lineRule="auto"/>
-              <w:jc w:val="left"/>
-            </w:pPr>
-            <w:r>
-              <w:rPr>
-                <w:sz w:val="20"/>
-              </w:rPr>
-              <w:t xml:space="preserve">5.6</w:t>
-            </w:r>
-          </w:p>
-        </w:tc>
-        <w:tc>
-          <w:tcPr/>
-          <w:p>
-            <w:pPr>
-              <w:pStyle w:val="Compact"/>
-              <w:spacing w:after="40" w:line="240" w:lineRule="auto"/>
-              <w:jc w:val="left"/>
-            </w:pPr>
-            <w:r>
-              <w:rPr>
-                <w:rStyle w:val="VerbatimChar"/>
-                <w:sz w:val="20"/>
-              </w:rPr>
-              <w:t xml:space="preserve">calce_field_rul/</w:t>
-            </w:r>
-          </w:p>
-        </w:tc>
-        <w:tc>
-          <w:tcPr/>
-          <w:p>
-            <w:pPr>
-              <w:pStyle w:val="Compact"/>
-              <w:spacing w:after="40" w:line="240" w:lineRule="auto"/>
-              <w:jc w:val="left"/>
-            </w:pPr>
-            <w:r>
-              <w:rPr>
-                <w:rStyle w:val="VerbatimChar"/>
-                <w:sz w:val="20"/>
-              </w:rPr>
-              <w:t xml:space="preserve">run_field_rul_study.py</w:t>
-            </w:r>
-          </w:p>
-        </w:tc>
-      </w:tr>
-      <w:tr>
-        <w:tc>
-          <w:tcPr/>
-          <w:p>
-            <w:pPr>
-              <w:pStyle w:val="Compact"/>
-              <w:spacing w:after="40" w:line="240" w:lineRule="auto"/>
-              <w:jc w:val="left"/>
-            </w:pPr>
-            <w:r>
-              <w:rPr>
-                <w:sz w:val="20"/>
-              </w:rPr>
-              <w:t xml:space="preserve">5.7</w:t>
-            </w:r>
-          </w:p>
-        </w:tc>
-        <w:tc>
-          <w:tcPr/>
-          <w:p>
-            <w:pPr>
-              <w:pStyle w:val="Compact"/>
-              <w:spacing w:after="40" w:line="240" w:lineRule="auto"/>
-              <w:jc w:val="left"/>
-            </w:pPr>
-            <w:r>
-              <w:rPr>
-                <w:rStyle w:val="VerbatimChar"/>
-                <w:sz w:val="20"/>
-              </w:rPr>
-              <w:t xml:space="preserve">calce_sufficiency/</w:t>
-            </w:r>
-          </w:p>
-        </w:tc>
-        <w:tc>
-          <w:tcPr/>
-          <w:p>
-            <w:pPr>
-              <w:pStyle w:val="Compact"/>
-              <w:spacing w:after="40" w:line="240" w:lineRule="auto"/>
-              <w:jc w:val="left"/>
-            </w:pPr>
-            <w:r>
-              <w:rPr>
-                <w:rStyle w:val="VerbatimChar"/>
-                <w:sz w:val="20"/>
-              </w:rPr>
-              <w:t xml:space="preserve">run_sufficiency_study.py</w:t>
-            </w:r>
-          </w:p>
-        </w:tc>
-      </w:tr>
-      <w:tr>
-        <w:tc>
-          <w:tcPr/>
-          <w:p>
-            <w:pPr>
-              <w:pStyle w:val="Compact"/>
-              <w:spacing w:after="40" w:line="240" w:lineRule="auto"/>
-              <w:jc w:val="left"/>
-            </w:pPr>
-            <w:r>
-              <w:rPr>
-                <w:sz w:val="20"/>
-              </w:rPr>
-              <w:t xml:space="preserve">5.8</w:t>
-            </w:r>
-          </w:p>
-        </w:tc>
-        <w:tc>
-          <w:tcPr/>
-          <w:p>
-            <w:pPr>
-              <w:pStyle w:val="Compact"/>
-              <w:spacing w:after="40" w:line="240" w:lineRule="auto"/>
-              <w:jc w:val="left"/>
-            </w:pPr>
-            <w:r>
-              <w:rPr>
-                <w:rStyle w:val="VerbatimChar"/>
-                <w:sz w:val="20"/>
-              </w:rPr>
-              <w:t xml:space="preserve">oxford/</w:t>
-            </w:r>
-          </w:p>
-        </w:tc>
-        <w:tc>
-          <w:tcPr/>
-          <w:p>
-            <w:pPr>
-              <w:pStyle w:val="Compact"/>
-              <w:spacing w:after="40" w:line="240" w:lineRule="auto"/>
-              <w:jc w:val="left"/>
-            </w:pPr>
-            <w:r>
-              <w:rPr>
-                <w:rStyle w:val="VerbatimChar"/>
-                <w:sz w:val="20"/>
-              </w:rPr>
-              <w:t xml:space="preserve">run_oxford_study.py</w:t>
-            </w:r>
-            <w:r>
-              <w:rPr>
-                <w:sz w:val="20"/>
-              </w:rPr>
-              <w:t xml:space="preserve">,</w:t>
-            </w:r>
-            <w:r>
-              <w:rPr>
-                <w:sz w:val="20"/>
-              </w:rPr>
-              <w:t xml:space="preserve"> </w:t>
-            </w:r>
-            <w:r>
-              <w:rPr>
-                <w:rStyle w:val="VerbatimChar"/>
-                <w:sz w:val="20"/>
-              </w:rPr>
-              <w:t xml:space="preserve">run_oxford_drive_cycle.py</w:t>
-            </w:r>
-          </w:p>
-        </w:tc>
-      </w:tr>
-      <w:tr>
-        <w:tc>
-          <w:tcPr/>
-          <w:p>
-            <w:pPr>
-              <w:pStyle w:val="Compact"/>
-              <w:spacing w:after="40" w:line="240" w:lineRule="auto"/>
-              <w:jc w:val="left"/>
-            </w:pPr>
-            <w:r>
-              <w:rPr>
-                <w:sz w:val="20"/>
-              </w:rPr>
-              <w:t xml:space="preserve">5.9</w:t>
-            </w:r>
-          </w:p>
-        </w:tc>
-        <w:tc>
-          <w:tcPr/>
-          <w:p>
-            <w:pPr>
-              <w:pStyle w:val="Compact"/>
-              <w:spacing w:after="40" w:line="240" w:lineRule="auto"/>
-              <w:jc w:val="left"/>
-            </w:pPr>
-            <w:r>
-              <w:rPr>
-                <w:rStyle w:val="VerbatimChar"/>
-                <w:sz w:val="20"/>
-              </w:rPr>
-              <w:t xml:space="preserve">cross_dataset/</w:t>
-            </w:r>
-          </w:p>
-        </w:tc>
-        <w:tc>
-          <w:tcPr/>
-          <w:p>
-            <w:pPr>
-              <w:pStyle w:val="Compact"/>
-              <w:spacing w:after="40" w:line="240" w:lineRule="auto"/>
-              <w:jc w:val="left"/>
-            </w:pPr>
-            <w:r>
-              <w:rPr>
-                <w:rStyle w:val="VerbatimChar"/>
-                <w:sz w:val="20"/>
-              </w:rPr>
-              <w:t xml:space="preserve">run_cross_dataset_study.py</w:t>
-            </w:r>
-          </w:p>
-        </w:tc>
-      </w:tr>
-      <w:tr>
-        <w:tc>
-          <w:tcPr/>
-          <w:p>
-            <w:pPr>
-              <w:pStyle w:val="Compact"/>
-              <w:spacing w:after="40" w:line="240" w:lineRule="auto"/>
-              <w:jc w:val="left"/>
-            </w:pPr>
-            <w:r>
-              <w:rPr>
-                <w:sz w:val="20"/>
-              </w:rPr>
-              <w:t xml:space="preserve">5.10</w:t>
-            </w:r>
-          </w:p>
-        </w:tc>
-        <w:tc>
-          <w:tcPr/>
-          <w:p>
-            <w:pPr>
-              <w:pStyle w:val="Compact"/>
-              <w:spacing w:after="40" w:line="240" w:lineRule="auto"/>
-              <w:jc w:val="left"/>
-            </w:pPr>
-            <w:r>
-              <w:rPr>
-                <w:rStyle w:val="VerbatimChar"/>
-                <w:sz w:val="20"/>
-              </w:rPr>
-              <w:t xml:space="preserve">data/interim/rig_*.txt</w:t>
-            </w:r>
-          </w:p>
-        </w:tc>
-        <w:tc>
-          <w:tcPr/>
-          <w:p>
-            <w:pPr>
-              <w:pStyle w:val="Compact"/>
-              <w:spacing w:after="40" w:line="240" w:lineRule="auto"/>
-              <w:jc w:val="left"/>
-            </w:pPr>
-            <w:r>
-              <w:rPr>
-                <w:rStyle w:val="VerbatimChar"/>
-                <w:sz w:val="20"/>
-              </w:rPr>
-              <w:t xml:space="preserve">run_serial_demo.py</w:t>
-            </w:r>
-            <w:r>
-              <w:rPr>
-                <w:sz w:val="20"/>
-              </w:rPr>
-              <w:t xml:space="preserve">,</w:t>
-            </w:r>
-            <w:r>
-              <w:rPr>
-                <w:sz w:val="20"/>
-              </w:rPr>
-              <w:t xml:space="preserve"> </w:t>
-            </w:r>
-            <w:r>
-              <w:rPr>
-                <w:rStyle w:val="VerbatimChar"/>
-                <w:sz w:val="20"/>
-              </w:rPr>
-              <w:t xml:space="preserve">panel_demo.py</w:t>
-            </w:r>
-          </w:p>
-        </w:tc>
-      </w:tr>
-      <w:tr>
-        <w:tc>
-          <w:tcPr/>
-          <w:p>
-            <w:pPr>
-              <w:pStyle w:val="Compact"/>
-              <w:spacing w:after="40" w:line="240" w:lineRule="auto"/>
-              <w:jc w:val="left"/>
-            </w:pPr>
-            <w:r>
-              <w:rPr>
-                <w:sz w:val="20"/>
-              </w:rPr>
-              <w:t xml:space="preserve">5.11</w:t>
-            </w:r>
-          </w:p>
-        </w:tc>
-        <w:tc>
-          <w:tcPr/>
-          <w:p>
-            <w:pPr>
-              <w:pStyle w:val="Compact"/>
-              <w:spacing w:after="40" w:line="240" w:lineRule="auto"/>
-              <w:jc w:val="left"/>
-            </w:pPr>
-            <w:r>
-              <w:rPr>
-                <w:sz w:val="20"/>
-              </w:rPr>
-              <w:t xml:space="preserve">Console output of the report card</w:t>
-            </w:r>
-          </w:p>
-        </w:tc>
-        <w:tc>
-          <w:tcPr/>
-          <w:p>
-            <w:pPr>
-              <w:pStyle w:val="Compact"/>
-              <w:spacing w:after="40" w:line="240" w:lineRule="auto"/>
-              <w:jc w:val="left"/>
-            </w:pPr>
-            <w:r>
-              <w:rPr>
-                <w:rStyle w:val="VerbatimChar"/>
-                <w:sz w:val="20"/>
-              </w:rPr>
-              <w:t xml:space="preserve">health_report.py</w:t>
-            </w:r>
-          </w:p>
-        </w:tc>
-      </w:tr>
-      <w:tr>
-        <w:tc>
-          <w:tcPr/>
-          <w:p>
-            <w:pPr>
-              <w:pStyle w:val="Compact"/>
-              <w:spacing w:after="40" w:line="240" w:lineRule="auto"/>
-              <w:jc w:val="left"/>
-            </w:pPr>
-            <w:r>
-              <w:rPr>
-                <w:sz w:val="20"/>
-              </w:rPr>
-              <w:t xml:space="preserve">Figs. 5.2, 5.3, 5.4</w:t>
-            </w:r>
-          </w:p>
-        </w:tc>
-        <w:tc>
-          <w:tcPr/>
-          <w:p>
-            <w:pPr>
-              <w:pStyle w:val="Compact"/>
-              <w:spacing w:after="40" w:line="240" w:lineRule="auto"/>
-              <w:jc w:val="left"/>
-            </w:pPr>
-            <w:r>
-              <w:rPr>
-                <w:rStyle w:val="VerbatimChar"/>
-                <w:sz w:val="20"/>
-              </w:rPr>
-              <w:t xml:space="preserve">reports/figures/</w:t>
-            </w:r>
-            <w:r>
-              <w:rPr>
-                <w:rStyle w:val="VerbatimChar"/>
-                <w:sz w:val="20"/>
-              </w:rPr>
-              <w:t xml:space="preserve">results_*.png</w:t>
-            </w:r>
-          </w:p>
-        </w:tc>
-        <w:tc>
-          <w:tcPr/>
-          <w:p>
-            <w:pPr>
-              <w:pStyle w:val="Compact"/>
-              <w:spacing w:after="40" w:line="240" w:lineRule="auto"/>
-              <w:jc w:val="left"/>
-            </w:pPr>
-            <w:r>
-              <w:rPr>
-                <w:rStyle w:val="VerbatimChar"/>
-                <w:sz w:val="20"/>
-              </w:rPr>
-              <w:t xml:space="preserve">export_results.py</w:t>
-            </w:r>
-          </w:p>
-        </w:tc>
-      </w:tr>
-    </w:tbl>
-    <w:bookmarkEnd w:id="172"/>
-    <w:bookmarkStart w:id="174" w:name="appendix-b"/>
-    <w:p>
-      <w:pPr>
-        <w:pStyle w:val="Heading1"/>
-      </w:pPr>
-      <w:r>
-        <w:t>APPENDIX B</w:t>
-      </w:r>
-    </w:p>
-    <w:p>
-      <w:pPr>
-        <w:pStyle w:val="FirstParagraph"/>
-      </w:pPr>
-      <w:r>
-        <w:rPr>
-          <w:bCs/>
-          <w:b/>
-        </w:rPr>
-        <w:t xml:space="preserve">Reproducing the System and the Results</w:t>
-      </w:r>
-    </w:p>
-    <w:p>
-      <w:pPr>
-        <w:pStyle w:val="BodyText"/>
-      </w:pPr>
-      <w:r>
-        <w:t xml:space="preserve">The repository is</w:t>
-      </w:r>
-      <w:r>
-        <w:t xml:space="preserve"> </w:t>
-      </w:r>
-      <w:hyperlink r:id="rId173">
-        <w:r>
-          <w:rPr>
-            <w:rStyle w:val="Hyperlink"/>
-          </w:rPr>
-          <w:t xml:space="preserve">https://github.com/Navvu-gityhub/Behavior-Aware-BMS</w:t>
-        </w:r>
-      </w:hyperlink>
-      <w:r>
-        <w:t xml:space="preserve">. The commands below run on a fresh clone with no hardware, no database, no API keys and no dataset download.</w:t>
-      </w:r>
-    </w:p>
-    <w:p>
-      <w:pPr>
-        <w:pStyle w:val="SourceCode"/>
-        <w:spacing w:line="240" w:lineRule="auto"/>
-      </w:pPr>
-      <w:r>
-        <w:rPr>
-          <w:rStyle w:val="VerbatimChar"/>
-        </w:rPr>
-        <w:t xml:space="preserve">git clone \</w:t>
-      </w:r>
-      <w:r>
-        <w:br/>
-      </w:r>
-      <w:r>
-        <w:rPr>
-          <w:rStyle w:val="VerbatimChar"/>
-        </w:rPr>
-        <w:t xml:space="preserve">    https://github.com/Navvu-gityhub/Behavior-Aware-BMS.git</w:t>
-      </w:r>
-      <w:r>
-        <w:br/>
-      </w:r>
-      <w:r>
-        <w:rPr>
-          <w:rStyle w:val="VerbatimChar"/>
-        </w:rPr>
-        <w:t xml:space="preserve">cd Behavior-Aware-BMS</w:t>
-      </w:r>
-      <w:r>
-        <w:br/>
-      </w:r>
-      <w:r>
-        <w:rPr>
-          <w:rStyle w:val="VerbatimChar"/>
-        </w:rPr>
-        <w:t xml:space="preserve">pip install -r requirements-dev.txt</w:t>
-      </w:r>
-      <w:r>
-        <w:br/>
-      </w:r>
-      <w:r>
-        <w:br/>
-      </w:r>
-      <w:r>
-        <w:rPr>
-          <w:rStyle w:val="VerbatimChar"/>
-        </w:rPr>
-        <w:t xml:space="preserve">python main.py                     # end-to-end run</w:t>
-      </w:r>
-      <w:r>
-        <w:br/>
-      </w:r>
-      <w:r>
-        <w:rPr>
-          <w:rStyle w:val="VerbatimChar"/>
-        </w:rPr>
-        <w:t xml:space="preserve">python scripts/run_serial_demo.py  # emulated rig</w:t>
-      </w:r>
-      <w:r>
-        <w:br/>
-      </w:r>
-      <w:r>
-        <w:rPr>
-          <w:rStyle w:val="VerbatimChar"/>
-        </w:rPr>
-        <w:t xml:space="preserve">python scripts/health_report.py --serial \</w:t>
-      </w:r>
-      <w:r>
-        <w:br/>
-      </w:r>
-      <w:r>
-        <w:rPr>
-          <w:rStyle w:val="VerbatimChar"/>
-        </w:rPr>
-        <w:t xml:space="preserve">    data/interim/rig_stage_b_voltage_verified.txt</w:t>
-      </w:r>
-      <w:r>
-        <w:br/>
-      </w:r>
-      <w:r>
-        <w:rPr>
-          <w:rStyle w:val="VerbatimChar"/>
-        </w:rPr>
-        <w:t xml:space="preserve">python -m pytest tests/ -q         # the test suite</w:t>
-      </w:r>
-      <w:r>
-        <w:br/>
-      </w:r>
-      <w:r>
-        <w:rPr>
-          <w:rStyle w:val="VerbatimChar"/>
-        </w:rPr>
-        <w:t xml:space="preserve">docker compose up                  # API, gateway, client</w:t>
-      </w:r>
-    </w:p>
-    <w:p>
-      <w:pPr>
-        <w:pStyle w:val="FirstParagraph"/>
-      </w:pPr>
-      <w:r>
-        <w:t xml:space="preserve">With the CALCE data downloaded, the report card of a real cell as it read at a given cycle is printed by</w:t>
-      </w:r>
-    </w:p>
-    <w:p>
-      <w:pPr>
-        <w:pStyle w:val="SourceCode"/>
-        <w:spacing w:line="240" w:lineRule="auto"/>
-      </w:pPr>
-      <w:r>
-        <w:rPr>
-          <w:rStyle w:val="VerbatimChar"/>
-        </w:rPr>
-        <w:t xml:space="preserve">python scripts/health_report.py --calce \</w:t>
-      </w:r>
-      <w:r>
-        <w:br/>
-      </w:r>
-      <w:r>
-        <w:rPr>
-          <w:rStyle w:val="VerbatimChar"/>
-        </w:rPr>
-        <w:t xml:space="preserve">    data/raw/calce/CS2/Type2/CS2_35.zip --upto-cycle 90</w:t>
-      </w:r>
-    </w:p>
-    <w:p>
-      <w:pPr>
-        <w:pStyle w:val="FirstParagraph"/>
-      </w:pPr>
-      <w:r>
-        <w:t xml:space="preserve">The raw CALCE and NASA data are not redistributed, and download locations are given in the repository.</w:t>
-      </w:r>
-    </w:p>
-    <w:bookmarkEnd w:id="174"/>
-    <w:bookmarkStart w:id="175" w:name="references"/>
+    <w:bookmarkStart w:id="172" w:name="references"/>
     <w:p>
       <w:pPr>
         <w:pStyle w:val="Heading1"/>
@@ -28268,7 +27137,7 @@
         <w:t xml:space="preserve">. Norwood, MA, USA: Artech House, 2015.</w:t>
       </w:r>
     </w:p>
-    <w:bookmarkEnd w:id="175"/>
+    <w:bookmarkEnd w:id="172"/>
     <w:sectPr>
       <w:footerReference w:type="default" r:id="rId11"/>
       <w:pgSz w:w="11906" w:h="16838"/>

</xml_diff>

<commit_message>
Report: new project title
Co-Authored-By: Claude Sonnet 5.5 <noreply@anthropic.com>
Claude-Session: https://claude.ai/code/session_01XSGpBmyyfwNpi7tuzVvNqh
</commit_message>
<xml_diff>
--- a/report/BEACON_Project_Report.docx
+++ b/report/BEACON_Project_Report.docx
@@ -15,7 +15,7 @@
           <w:i w:val="0"/>
           <w:sz w:val="28"/>
         </w:rPr>
-        <w:t>BEACON: A BEHAVIOR-AWARE SOFTWARE LAYER FOR ELECTRIC-VEHICLE BATTERY HEALTH MONITORING FROM VOLTAGE, CURRENT AND TIME</w:t>
+        <w:t>BEACON: A TELEMETRY-BASED SOFTWARE FRAMEWORK FOR STATE-OF-HEALTH AND REMAINING-USEFUL-LIFE ESTIMATION OF ELECTRIC-VEHICLE BATTERIES</w:t>
       </w:r>
     </w:p>
     <w:p>
@@ -391,7 +391,7 @@
           <w:b/>
           <w:sz w:val="24"/>
         </w:rPr>
-        <w:t>“BEACON: A BEHAVIOR-AWARE SOFTWARE LAYER FOR ELECTRIC-VEHICLE BATTERY HEALTH MONITORING FROM VOLTAGE, CURRENT AND TIME”</w:t>
+        <w:t>“BEACON: A TELEMETRY-BASED SOFTWARE FRAMEWORK FOR STATE-OF-HEALTH AND REMAINING-USEFUL-LIFE ESTIMATION OF ELECTRIC-VEHICLE BATTERIES”</w:t>
       </w:r>
       <w:r>
         <w:rPr>
@@ -807,7 +807,7 @@
         <w:rPr>
           <w:b/>
         </w:rPr>
-        <w:t>“BEACON: A BEHAVIOR-AWARE SOFTWARE LAYER FOR ELECTRIC-VEHICLE BATTERY HEALTH MONITORING FROM VOLTAGE, CURRENT AND TIME”</w:t>
+        <w:t>“BEACON: A TELEMETRY-BASED SOFTWARE FRAMEWORK FOR STATE-OF-HEALTH AND REMAINING-USEFUL-LIFE ESTIMATION OF ELECTRIC-VEHICLE BATTERIES”</w:t>
       </w:r>
       <w:r>
         <w:rPr>

</xml_diff>

<commit_message>
Report: restore appendices; add Data Availability Statement as Appendix A
Co-Authored-By: Claude Sonnet 5.5 <noreply@anthropic.com>
Claude-Session: https://claude.ai/code/session_01XSGpBmyyfwNpi7tuzVvNqh
</commit_message>
<xml_diff>
--- a/report/BEACON_Project_Report.docx
+++ b/report/BEACON_Project_Report.docx
@@ -11847,7 +11847,7 @@
         <w:pStyle w:val="FirstParagraph"/>
       </w:pPr>
       <w:r>
-        <w:t xml:space="preserve">Every reported number is regenerated by a named script from committed artifacts, and a test (</w:t>
+        <w:t xml:space="preserve">Every reported number is regenerated by a named script from committed artifacts (Appendices A and B), and a test (</w:t>
       </w:r>
       <w:r>
         <w:rPr>
@@ -18201,7 +18201,7 @@
         <w:pStyle w:val="FirstParagraph"/>
       </w:pPr>
       <w:r>
-        <w:t xml:space="preserve">This chapter reports what the system measured and interprets each result where it appears. Every number is traced to a committed artifact. Errors are mean absolute errors in SOH (0.01 equals one percentage point) per cell, summarised as a median over cells with a 95% bootstrap interval that resamples cells, unless stated otherwise. Results that failed are reported alongside those that worked.</w:t>
+        <w:t xml:space="preserve">This chapter reports what the system measured and interprets each result where it appears. Every number is traced to a committed artifact (Appendices A and B). Errors are mean absolute errors in SOH (0.01 equals one percentage point) per cell, summarised as a median over cells with a 95% bootstrap interval that resamples cells, unless stated otherwise. Results that failed are reported alongside those that worked.</w:t>
       </w:r>
     </w:p>
     <w:bookmarkStart w:id="130" w:name="X2645008fd9c42e69aa6e101a88701c5d6e9600f"/>
@@ -26360,7 +26360,1280 @@
     </w:p>
     <w:bookmarkEnd w:id="170"/>
     <w:bookmarkEnd w:id="171"/>
-    <w:bookmarkStart w:id="172" w:name="references"/>
+    <w:bookmarkStart w:id="173" w:name="appendix-a"/>
+    <w:p>
+      <w:pPr>
+        <w:pStyle w:val="Heading1"/>
+      </w:pPr>
+      <w:r>
+        <w:t>APPENDIX A</w:t>
+      </w:r>
+    </w:p>
+    <w:p>
+      <w:pPr>
+        <w:pStyle w:val="FirstParagraph"/>
+      </w:pPr>
+      <w:r>
+        <w:rPr>
+          <w:bCs/>
+          <w:b/>
+        </w:rPr>
+        <w:t xml:space="preserve">DATA AVAILABILITY STATEMENT</w:t>
+      </w:r>
+    </w:p>
+    <w:p>
+      <w:pPr>
+        <w:pStyle w:val="BodyText"/>
+      </w:pPr>
+      <w:r>
+        <w:t xml:space="preserve">The three public datasets used in this work are available from their providers and are not redistributed with the project. The NASA Prognostics Center of Excellence battery data set [15] is published in the NASA Prognostics Data Repository. The CALCE CS2 and CX2 prismatic cell cycling series [16] is published by the Center for Advanced Life Cycle Engineering at the University of Maryland. The Oxford Battery Degradation Dataset 1 [17] is published by the University of Oxford under the digital object identifier 10.5287/bodleian:KO2kdmYGg. Each dataset carries the terms of its own provider, which apply to any reuse. After download, the archives are placed in</w:t>
+      </w:r>
+      <w:r>
+        <w:t xml:space="preserve"> </w:t>
+      </w:r>
+      <w:r>
+        <w:rPr>
+          <w:rStyle w:val="VerbatimChar"/>
+        </w:rPr>
+        <w:t xml:space="preserve">data/raw/nasa/</w:t>
+      </w:r>
+      <w:r>
+        <w:t xml:space="preserve">,</w:t>
+      </w:r>
+      <w:r>
+        <w:t xml:space="preserve"> </w:t>
+      </w:r>
+      <w:r>
+        <w:rPr>
+          <w:rStyle w:val="VerbatimChar"/>
+        </w:rPr>
+        <w:t xml:space="preserve">data/raw/calce/</w:t>
+      </w:r>
+      <w:r>
+        <w:t xml:space="preserve"> </w:t>
+      </w:r>
+      <w:r>
+        <w:t xml:space="preserve">and</w:t>
+      </w:r>
+      <w:r>
+        <w:t xml:space="preserve"> </w:t>
+      </w:r>
+      <w:r>
+        <w:rPr>
+          <w:rStyle w:val="VerbatimChar"/>
+        </w:rPr>
+        <w:t xml:space="preserve">data/raw/oxford/</w:t>
+      </w:r>
+      <w:r>
+        <w:t xml:space="preserve">, which the repository excludes from version control. When a raw archive is absent, the validation script skips the stages that need it and states the reason, and does not fail.</w:t>
+      </w:r>
+    </w:p>
+    <w:p>
+      <w:pPr>
+        <w:pStyle w:val="BodyText"/>
+      </w:pPr>
+      <w:r>
+        <w:t xml:space="preserve">The results derived from these datasets are available in the project repository. Every metric, table and per-cell result quoted in this report is stored as a text file under</w:t>
+      </w:r>
+      <w:r>
+        <w:t xml:space="preserve"> </w:t>
+      </w:r>
+      <w:r>
+        <w:rPr>
+          <w:rStyle w:val="VerbatimChar"/>
+        </w:rPr>
+        <w:t xml:space="preserve">reports/</w:t>
+      </w:r>
+      <w:r>
+        <w:rPr>
+          <w:rStyle w:val="VerbatimChar"/>
+        </w:rPr>
+        <w:t xml:space="preserve">metrics/</w:t>
+      </w:r>
+      <w:r>
+        <w:t xml:space="preserve">, and the figures built from them are stored under</w:t>
+      </w:r>
+      <w:r>
+        <w:t xml:space="preserve"> </w:t>
+      </w:r>
+      <w:r>
+        <w:rPr>
+          <w:rStyle w:val="VerbatimChar"/>
+        </w:rPr>
+        <w:t xml:space="preserve">reports/</w:t>
+      </w:r>
+      <w:r>
+        <w:rPr>
+          <w:rStyle w:val="VerbatimChar"/>
+        </w:rPr>
+        <w:t xml:space="preserve">figures/</w:t>
+      </w:r>
+      <w:r>
+        <w:t xml:space="preserve">. A reader can therefore check each reported number without downloading any raw data, and can regenerate the files from the raw data with the scripts listed in Appendix B.</w:t>
+      </w:r>
+    </w:p>
+    <w:p>
+      <w:pPr>
+        <w:pStyle w:val="BodyText"/>
+      </w:pPr>
+      <w:r>
+        <w:t xml:space="preserve">The bench-rig captures recorded by the authors, including the two real captures discussed in Chapter 5, are committed as text files under</w:t>
+      </w:r>
+      <w:r>
+        <w:t xml:space="preserve"> </w:t>
+      </w:r>
+      <w:r>
+        <w:rPr>
+          <w:rStyle w:val="VerbatimChar"/>
+        </w:rPr>
+        <w:t xml:space="preserve">data/interim/</w:t>
+      </w:r>
+      <w:r>
+        <w:t xml:space="preserve">, together with the hardware telemetry log kept in the repository. They were recorded from a single commercial 18650 cell at rest and contain voltage, temperature and timing values only. They contain no personal data and no data from any private vehicle or fleet. The fleet shown by the dashboard in Chapter 4 is produced by the project’s own simulator and is labelled as simulated wherever it is displayed. The CAN decoding example is based on the publicly documented message of the Open Vehicles Monitoring System for the Renault Twizy.</w:t>
+      </w:r>
+    </w:p>
+    <w:p>
+      <w:pPr>
+        <w:pStyle w:val="BodyText"/>
+      </w:pPr>
+      <w:r>
+        <w:t xml:space="preserve">The source code of the system, the firmware, the tests, the architecture decision records and the documentation are available in the project repository at</w:t>
+      </w:r>
+      <w:r>
+        <w:t xml:space="preserve"> </w:t>
+      </w:r>
+      <w:hyperlink r:id="rId172">
+        <w:r>
+          <w:rPr>
+            <w:rStyle w:val="Hyperlink"/>
+          </w:rPr>
+          <w:t xml:space="preserve">https://github.com/Navvu-gityhub/Behavior-Aware-BMS</w:t>
+        </w:r>
+      </w:hyperlink>
+      <w:r>
+        <w:t xml:space="preserve"> </w:t>
+      </w:r>
+      <w:r>
+        <w:t xml:space="preserve">under the MIT licence. The system runs on a fresh clone without hardware, a database, an access key or a dataset download, as described in Appendix C.</w:t>
+      </w:r>
+    </w:p>
+    <w:bookmarkEnd w:id="173"/>
+    <w:bookmarkStart w:id="174" w:name="appendix-b"/>
+    <w:p>
+      <w:pPr>
+        <w:pStyle w:val="Heading1"/>
+      </w:pPr>
+      <w:r>
+        <w:t>APPENDIX B</w:t>
+      </w:r>
+    </w:p>
+    <w:p>
+      <w:pPr>
+        <w:pStyle w:val="FirstParagraph"/>
+      </w:pPr>
+      <w:r>
+        <w:rPr>
+          <w:bCs/>
+          <w:b/>
+        </w:rPr>
+        <w:t xml:space="preserve">Provenance of Every Reported Number</w:t>
+      </w:r>
+    </w:p>
+    <w:p>
+      <w:pPr>
+        <w:pStyle w:val="BodyText"/>
+      </w:pPr>
+      <w:r>
+        <w:t xml:space="preserve">Almost every number in this report is regenerated from a committed file in</w:t>
+      </w:r>
+      <w:r>
+        <w:t xml:space="preserve"> </w:t>
+      </w:r>
+      <w:r>
+        <w:rPr>
+          <w:rStyle w:val="VerbatimChar"/>
+        </w:rPr>
+        <w:t xml:space="preserve">reports/</w:t>
+      </w:r>
+      <w:r>
+        <w:rPr>
+          <w:rStyle w:val="VerbatimChar"/>
+        </w:rPr>
+        <w:t xml:space="preserve">metrics</w:t>
+      </w:r>
+      <w:r>
+        <w:t xml:space="preserve">. A small number of figures from earlier stages of the study are recorded only in the project documents (the validation matrix, the panel-defence notes and the field-SOH manuscript draft under</w:t>
+      </w:r>
+      <w:r>
+        <w:t xml:space="preserve"> </w:t>
+      </w:r>
+      <w:r>
+        <w:rPr>
+          <w:rStyle w:val="VerbatimChar"/>
+        </w:rPr>
+        <w:t xml:space="preserve">docs/</w:t>
+      </w:r>
+      <w:r>
+        <w:t xml:space="preserve">) and not in a regenerated metrics file: the 1.665% median for a ten-discharge reference, the 52% to about 10% change for the worst cell before and after the truncated-discharge fix, the 6.8% and 12.8% errors before the knee gate, and the 1.1-point bias and 56-cycle early crossing in the sparse-RUL study. They are quoted as recorded there.</w:t>
+      </w:r>
+    </w:p>
+    <w:p>
+      <w:pPr>
+        <w:pStyle w:val="BodyText"/>
+      </w:pPr>
+      <w:r>
+        <w:t xml:space="preserve">Every number in this report is regenerated by a named script from committed artifacts. Table B.1 maps each results section to the artifact under</w:t>
+      </w:r>
+      <w:r>
+        <w:t xml:space="preserve"> </w:t>
+      </w:r>
+      <w:r>
+        <w:rPr>
+          <w:rStyle w:val="VerbatimChar"/>
+        </w:rPr>
+        <w:t xml:space="preserve">reports/metrics/</w:t>
+      </w:r>
+      <w:r>
+        <w:t xml:space="preserve"> </w:t>
+      </w:r>
+      <w:r>
+        <w:t xml:space="preserve">and the script under</w:t>
+      </w:r>
+      <w:r>
+        <w:t xml:space="preserve"> </w:t>
+      </w:r>
+      <w:r>
+        <w:rPr>
+          <w:rStyle w:val="VerbatimChar"/>
+        </w:rPr>
+        <w:t xml:space="preserve">scripts/</w:t>
+      </w:r>
+      <w:r>
+        <w:t xml:space="preserve"> </w:t>
+      </w:r>
+      <w:r>
+        <w:t xml:space="preserve">that produced it.</w:t>
+      </w:r>
+    </w:p>
+    <w:p>
+      <w:pPr>
+        <w:pStyle w:val="TableCaption"/>
+      </w:pPr>
+      <w:r>
+        <w:t xml:space="preserve">Table B.1: Artifacts and Scripts Behind Each Results Section</w:t>
+      </w:r>
+    </w:p>
+    <w:tbl>
+      <w:tblPr>
+        <w:tblStyle w:val="Table"/>
+        <w:tblW w:type="pct" w:w="4400"/>
+        <w:tblLook w:firstRow="1" w:lastRow="0" w:firstColumn="0" w:lastColumn="0" w:noHBand="0" w:noVBand="0" w:val="0020"/>
+        <w:jc w:val="start"/>
+        <w:tblCaption w:val="Table B.1: Artifacts and Scripts Behind Each Results Section"/>
+        <w:tblBorders>
+          <w:top w:val="single" w:sz="4" w:color="000000"/>
+          <w:left w:val="single" w:sz="4" w:color="000000"/>
+          <w:bottom w:val="single" w:sz="4" w:color="000000"/>
+          <w:right w:val="single" w:sz="4" w:color="000000"/>
+          <w:insideH w:val="single" w:sz="4" w:color="000000"/>
+          <w:insideV w:val="single" w:sz="4" w:color="000000"/>
+        </w:tblBorders>
+      </w:tblPr>
+      <w:tblGrid>
+        <w:gridCol w:w="712"/>
+        <w:gridCol w:w="3009"/>
+        <w:gridCol w:w="3247"/>
+      </w:tblGrid>
+      <w:tr>
+        <w:trPr>
+          <w:tblHeader w:val="true"/>
+        </w:trPr>
+        <w:tc>
+          <w:tcPr/>
+          <w:p>
+            <w:pPr>
+              <w:pStyle w:val="Compact"/>
+              <w:spacing w:after="40" w:line="240" w:lineRule="auto"/>
+              <w:jc w:val="left"/>
+            </w:pPr>
+            <w:r>
+              <w:rPr>
+                <w:bCs/>
+                <w:b/>
+                <w:sz w:val="20"/>
+              </w:rPr>
+              <w:t xml:space="preserve">Section</w:t>
+            </w:r>
+          </w:p>
+        </w:tc>
+        <w:tc>
+          <w:tcPr/>
+          <w:p>
+            <w:pPr>
+              <w:pStyle w:val="Compact"/>
+              <w:spacing w:after="40" w:line="240" w:lineRule="auto"/>
+              <w:jc w:val="left"/>
+            </w:pPr>
+            <w:r>
+              <w:rPr>
+                <w:bCs/>
+                <w:b/>
+                <w:sz w:val="20"/>
+              </w:rPr>
+              <w:t xml:space="preserve">Artifact</w:t>
+            </w:r>
+          </w:p>
+        </w:tc>
+        <w:tc>
+          <w:tcPr/>
+          <w:p>
+            <w:pPr>
+              <w:pStyle w:val="Compact"/>
+              <w:spacing w:after="40" w:line="240" w:lineRule="auto"/>
+              <w:jc w:val="left"/>
+            </w:pPr>
+            <w:r>
+              <w:rPr>
+                <w:bCs/>
+                <w:b/>
+                <w:sz w:val="20"/>
+              </w:rPr>
+              <w:t xml:space="preserve">Script</w:t>
+            </w:r>
+          </w:p>
+        </w:tc>
+      </w:tr>
+      <w:tr>
+        <w:tc>
+          <w:tcPr/>
+          <w:p>
+            <w:pPr>
+              <w:pStyle w:val="Compact"/>
+              <w:spacing w:after="40" w:line="240" w:lineRule="auto"/>
+              <w:jc w:val="left"/>
+            </w:pPr>
+            <w:r>
+              <w:rPr>
+                <w:sz w:val="20"/>
+              </w:rPr>
+              <w:t xml:space="preserve">5.1</w:t>
+            </w:r>
+          </w:p>
+        </w:tc>
+        <w:tc>
+          <w:tcPr/>
+          <w:p>
+            <w:pPr>
+              <w:pStyle w:val="Compact"/>
+              <w:spacing w:after="40" w:line="240" w:lineRule="auto"/>
+              <w:jc w:val="left"/>
+            </w:pPr>
+            <w:r>
+              <w:rPr>
+                <w:rStyle w:val="VerbatimChar"/>
+                <w:sz w:val="20"/>
+              </w:rPr>
+              <w:t xml:space="preserve">benchmark_results.csv</w:t>
+            </w:r>
+            <w:r>
+              <w:rPr>
+                <w:sz w:val="20"/>
+              </w:rPr>
+              <w:t xml:space="preserve">,</w:t>
+            </w:r>
+            <w:r>
+              <w:rPr>
+                <w:sz w:val="20"/>
+              </w:rPr>
+              <w:t xml:space="preserve"> </w:t>
+            </w:r>
+            <w:r>
+              <w:rPr>
+                <w:rStyle w:val="VerbatimChar"/>
+                <w:sz w:val="20"/>
+              </w:rPr>
+              <w:t xml:space="preserve">ablation/</w:t>
+            </w:r>
+          </w:p>
+        </w:tc>
+        <w:tc>
+          <w:tcPr/>
+          <w:p>
+            <w:pPr>
+              <w:pStyle w:val="Compact"/>
+              <w:spacing w:after="40" w:line="240" w:lineRule="auto"/>
+              <w:jc w:val="left"/>
+            </w:pPr>
+            <w:r>
+              <w:rPr>
+                <w:rStyle w:val="VerbatimChar"/>
+                <w:sz w:val="20"/>
+              </w:rPr>
+              <w:t xml:space="preserve">run_benchmark_study.py</w:t>
+            </w:r>
+            <w:r>
+              <w:rPr>
+                <w:sz w:val="20"/>
+              </w:rPr>
+              <w:t xml:space="preserve">,</w:t>
+            </w:r>
+            <w:r>
+              <w:rPr>
+                <w:sz w:val="20"/>
+              </w:rPr>
+              <w:t xml:space="preserve"> </w:t>
+            </w:r>
+            <w:r>
+              <w:rPr>
+                <w:rStyle w:val="VerbatimChar"/>
+                <w:sz w:val="20"/>
+              </w:rPr>
+              <w:t xml:space="preserve">run_ablation_study.py</w:t>
+            </w:r>
+          </w:p>
+        </w:tc>
+      </w:tr>
+      <w:tr>
+        <w:tc>
+          <w:tcPr/>
+          <w:p>
+            <w:pPr>
+              <w:pStyle w:val="Compact"/>
+              <w:spacing w:after="40" w:line="240" w:lineRule="auto"/>
+              <w:jc w:val="left"/>
+            </w:pPr>
+            <w:r>
+              <w:rPr>
+                <w:sz w:val="20"/>
+              </w:rPr>
+              <w:t xml:space="preserve">5.2</w:t>
+            </w:r>
+          </w:p>
+        </w:tc>
+        <w:tc>
+          <w:tcPr/>
+          <w:p>
+            <w:pPr>
+              <w:pStyle w:val="Compact"/>
+              <w:spacing w:after="40" w:line="240" w:lineRule="auto"/>
+              <w:jc w:val="left"/>
+            </w:pPr>
+            <w:r>
+              <w:rPr>
+                <w:rStyle w:val="VerbatimChar"/>
+                <w:sz w:val="20"/>
+              </w:rPr>
+              <w:t xml:space="preserve">calce_field_soh/</w:t>
+            </w:r>
+          </w:p>
+        </w:tc>
+        <w:tc>
+          <w:tcPr/>
+          <w:p>
+            <w:pPr>
+              <w:pStyle w:val="Compact"/>
+              <w:spacing w:after="40" w:line="240" w:lineRule="auto"/>
+              <w:jc w:val="left"/>
+            </w:pPr>
+            <w:r>
+              <w:rPr>
+                <w:rStyle w:val="VerbatimChar"/>
+                <w:sz w:val="20"/>
+              </w:rPr>
+              <w:t xml:space="preserve">run_field_soh_study.py</w:t>
+            </w:r>
+          </w:p>
+        </w:tc>
+      </w:tr>
+      <w:tr>
+        <w:tc>
+          <w:tcPr/>
+          <w:p>
+            <w:pPr>
+              <w:pStyle w:val="Compact"/>
+              <w:spacing w:after="40" w:line="240" w:lineRule="auto"/>
+              <w:jc w:val="left"/>
+            </w:pPr>
+            <w:r>
+              <w:rPr>
+                <w:sz w:val="20"/>
+              </w:rPr>
+              <w:t xml:space="preserve">5.3</w:t>
+            </w:r>
+          </w:p>
+        </w:tc>
+        <w:tc>
+          <w:tcPr/>
+          <w:p>
+            <w:pPr>
+              <w:pStyle w:val="Compact"/>
+              <w:spacing w:after="40" w:line="240" w:lineRule="auto"/>
+              <w:jc w:val="left"/>
+            </w:pPr>
+            <w:r>
+              <w:rPr>
+                <w:rStyle w:val="VerbatimChar"/>
+                <w:sz w:val="20"/>
+              </w:rPr>
+              <w:t xml:space="preserve">calce_partial_soh/</w:t>
+            </w:r>
+          </w:p>
+        </w:tc>
+        <w:tc>
+          <w:tcPr/>
+          <w:p>
+            <w:pPr>
+              <w:pStyle w:val="Compact"/>
+              <w:spacing w:after="40" w:line="240" w:lineRule="auto"/>
+              <w:jc w:val="left"/>
+            </w:pPr>
+            <w:r>
+              <w:rPr>
+                <w:rStyle w:val="VerbatimChar"/>
+                <w:sz w:val="20"/>
+              </w:rPr>
+              <w:t xml:space="preserve">run_partial_soh_study.py</w:t>
+            </w:r>
+          </w:p>
+        </w:tc>
+      </w:tr>
+      <w:tr>
+        <w:tc>
+          <w:tcPr/>
+          <w:p>
+            <w:pPr>
+              <w:pStyle w:val="Compact"/>
+              <w:spacing w:after="40" w:line="240" w:lineRule="auto"/>
+              <w:jc w:val="left"/>
+            </w:pPr>
+            <w:r>
+              <w:rPr>
+                <w:sz w:val="20"/>
+              </w:rPr>
+              <w:t xml:space="preserve">5.4</w:t>
+            </w:r>
+          </w:p>
+        </w:tc>
+        <w:tc>
+          <w:tcPr/>
+          <w:p>
+            <w:pPr>
+              <w:pStyle w:val="Compact"/>
+              <w:spacing w:after="40" w:line="240" w:lineRule="auto"/>
+              <w:jc w:val="left"/>
+            </w:pPr>
+            <w:r>
+              <w:rPr>
+                <w:rStyle w:val="VerbatimChar"/>
+                <w:sz w:val="20"/>
+              </w:rPr>
+              <w:t xml:space="preserve">calce_resistance/</w:t>
+            </w:r>
+          </w:p>
+        </w:tc>
+        <w:tc>
+          <w:tcPr/>
+          <w:p>
+            <w:pPr>
+              <w:pStyle w:val="Compact"/>
+              <w:spacing w:after="40" w:line="240" w:lineRule="auto"/>
+              <w:jc w:val="left"/>
+            </w:pPr>
+            <w:r>
+              <w:rPr>
+                <w:rStyle w:val="VerbatimChar"/>
+                <w:sz w:val="20"/>
+              </w:rPr>
+              <w:t xml:space="preserve">run_resistance_study.py</w:t>
+            </w:r>
+          </w:p>
+        </w:tc>
+      </w:tr>
+      <w:tr>
+        <w:tc>
+          <w:tcPr/>
+          <w:p>
+            <w:pPr>
+              <w:pStyle w:val="Compact"/>
+              <w:spacing w:after="40" w:line="240" w:lineRule="auto"/>
+              <w:jc w:val="left"/>
+            </w:pPr>
+            <w:r>
+              <w:rPr>
+                <w:sz w:val="20"/>
+              </w:rPr>
+              <w:t xml:space="preserve">5.5</w:t>
+            </w:r>
+          </w:p>
+        </w:tc>
+        <w:tc>
+          <w:tcPr/>
+          <w:p>
+            <w:pPr>
+              <w:pStyle w:val="Compact"/>
+              <w:spacing w:after="40" w:line="240" w:lineRule="auto"/>
+              <w:jc w:val="left"/>
+            </w:pPr>
+            <w:r>
+              <w:rPr>
+                <w:rStyle w:val="VerbatimChar"/>
+                <w:sz w:val="20"/>
+              </w:rPr>
+              <w:t xml:space="preserve">calce_rul_horizon_</w:t>
+            </w:r>
+            <w:r>
+              <w:rPr>
+                <w:rStyle w:val="VerbatimChar"/>
+                <w:sz w:val="20"/>
+              </w:rPr>
+              <w:t xml:space="preserve">early_ref/</w:t>
+            </w:r>
+            <w:r>
+              <w:rPr>
+                <w:sz w:val="20"/>
+              </w:rPr>
+              <w:t xml:space="preserve">,</w:t>
+            </w:r>
+            <w:r>
+              <w:rPr>
+                <w:sz w:val="20"/>
+              </w:rPr>
+              <w:t xml:space="preserve"> </w:t>
+            </w:r>
+            <w:r>
+              <w:rPr>
+                <w:rStyle w:val="VerbatimChar"/>
+                <w:sz w:val="20"/>
+              </w:rPr>
+              <w:t xml:space="preserve">error_bands.csv</w:t>
+            </w:r>
+          </w:p>
+        </w:tc>
+        <w:tc>
+          <w:tcPr/>
+          <w:p>
+            <w:pPr>
+              <w:pStyle w:val="Compact"/>
+              <w:spacing w:after="40" w:line="240" w:lineRule="auto"/>
+              <w:jc w:val="left"/>
+            </w:pPr>
+            <w:r>
+              <w:rPr>
+                <w:rStyle w:val="VerbatimChar"/>
+                <w:sz w:val="20"/>
+              </w:rPr>
+              <w:t xml:space="preserve">run_rul_horizon_study.py</w:t>
+            </w:r>
+            <w:r>
+              <w:rPr>
+                <w:sz w:val="20"/>
+              </w:rPr>
+              <w:t xml:space="preserve">,</w:t>
+            </w:r>
+            <w:r>
+              <w:rPr>
+                <w:sz w:val="20"/>
+              </w:rPr>
+              <w:t xml:space="preserve"> </w:t>
+            </w:r>
+            <w:r>
+              <w:rPr>
+                <w:rStyle w:val="VerbatimChar"/>
+                <w:sz w:val="20"/>
+              </w:rPr>
+              <w:t xml:space="preserve">build_error_bands.py</w:t>
+            </w:r>
+          </w:p>
+        </w:tc>
+      </w:tr>
+      <w:tr>
+        <w:tc>
+          <w:tcPr/>
+          <w:p>
+            <w:pPr>
+              <w:pStyle w:val="Compact"/>
+              <w:spacing w:after="40" w:line="240" w:lineRule="auto"/>
+              <w:jc w:val="left"/>
+            </w:pPr>
+            <w:r>
+              <w:rPr>
+                <w:sz w:val="20"/>
+              </w:rPr>
+              <w:t xml:space="preserve">5.6</w:t>
+            </w:r>
+          </w:p>
+        </w:tc>
+        <w:tc>
+          <w:tcPr/>
+          <w:p>
+            <w:pPr>
+              <w:pStyle w:val="Compact"/>
+              <w:spacing w:after="40" w:line="240" w:lineRule="auto"/>
+              <w:jc w:val="left"/>
+            </w:pPr>
+            <w:r>
+              <w:rPr>
+                <w:rStyle w:val="VerbatimChar"/>
+                <w:sz w:val="20"/>
+              </w:rPr>
+              <w:t xml:space="preserve">calce_field_rul/</w:t>
+            </w:r>
+          </w:p>
+        </w:tc>
+        <w:tc>
+          <w:tcPr/>
+          <w:p>
+            <w:pPr>
+              <w:pStyle w:val="Compact"/>
+              <w:spacing w:after="40" w:line="240" w:lineRule="auto"/>
+              <w:jc w:val="left"/>
+            </w:pPr>
+            <w:r>
+              <w:rPr>
+                <w:rStyle w:val="VerbatimChar"/>
+                <w:sz w:val="20"/>
+              </w:rPr>
+              <w:t xml:space="preserve">run_field_rul_study.py</w:t>
+            </w:r>
+          </w:p>
+        </w:tc>
+      </w:tr>
+      <w:tr>
+        <w:tc>
+          <w:tcPr/>
+          <w:p>
+            <w:pPr>
+              <w:pStyle w:val="Compact"/>
+              <w:spacing w:after="40" w:line="240" w:lineRule="auto"/>
+              <w:jc w:val="left"/>
+            </w:pPr>
+            <w:r>
+              <w:rPr>
+                <w:sz w:val="20"/>
+              </w:rPr>
+              <w:t xml:space="preserve">5.7</w:t>
+            </w:r>
+          </w:p>
+        </w:tc>
+        <w:tc>
+          <w:tcPr/>
+          <w:p>
+            <w:pPr>
+              <w:pStyle w:val="Compact"/>
+              <w:spacing w:after="40" w:line="240" w:lineRule="auto"/>
+              <w:jc w:val="left"/>
+            </w:pPr>
+            <w:r>
+              <w:rPr>
+                <w:rStyle w:val="VerbatimChar"/>
+                <w:sz w:val="20"/>
+              </w:rPr>
+              <w:t xml:space="preserve">calce_sufficiency/</w:t>
+            </w:r>
+          </w:p>
+        </w:tc>
+        <w:tc>
+          <w:tcPr/>
+          <w:p>
+            <w:pPr>
+              <w:pStyle w:val="Compact"/>
+              <w:spacing w:after="40" w:line="240" w:lineRule="auto"/>
+              <w:jc w:val="left"/>
+            </w:pPr>
+            <w:r>
+              <w:rPr>
+                <w:rStyle w:val="VerbatimChar"/>
+                <w:sz w:val="20"/>
+              </w:rPr>
+              <w:t xml:space="preserve">run_sufficiency_study.py</w:t>
+            </w:r>
+          </w:p>
+        </w:tc>
+      </w:tr>
+      <w:tr>
+        <w:tc>
+          <w:tcPr/>
+          <w:p>
+            <w:pPr>
+              <w:pStyle w:val="Compact"/>
+              <w:spacing w:after="40" w:line="240" w:lineRule="auto"/>
+              <w:jc w:val="left"/>
+            </w:pPr>
+            <w:r>
+              <w:rPr>
+                <w:sz w:val="20"/>
+              </w:rPr>
+              <w:t xml:space="preserve">5.8</w:t>
+            </w:r>
+          </w:p>
+        </w:tc>
+        <w:tc>
+          <w:tcPr/>
+          <w:p>
+            <w:pPr>
+              <w:pStyle w:val="Compact"/>
+              <w:spacing w:after="40" w:line="240" w:lineRule="auto"/>
+              <w:jc w:val="left"/>
+            </w:pPr>
+            <w:r>
+              <w:rPr>
+                <w:rStyle w:val="VerbatimChar"/>
+                <w:sz w:val="20"/>
+              </w:rPr>
+              <w:t xml:space="preserve">oxford/</w:t>
+            </w:r>
+          </w:p>
+        </w:tc>
+        <w:tc>
+          <w:tcPr/>
+          <w:p>
+            <w:pPr>
+              <w:pStyle w:val="Compact"/>
+              <w:spacing w:after="40" w:line="240" w:lineRule="auto"/>
+              <w:jc w:val="left"/>
+            </w:pPr>
+            <w:r>
+              <w:rPr>
+                <w:rStyle w:val="VerbatimChar"/>
+                <w:sz w:val="20"/>
+              </w:rPr>
+              <w:t xml:space="preserve">run_oxford_study.py</w:t>
+            </w:r>
+            <w:r>
+              <w:rPr>
+                <w:sz w:val="20"/>
+              </w:rPr>
+              <w:t xml:space="preserve">,</w:t>
+            </w:r>
+            <w:r>
+              <w:rPr>
+                <w:sz w:val="20"/>
+              </w:rPr>
+              <w:t xml:space="preserve"> </w:t>
+            </w:r>
+            <w:r>
+              <w:rPr>
+                <w:rStyle w:val="VerbatimChar"/>
+                <w:sz w:val="20"/>
+              </w:rPr>
+              <w:t xml:space="preserve">run_oxford_drive_cycle.py</w:t>
+            </w:r>
+          </w:p>
+        </w:tc>
+      </w:tr>
+      <w:tr>
+        <w:tc>
+          <w:tcPr/>
+          <w:p>
+            <w:pPr>
+              <w:pStyle w:val="Compact"/>
+              <w:spacing w:after="40" w:line="240" w:lineRule="auto"/>
+              <w:jc w:val="left"/>
+            </w:pPr>
+            <w:r>
+              <w:rPr>
+                <w:sz w:val="20"/>
+              </w:rPr>
+              <w:t xml:space="preserve">5.9</w:t>
+            </w:r>
+          </w:p>
+        </w:tc>
+        <w:tc>
+          <w:tcPr/>
+          <w:p>
+            <w:pPr>
+              <w:pStyle w:val="Compact"/>
+              <w:spacing w:after="40" w:line="240" w:lineRule="auto"/>
+              <w:jc w:val="left"/>
+            </w:pPr>
+            <w:r>
+              <w:rPr>
+                <w:rStyle w:val="VerbatimChar"/>
+                <w:sz w:val="20"/>
+              </w:rPr>
+              <w:t xml:space="preserve">cross_dataset/</w:t>
+            </w:r>
+          </w:p>
+        </w:tc>
+        <w:tc>
+          <w:tcPr/>
+          <w:p>
+            <w:pPr>
+              <w:pStyle w:val="Compact"/>
+              <w:spacing w:after="40" w:line="240" w:lineRule="auto"/>
+              <w:jc w:val="left"/>
+            </w:pPr>
+            <w:r>
+              <w:rPr>
+                <w:rStyle w:val="VerbatimChar"/>
+                <w:sz w:val="20"/>
+              </w:rPr>
+              <w:t xml:space="preserve">run_cross_dataset_study.py</w:t>
+            </w:r>
+          </w:p>
+        </w:tc>
+      </w:tr>
+      <w:tr>
+        <w:tc>
+          <w:tcPr/>
+          <w:p>
+            <w:pPr>
+              <w:pStyle w:val="Compact"/>
+              <w:spacing w:after="40" w:line="240" w:lineRule="auto"/>
+              <w:jc w:val="left"/>
+            </w:pPr>
+            <w:r>
+              <w:rPr>
+                <w:sz w:val="20"/>
+              </w:rPr>
+              <w:t xml:space="preserve">5.10</w:t>
+            </w:r>
+          </w:p>
+        </w:tc>
+        <w:tc>
+          <w:tcPr/>
+          <w:p>
+            <w:pPr>
+              <w:pStyle w:val="Compact"/>
+              <w:spacing w:after="40" w:line="240" w:lineRule="auto"/>
+              <w:jc w:val="left"/>
+            </w:pPr>
+            <w:r>
+              <w:rPr>
+                <w:rStyle w:val="VerbatimChar"/>
+                <w:sz w:val="20"/>
+              </w:rPr>
+              <w:t xml:space="preserve">data/interim/rig_*.txt</w:t>
+            </w:r>
+          </w:p>
+        </w:tc>
+        <w:tc>
+          <w:tcPr/>
+          <w:p>
+            <w:pPr>
+              <w:pStyle w:val="Compact"/>
+              <w:spacing w:after="40" w:line="240" w:lineRule="auto"/>
+              <w:jc w:val="left"/>
+            </w:pPr>
+            <w:r>
+              <w:rPr>
+                <w:rStyle w:val="VerbatimChar"/>
+                <w:sz w:val="20"/>
+              </w:rPr>
+              <w:t xml:space="preserve">run_serial_demo.py</w:t>
+            </w:r>
+            <w:r>
+              <w:rPr>
+                <w:sz w:val="20"/>
+              </w:rPr>
+              <w:t xml:space="preserve">,</w:t>
+            </w:r>
+            <w:r>
+              <w:rPr>
+                <w:sz w:val="20"/>
+              </w:rPr>
+              <w:t xml:space="preserve"> </w:t>
+            </w:r>
+            <w:r>
+              <w:rPr>
+                <w:rStyle w:val="VerbatimChar"/>
+                <w:sz w:val="20"/>
+              </w:rPr>
+              <w:t xml:space="preserve">panel_demo.py</w:t>
+            </w:r>
+          </w:p>
+        </w:tc>
+      </w:tr>
+      <w:tr>
+        <w:tc>
+          <w:tcPr/>
+          <w:p>
+            <w:pPr>
+              <w:pStyle w:val="Compact"/>
+              <w:spacing w:after="40" w:line="240" w:lineRule="auto"/>
+              <w:jc w:val="left"/>
+            </w:pPr>
+            <w:r>
+              <w:rPr>
+                <w:sz w:val="20"/>
+              </w:rPr>
+              <w:t xml:space="preserve">5.11</w:t>
+            </w:r>
+          </w:p>
+        </w:tc>
+        <w:tc>
+          <w:tcPr/>
+          <w:p>
+            <w:pPr>
+              <w:pStyle w:val="Compact"/>
+              <w:spacing w:after="40" w:line="240" w:lineRule="auto"/>
+              <w:jc w:val="left"/>
+            </w:pPr>
+            <w:r>
+              <w:rPr>
+                <w:sz w:val="20"/>
+              </w:rPr>
+              <w:t xml:space="preserve">Console output of the report card</w:t>
+            </w:r>
+          </w:p>
+        </w:tc>
+        <w:tc>
+          <w:tcPr/>
+          <w:p>
+            <w:pPr>
+              <w:pStyle w:val="Compact"/>
+              <w:spacing w:after="40" w:line="240" w:lineRule="auto"/>
+              <w:jc w:val="left"/>
+            </w:pPr>
+            <w:r>
+              <w:rPr>
+                <w:rStyle w:val="VerbatimChar"/>
+                <w:sz w:val="20"/>
+              </w:rPr>
+              <w:t xml:space="preserve">health_report.py</w:t>
+            </w:r>
+          </w:p>
+        </w:tc>
+      </w:tr>
+      <w:tr>
+        <w:tc>
+          <w:tcPr/>
+          <w:p>
+            <w:pPr>
+              <w:pStyle w:val="Compact"/>
+              <w:spacing w:after="40" w:line="240" w:lineRule="auto"/>
+              <w:jc w:val="left"/>
+            </w:pPr>
+            <w:r>
+              <w:rPr>
+                <w:sz w:val="20"/>
+              </w:rPr>
+              <w:t xml:space="preserve">Figs. 5.2, 5.3, 5.4</w:t>
+            </w:r>
+          </w:p>
+        </w:tc>
+        <w:tc>
+          <w:tcPr/>
+          <w:p>
+            <w:pPr>
+              <w:pStyle w:val="Compact"/>
+              <w:spacing w:after="40" w:line="240" w:lineRule="auto"/>
+              <w:jc w:val="left"/>
+            </w:pPr>
+            <w:r>
+              <w:rPr>
+                <w:rStyle w:val="VerbatimChar"/>
+                <w:sz w:val="20"/>
+              </w:rPr>
+              <w:t xml:space="preserve">reports/figures/</w:t>
+            </w:r>
+            <w:r>
+              <w:rPr>
+                <w:rStyle w:val="VerbatimChar"/>
+                <w:sz w:val="20"/>
+              </w:rPr>
+              <w:t xml:space="preserve">results_*.png</w:t>
+            </w:r>
+          </w:p>
+        </w:tc>
+        <w:tc>
+          <w:tcPr/>
+          <w:p>
+            <w:pPr>
+              <w:pStyle w:val="Compact"/>
+              <w:spacing w:after="40" w:line="240" w:lineRule="auto"/>
+              <w:jc w:val="left"/>
+            </w:pPr>
+            <w:r>
+              <w:rPr>
+                <w:rStyle w:val="VerbatimChar"/>
+                <w:sz w:val="20"/>
+              </w:rPr>
+              <w:t xml:space="preserve">export_results.py</w:t>
+            </w:r>
+          </w:p>
+        </w:tc>
+      </w:tr>
+    </w:tbl>
+    <w:bookmarkEnd w:id="174"/>
+    <w:bookmarkStart w:id="175" w:name="appendix-c"/>
+    <w:p>
+      <w:pPr>
+        <w:pStyle w:val="Heading1"/>
+      </w:pPr>
+      <w:r>
+        <w:t>APPENDIX C</w:t>
+      </w:r>
+    </w:p>
+    <w:p>
+      <w:pPr>
+        <w:pStyle w:val="FirstParagraph"/>
+      </w:pPr>
+      <w:r>
+        <w:rPr>
+          <w:bCs/>
+          <w:b/>
+        </w:rPr>
+        <w:t xml:space="preserve">Reproducing the System and the Results</w:t>
+      </w:r>
+    </w:p>
+    <w:p>
+      <w:pPr>
+        <w:pStyle w:val="BodyText"/>
+      </w:pPr>
+      <w:r>
+        <w:t xml:space="preserve">The repository is</w:t>
+      </w:r>
+      <w:r>
+        <w:t xml:space="preserve"> </w:t>
+      </w:r>
+      <w:hyperlink r:id="rId172">
+        <w:r>
+          <w:rPr>
+            <w:rStyle w:val="Hyperlink"/>
+          </w:rPr>
+          <w:t xml:space="preserve">https://github.com/Navvu-gityhub/Behavior-Aware-BMS</w:t>
+        </w:r>
+      </w:hyperlink>
+      <w:r>
+        <w:t xml:space="preserve">. The commands below run on a fresh clone with no hardware, no database, no API keys and no dataset download.</w:t>
+      </w:r>
+    </w:p>
+    <w:p>
+      <w:pPr>
+        <w:pStyle w:val="SourceCode"/>
+        <w:spacing w:line="240" w:lineRule="auto"/>
+      </w:pPr>
+      <w:r>
+        <w:rPr>
+          <w:rStyle w:val="VerbatimChar"/>
+        </w:rPr>
+        <w:t xml:space="preserve">git clone \</w:t>
+      </w:r>
+      <w:r>
+        <w:br/>
+      </w:r>
+      <w:r>
+        <w:rPr>
+          <w:rStyle w:val="VerbatimChar"/>
+        </w:rPr>
+        <w:t xml:space="preserve">    https://github.com/Navvu-gityhub/Behavior-Aware-BMS.git</w:t>
+      </w:r>
+      <w:r>
+        <w:br/>
+      </w:r>
+      <w:r>
+        <w:rPr>
+          <w:rStyle w:val="VerbatimChar"/>
+        </w:rPr>
+        <w:t xml:space="preserve">cd Behavior-Aware-BMS</w:t>
+      </w:r>
+      <w:r>
+        <w:br/>
+      </w:r>
+      <w:r>
+        <w:rPr>
+          <w:rStyle w:val="VerbatimChar"/>
+        </w:rPr>
+        <w:t xml:space="preserve">pip install -r requirements-dev.txt</w:t>
+      </w:r>
+      <w:r>
+        <w:br/>
+      </w:r>
+      <w:r>
+        <w:br/>
+      </w:r>
+      <w:r>
+        <w:rPr>
+          <w:rStyle w:val="VerbatimChar"/>
+        </w:rPr>
+        <w:t xml:space="preserve">python main.py                     # end-to-end run</w:t>
+      </w:r>
+      <w:r>
+        <w:br/>
+      </w:r>
+      <w:r>
+        <w:rPr>
+          <w:rStyle w:val="VerbatimChar"/>
+        </w:rPr>
+        <w:t xml:space="preserve">python scripts/run_serial_demo.py  # emulated rig</w:t>
+      </w:r>
+      <w:r>
+        <w:br/>
+      </w:r>
+      <w:r>
+        <w:rPr>
+          <w:rStyle w:val="VerbatimChar"/>
+        </w:rPr>
+        <w:t xml:space="preserve">python scripts/health_report.py --serial \</w:t>
+      </w:r>
+      <w:r>
+        <w:br/>
+      </w:r>
+      <w:r>
+        <w:rPr>
+          <w:rStyle w:val="VerbatimChar"/>
+        </w:rPr>
+        <w:t xml:space="preserve">    data/interim/rig_stage_b_voltage_verified.txt</w:t>
+      </w:r>
+      <w:r>
+        <w:br/>
+      </w:r>
+      <w:r>
+        <w:rPr>
+          <w:rStyle w:val="VerbatimChar"/>
+        </w:rPr>
+        <w:t xml:space="preserve">python -m pytest tests/ -q         # the test suite</w:t>
+      </w:r>
+      <w:r>
+        <w:br/>
+      </w:r>
+      <w:r>
+        <w:rPr>
+          <w:rStyle w:val="VerbatimChar"/>
+        </w:rPr>
+        <w:t xml:space="preserve">docker compose up                  # API, gateway, client</w:t>
+      </w:r>
+    </w:p>
+    <w:p>
+      <w:pPr>
+        <w:pStyle w:val="FirstParagraph"/>
+      </w:pPr>
+      <w:r>
+        <w:t xml:space="preserve">With the CALCE data downloaded, the report card of a real cell as it read at a given cycle is printed by</w:t>
+      </w:r>
+    </w:p>
+    <w:p>
+      <w:pPr>
+        <w:pStyle w:val="SourceCode"/>
+        <w:spacing w:line="240" w:lineRule="auto"/>
+      </w:pPr>
+      <w:r>
+        <w:rPr>
+          <w:rStyle w:val="VerbatimChar"/>
+        </w:rPr>
+        <w:t xml:space="preserve">python scripts/health_report.py --calce \</w:t>
+      </w:r>
+      <w:r>
+        <w:br/>
+      </w:r>
+      <w:r>
+        <w:rPr>
+          <w:rStyle w:val="VerbatimChar"/>
+        </w:rPr>
+        <w:t xml:space="preserve">    data/raw/calce/CS2/Type2/CS2_35.zip --upto-cycle 90</w:t>
+      </w:r>
+    </w:p>
+    <w:p>
+      <w:pPr>
+        <w:pStyle w:val="FirstParagraph"/>
+      </w:pPr>
+      <w:r>
+        <w:t xml:space="preserve">The raw CALCE, NASA and Oxford data are not redistributed; their sources are given in Appendix A.</w:t>
+      </w:r>
+    </w:p>
+    <w:bookmarkEnd w:id="175"/>
+    <w:bookmarkStart w:id="176" w:name="references"/>
     <w:p>
       <w:pPr>
         <w:pStyle w:val="Heading1"/>
@@ -27137,7 +28410,7 @@
         <w:t xml:space="preserve">. Norwood, MA, USA: Artech House, 2015.</w:t>
       </w:r>
     </w:p>
-    <w:bookmarkEnd w:id="172"/>
+    <w:bookmarkEnd w:id="176"/>
     <w:sectPr>
       <w:footerReference w:type="default" r:id="rId11"/>
       <w:pgSz w:w="11906" w:h="16838"/>

</xml_diff>

<commit_message>
Report: professional, concise headings and table captions throughout
Co-Authored-By: Claude Sonnet 5.5 <noreply@anthropic.com>
Claude-Session: https://claude.ai/code/session_01XSGpBmyyfwNpi7tuzVvNqh
</commit_message>
<xml_diff>
--- a/report/BEACON_Project_Report.docx
+++ b/report/BEACON_Project_Report.docx
@@ -2847,13 +2847,13 @@
     </w:p>
     <w:bookmarkEnd w:id="27"/>
     <w:bookmarkEnd w:id="28"/>
-    <w:bookmarkStart w:id="29" w:name="proposed-approach-in-brief"/>
+    <w:bookmarkStart w:id="29" w:name="proposed-approach"/>
     <w:p>
       <w:pPr>
         <w:pStyle w:val="Heading2"/>
       </w:pPr>
       <w:r>
-        <w:t>PROPOSED APPROACH IN BRIEF</w:t>
+        <w:t>PROPOSED APPROACH</w:t>
       </w:r>
     </w:p>
     <w:p>
@@ -3422,13 +3422,13 @@
       </w:r>
     </w:p>
     <w:bookmarkEnd w:id="33"/>
-    <w:bookmarkStart w:id="34" w:name="X9e9831f21f9c5525e7acb34f922108bfd4d6755"/>
+    <w:bookmarkStart w:id="34" w:name="X8455c3361044a3e3dec5aec4db2002679c3ec35"/>
     <w:p>
       <w:pPr>
         <w:pStyle w:val="Heading2"/>
       </w:pPr>
       <w:r>
-        <w:t>DATA-DRIVEN SOH ESTIMATION AND HOW IT IS VALIDATED</w:t>
+        <w:t>DATA-DRIVEN SOH ESTIMATION AND ITS VALIDATION</w:t>
       </w:r>
     </w:p>
     <w:p>
@@ -3533,13 +3533,13 @@
       </w:r>
     </w:p>
     <w:bookmarkEnd w:id="36"/>
-    <w:bookmarkStart w:id="37" w:name="public-datasets-used"/>
+    <w:bookmarkStart w:id="37" w:name="public-datasets"/>
     <w:p>
       <w:pPr>
         <w:pStyle w:val="Heading2"/>
       </w:pPr>
       <w:r>
-        <w:t>PUBLIC DATASETS USED</w:t>
+        <w:t>PUBLIC DATASETS</w:t>
       </w:r>
     </w:p>
     <w:p>
@@ -3654,13 +3654,13 @@
       </w:r>
     </w:p>
     <w:bookmarkEnd w:id="37"/>
-    <w:bookmarkStart w:id="38" w:name="Xa011e95ed21bbcdac3cbe7e6ae007553a5206cb"/>
+    <w:bookmarkStart w:id="38" w:name="Xa39130d3921a9bde7cbaf2aeef74cb1da87ba6a"/>
     <w:p>
       <w:pPr>
         <w:pStyle w:val="Heading2"/>
       </w:pPr>
       <w:r>
-        <w:t>TELEMETRY ACQUISITION IN VEHICLES AND ON THE BENCH</w:t>
+        <w:t>TELEMETRY ACQUISITION IN VEHICLES AND LABORATORY RIGS</w:t>
       </w:r>
     </w:p>
     <w:p>
@@ -4000,13 +4000,13 @@
       </w:r>
     </w:p>
     <w:bookmarkEnd w:id="42"/>
-    <w:bookmarkStart w:id="43" w:name="serial-bench-rigs"/>
+    <w:bookmarkStart w:id="43" w:name="serial-laboratory-rigs"/>
     <w:p>
       <w:pPr>
         <w:pStyle w:val="Heading3"/>
       </w:pPr>
       <w:r>
-        <w:t xml:space="preserve">Serial Bench Rigs</w:t>
+        <w:t xml:space="preserve">Serial Laboratory Rigs</w:t>
       </w:r>
     </w:p>
     <w:p>
@@ -4055,13 +4055,13 @@
       </w:r>
     </w:p>
     <w:bookmarkEnd w:id="46"/>
-    <w:bookmarkStart w:id="47" w:name="explainability-and-honest-reporting"/>
+    <w:bookmarkStart w:id="47" w:name="explainability-and-output-transparency"/>
     <w:p>
       <w:pPr>
         <w:pStyle w:val="Heading2"/>
       </w:pPr>
       <w:r>
-        <w:t>EXPLAINABILITY AND HONEST REPORTING</w:t>
+        <w:t>EXPLAINABILITY AND OUTPUT TRANSPARENCY</w:t>
       </w:r>
     </w:p>
     <w:p>
@@ -4073,13 +4073,13 @@
       </w:r>
     </w:p>
     <w:bookmarkEnd w:id="47"/>
-    <w:bookmarkStart w:id="48" w:name="validation-practice-and-leakage"/>
+    <w:bookmarkStart w:id="48" w:name="validation-practice-and-data-leakage"/>
     <w:p>
       <w:pPr>
         <w:pStyle w:val="Heading2"/>
       </w:pPr>
       <w:r>
-        <w:t>VALIDATION PRACTICE AND LEAKAGE</w:t>
+        <w:t>VALIDATION PRACTICE AND DATA LEAKAGE</w:t>
       </w:r>
     </w:p>
     <w:p>
@@ -4095,7 +4095,7 @@
         <w:pStyle w:val="TableCaption"/>
       </w:pPr>
       <w:r>
-        <w:t xml:space="preserve">Table 2.2: Validation Splits and What Each One Tests</w:t>
+        <w:t xml:space="preserve">Table 2.2: Validation Splits and Their Purpose</w:t>
       </w:r>
     </w:p>
     <w:tbl>
@@ -4104,7 +4104,7 @@
         <w:tblW w:type="pct" w:w="4200"/>
         <w:tblLook w:firstRow="1" w:lastRow="0" w:firstColumn="0" w:lastColumn="0" w:noHBand="0" w:noVBand="0" w:val="0020"/>
         <w:jc w:val="start"/>
-        <w:tblCaption w:val="Table 2.2: Validation Splits and What Each One Tests"/>
+        <w:tblCaption w:val="Table 2.2: Validation Splits and Their Purpose"/>
         <w:tblBorders>
           <w:top w:val="single" w:sz="4" w:color="000000"/>
           <w:left w:val="single" w:sz="4" w:color="000000"/>
@@ -4330,13 +4330,13 @@
       </w:tr>
     </w:tbl>
     <w:bookmarkEnd w:id="48"/>
-    <w:bookmarkStart w:id="49" w:name="positioning-of-this-work"/>
+    <w:bookmarkStart w:id="49" w:name="comparison-of-approach-families"/>
     <w:p>
       <w:pPr>
         <w:pStyle w:val="Heading2"/>
       </w:pPr>
       <w:r>
-        <w:t>POSITIONING OF THIS WORK</w:t>
+        <w:t>COMPARISON OF APPROACH FAMILIES</w:t>
       </w:r>
     </w:p>
     <w:p>
@@ -4352,7 +4352,7 @@
         <w:pStyle w:val="TableCaption"/>
       </w:pPr>
       <w:r>
-        <w:t xml:space="preserve">Table 2.3: Approach Families and the Properties That Matter for a Deployed Layer</w:t>
+        <w:t xml:space="preserve">Table 2.3: Comparison of Approach Families</w:t>
       </w:r>
     </w:p>
     <w:tbl>
@@ -4361,7 +4361,7 @@
         <w:tblW w:type="pct" w:w="4000"/>
         <w:tblLook w:firstRow="1" w:lastRow="0" w:firstColumn="0" w:lastColumn="0" w:noHBand="0" w:noVBand="0" w:val="0020"/>
         <w:jc w:val="start"/>
-        <w:tblCaption w:val="Table 2.3: Approach Families and the Properties That Matter for a Deployed Layer"/>
+        <w:tblCaption w:val="Table 2.3: Comparison of Approach Families"/>
         <w:tblBorders>
           <w:top w:val="single" w:sz="4" w:color="000000"/>
           <w:left w:val="single" w:sz="4" w:color="000000"/>
@@ -4786,13 +4786,13 @@
       </w:tr>
     </w:tbl>
     <w:bookmarkEnd w:id="49"/>
-    <w:bookmarkStart w:id="50" w:name="X3d8b69131e03b137685df6cbfaaf9042b5ef7af"/>
+    <w:bookmarkStart w:id="50" w:name="identified-research-gaps"/>
     <w:p>
       <w:pPr>
         <w:pStyle w:val="Heading2"/>
       </w:pPr>
       <w:r>
-        <w:t>IDENTIFIED GAPS AND HOW THEY ARE ADDRESSED</w:t>
+        <w:t>IDENTIFIED RESEARCH GAPS</w:t>
       </w:r>
     </w:p>
     <w:p>
@@ -4808,7 +4808,7 @@
         <w:pStyle w:val="TableCaption"/>
       </w:pPr>
       <w:r>
-        <w:t xml:space="preserve">Table 2.4: Gaps in the Literature and Where They Are Addressed</w:t>
+        <w:t xml:space="preserve">Table 2.4: Research Gaps and Corresponding Report Sections</w:t>
       </w:r>
     </w:p>
     <w:tbl>
@@ -4817,7 +4817,7 @@
         <w:tblW w:type="pct" w:w="3800"/>
         <w:tblLook w:firstRow="1" w:lastRow="0" w:firstColumn="0" w:lastColumn="0" w:noHBand="0" w:noVBand="0" w:val="0020"/>
         <w:jc w:val="start"/>
-        <w:tblCaption w:val="Table 2.4: Gaps in the Literature and Where They Are Addressed"/>
+        <w:tblCaption w:val="Table 2.4: Research Gaps and Corresponding Report Sections"/>
         <w:tblBorders>
           <w:top w:val="single" w:sz="4" w:color="000000"/>
           <w:left w:val="single" w:sz="4" w:color="000000"/>
@@ -5908,13 +5908,13 @@
         <w:t xml:space="preserve">Figure 3.1: Overall system framework: three transports, one unified frame, one scoring function, and the service tier.</w:t>
       </w:r>
     </w:p>
-    <w:bookmarkStart w:id="60" w:name="single-shared-scoring-path"/>
+    <w:bookmarkStart w:id="60" w:name="unified-scoring-function"/>
     <w:p>
       <w:pPr>
         <w:pStyle w:val="Heading3"/>
       </w:pPr>
       <w:r>
-        <w:t xml:space="preserve">Single Shared Scoring Path</w:t>
+        <w:t xml:space="preserve">Unified Scoring Function</w:t>
       </w:r>
     </w:p>
     <w:p>
@@ -7424,13 +7424,13 @@
       </w:r>
     </w:p>
     <w:bookmarkEnd w:id="66"/>
-    <w:bookmarkStart w:id="67" w:name="from-telemetry-to-discharges"/>
+    <w:bookmarkStart w:id="67" w:name="discharge-segmentation"/>
     <w:p>
       <w:pPr>
         <w:pStyle w:val="Heading2"/>
       </w:pPr>
       <w:r>
-        <w:t>FROM TELEMETRY TO DISCHARGES</w:t>
+        <w:t>DISCHARGE SEGMENTATION</w:t>
       </w:r>
     </w:p>
     <w:p>
@@ -7537,13 +7537,13 @@
       </w:r>
     </w:p>
     <w:bookmarkEnd w:id="67"/>
-    <w:bookmarkStart w:id="71" w:name="voltage-window-state-of-health"/>
+    <w:bookmarkStart w:id="71" w:name="voltage-window-soh-estimation"/>
     <w:p>
       <w:pPr>
         <w:pStyle w:val="Heading2"/>
       </w:pPr>
       <w:r>
-        <w:t>VOLTAGE-WINDOW STATE OF HEALTH</w:t>
+        <w:t>VOLTAGE-WINDOW SOH ESTIMATION</w:t>
       </w:r>
     </w:p>
     <w:p>
@@ -8024,13 +8024,13 @@
       </w:r>
     </w:p>
     <w:bookmarkEnd w:id="71"/>
-    <w:bookmarkStart w:id="72" w:name="X67f8cf879d277e0ff2db2a9f13519561af31b7f"/>
+    <w:bookmarkStart w:id="72" w:name="Xb308349b9300f2d681d5573f6a2e63602e87959"/>
     <w:p>
       <w:pPr>
         <w:pStyle w:val="Heading2"/>
       </w:pPr>
       <w:r>
-        <w:t>RESISTANCE FROM THE LOAD STEP AND OHMIC CORRECTION</w:t>
+        <w:t>INTERNAL RESISTANCE ESTIMATION AND OHMIC CORRECTION</w:t>
       </w:r>
     </w:p>
     <w:p>
@@ -8472,13 +8472,13 @@
       </w:r>
     </w:p>
     <w:bookmarkEnd w:id="72"/>
-    <w:bookmarkStart w:id="73" w:name="refusal-gates-and-data-quality-checks"/>
+    <w:bookmarkStart w:id="73" w:name="X16af0abdf32672f4951b968c95928ed829450a0"/>
     <w:p>
       <w:pPr>
         <w:pStyle w:val="Heading2"/>
       </w:pPr>
       <w:r>
-        <w:t>REFUSAL GATES AND DATA-QUALITY CHECKS</w:t>
+        <w:t>DATA-QUALITY GATES AND REFUSAL CONDITIONS</w:t>
       </w:r>
     </w:p>
     <w:p>
@@ -9039,13 +9039,13 @@
       </w:r>
     </w:p>
     <w:bookmarkEnd w:id="75"/>
-    <w:bookmarkStart w:id="76" w:name="evidence-sufficiency"/>
+    <w:bookmarkStart w:id="76" w:name="evidence-sufficiency-criterion"/>
     <w:p>
       <w:pPr>
         <w:pStyle w:val="Heading2"/>
       </w:pPr>
       <w:r>
-        <w:t>EVIDENCE SUFFICIENCY</w:t>
+        <w:t>EVIDENCE SUFFICIENCY CRITERION</w:t>
       </w:r>
     </w:p>
     <w:p>
@@ -9682,13 +9682,13 @@
       </w:r>
     </w:p>
     <w:bookmarkEnd w:id="76"/>
-    <w:bookmarkStart w:id="77" w:name="behaviour-scoring-layer-heuristic"/>
+    <w:bookmarkStart w:id="77" w:name="heuristic-behaviour-scoring-layer"/>
     <w:p>
       <w:pPr>
         <w:pStyle w:val="Heading2"/>
       </w:pPr>
       <w:r>
-        <w:t>BEHAVIOUR SCORING LAYER (HEURISTIC)</w:t>
+        <w:t>HEURISTIC BEHAVIOUR SCORING LAYER</w:t>
       </w:r>
     </w:p>
     <w:p>
@@ -10334,13 +10334,13 @@
       </w:r>
     </w:p>
     <w:bookmarkEnd w:id="78"/>
-    <w:bookmarkStart w:id="79" w:name="design-decisions"/>
+    <w:bookmarkStart w:id="79" w:name="design-decision-records"/>
     <w:p>
       <w:pPr>
         <w:pStyle w:val="Heading2"/>
       </w:pPr>
       <w:r>
-        <w:t>DESIGN DECISIONS</w:t>
+        <w:t>DESIGN DECISION RECORDS</w:t>
       </w:r>
     </w:p>
     <w:p>
@@ -13997,13 +13997,13 @@
     </w:tbl>
     <w:bookmarkEnd w:id="97"/>
     <w:bookmarkEnd w:id="98"/>
-    <w:bookmarkStart w:id="99" w:name="refusal-gates"/>
+    <w:bookmarkStart w:id="99" w:name="implementation-of-refusal-gates"/>
     <w:p>
       <w:pPr>
         <w:pStyle w:val="Heading2"/>
       </w:pPr>
       <w:r>
-        <w:t>REFUSAL GATES</w:t>
+        <w:t>IMPLEMENTATION OF REFUSAL GATES</w:t>
       </w:r>
     </w:p>
     <w:p>
@@ -14019,7 +14019,7 @@
         <w:pStyle w:val="TableCaption"/>
       </w:pPr>
       <w:r>
-        <w:t xml:space="preserve">Table 4.4: Gates and What Each Prevents</w:t>
+        <w:t xml:space="preserve">Table 4.4: Refusal Gates and Their Purpose</w:t>
       </w:r>
     </w:p>
     <w:tbl>
@@ -14028,7 +14028,7 @@
         <w:tblW w:type="pct" w:w="4350"/>
         <w:tblLook w:firstRow="1" w:lastRow="0" w:firstColumn="0" w:lastColumn="0" w:noHBand="0" w:noVBand="0" w:val="0020"/>
         <w:jc w:val="start"/>
-        <w:tblCaption w:val="Table 4.4: Gates and What Each Prevents"/>
+        <w:tblCaption w:val="Table 4.4: Refusal Gates and Their Purpose"/>
         <w:tblBorders>
           <w:top w:val="single" w:sz="4" w:color="000000"/>
           <w:left w:val="single" w:sz="4" w:color="000000"/>
@@ -15049,13 +15049,13 @@
       </w:r>
     </w:p>
     <w:bookmarkEnd w:id="100"/>
-    <w:bookmarkStart w:id="104" w:name="as-built-rig"/>
+    <w:bookmarkStart w:id="104" w:name="implemented-rig-configuration"/>
     <w:p>
       <w:pPr>
         <w:pStyle w:val="Heading3"/>
       </w:pPr>
       <w:r>
-        <w:t xml:space="preserve">As-Built Rig</w:t>
+        <w:t xml:space="preserve">Implemented Rig Configuration</w:t>
       </w:r>
     </w:p>
     <w:p>
@@ -15071,7 +15071,7 @@
         <w:pStyle w:val="TableCaption"/>
       </w:pPr>
       <w:r>
-        <w:t xml:space="preserve">Table 4.6: Design Document Versus As-Built Rig</w:t>
+        <w:t xml:space="preserve">Table 4.6: Design Specification Versus Implemented Rig</w:t>
       </w:r>
     </w:p>
     <w:tbl>
@@ -15080,7 +15080,7 @@
         <w:tblW w:type="pct" w:w="4200"/>
         <w:tblLook w:firstRow="1" w:lastRow="0" w:firstColumn="0" w:lastColumn="0" w:noHBand="0" w:noVBand="0" w:val="0020"/>
         <w:jc w:val="start"/>
-        <w:tblCaption w:val="Table 4.6: Design Document Versus As-Built Rig"/>
+        <w:tblCaption w:val="Table 4.6: Design Specification Versus Implemented Rig"/>
         <w:tblBorders>
           <w:top w:val="single" w:sz="4" w:color="000000"/>
           <w:left w:val="single" w:sz="4" w:color="000000"/>
@@ -15477,7 +15477,7 @@
         <w:pStyle w:val="ImageCaption"/>
       </w:pPr>
       <w:r>
-        <w:t xml:space="preserve">Figure 4.2: As-built bench rig: measurement chain from the cell to the host.</w:t>
+        <w:t xml:space="preserve">Figure 4.2: Implemented bench rig: measurement chain from the cell to the host.</w:t>
       </w:r>
     </w:p>
     <w:p>
@@ -17158,13 +17158,13 @@
         <w:t xml:space="preserve">The one substantive finding was that three routes opened a filesystem path taken from the request body without any containment. A caller could name a private key or a configuration file, and the per-line rejection reasons returned by the serial path could carry fragments of what was read. The difference between a not-found and a parse error also revealed whether a file existed. The fix resolves the path first and requires it to lie under an allowed root, and rejects it with a client error before any existence check, so an out-of-bounds path cannot be used to probe the disk. A list of allowed roots was chosen over a blocklist of path patterns, because blocklists on path strings can be defeated by symbolic links, percent-encoding and short file names, whereas resolving first and then asking where the path ended up is decided after any such trick has been applied. The allowed roots can be replaced through an environment variable, and the variable replaces the defaults and does not extend them, so setting it cannot leave a development convenience in place. Thirteen tests cover the containment.</w:t>
       </w:r>
     </w:p>
-    <w:bookmarkStart w:id="117" w:name="what-is-deliberately-not-defended"/>
+    <w:bookmarkStart w:id="117" w:name="threats-outside-the-scope-of-the-design"/>
     <w:p>
       <w:pPr>
         <w:pStyle w:val="Heading3"/>
       </w:pPr>
       <w:r>
-        <w:t xml:space="preserve">What Is Deliberately Not Defended</w:t>
+        <w:t xml:space="preserve">Threats Outside the Scope of the Design</w:t>
       </w:r>
     </w:p>
     <w:p>
@@ -17691,7 +17691,7 @@
         <w:pStyle w:val="TableCaption"/>
       </w:pPr>
       <w:r>
-        <w:t xml:space="preserve">Table 4.12: Selected Test Modules and What They Check</w:t>
+        <w:t xml:space="preserve">Table 4.12: Selected Test Modules and Verified Behaviour</w:t>
       </w:r>
     </w:p>
     <w:tbl>
@@ -17700,7 +17700,7 @@
         <w:tblW w:type="pct" w:w="4200"/>
         <w:tblLook w:firstRow="1" w:lastRow="0" w:firstColumn="0" w:lastColumn="0" w:noHBand="0" w:noVBand="0" w:val="0020"/>
         <w:jc w:val="start"/>
-        <w:tblCaption w:val="Table 4.12: Selected Test Modules and What They Check"/>
+        <w:tblCaption w:val="Table 4.12: Selected Test Modules and Verified Behaviour"/>
         <w:tblBorders>
           <w:top w:val="single" w:sz="4" w:color="000000"/>
           <w:left w:val="single" w:sz="4" w:color="000000"/>
@@ -20564,13 +20564,13 @@
       </w:r>
     </w:p>
     <w:bookmarkEnd w:id="137"/>
-    <w:bookmarkStart w:id="138" w:name="partial-discharges"/>
+    <w:bookmarkStart w:id="138" w:name="partial-discharge-soh-estimation"/>
     <w:p>
       <w:pPr>
         <w:pStyle w:val="Heading2"/>
       </w:pPr>
       <w:r>
-        <w:t>PARTIAL DISCHARGES</w:t>
+        <w:t>PARTIAL-DISCHARGE SOH ESTIMATION</w:t>
       </w:r>
     </w:p>
     <w:p>
@@ -21073,13 +21073,13 @@
       </w:r>
     </w:p>
     <w:bookmarkEnd w:id="139"/>
-    <w:bookmarkStart w:id="143" w:name="remaining-useful-life-1"/>
+    <w:bookmarkStart w:id="143" w:name="remaining-useful-life-estimation"/>
     <w:p>
       <w:pPr>
         <w:pStyle w:val="Heading2"/>
       </w:pPr>
       <w:r>
-        <w:t>REMAINING USEFUL LIFE</w:t>
+        <w:t>REMAINING USEFUL LIFE ESTIMATION</w:t>
       </w:r>
     </w:p>
     <w:p>
@@ -21981,7 +21981,7 @@
         <w:pStyle w:val="TableCaption"/>
       </w:pPr>
       <w:r>
-        <w:t xml:space="preserve">Table 5.6: RUL from Sparse Complete Discharges; None Is Accurate Enough to Report</w:t>
+        <w:t xml:space="preserve">Table 5.6: RUL Estimation from Sparse Complete Discharges (Methods Compared)</w:t>
       </w:r>
     </w:p>
     <w:tbl>
@@ -21990,7 +21990,7 @@
         <w:tblW w:type="pct" w:w="4300"/>
         <w:tblLook w:firstRow="1" w:lastRow="0" w:firstColumn="0" w:lastColumn="0" w:noHBand="0" w:noVBand="0" w:val="0020"/>
         <w:jc w:val="start"/>
-        <w:tblCaption w:val="Table 5.6: RUL from Sparse Complete Discharges; None Is Accurate Enough to Report"/>
+        <w:tblCaption w:val="Table 5.6: RUL Estimation from Sparse Complete Discharges (Methods Compared)"/>
         <w:tblBorders>
           <w:top w:val="single" w:sz="4" w:color="000000"/>
           <w:left w:val="single" w:sz="4" w:color="000000"/>
@@ -22638,13 +22638,13 @@
       </w:r>
     </w:p>
     <w:bookmarkEnd w:id="145"/>
-    <w:bookmarkStart w:id="146" w:name="external-validation-on-a-second-dataset"/>
+    <w:bookmarkStart w:id="146" w:name="X2d21f2facf5332f769d02ecc29a7ac6dfd654e8"/>
     <w:p>
       <w:pPr>
         <w:pStyle w:val="Heading2"/>
       </w:pPr>
       <w:r>
-        <w:t>EXTERNAL VALIDATION ON A SECOND DATASET</w:t>
+        <w:t>EXTERNAL VALIDATION ON THE OXFORD DATASET</w:t>
       </w:r>
     </w:p>
     <w:p>
@@ -23054,13 +23054,13 @@
       </w:r>
     </w:p>
     <w:bookmarkEnd w:id="146"/>
-    <w:bookmarkStart w:id="147" w:name="X2f5777ec1cd3c9e2bdc40f140bc70c360603f05"/>
+    <w:bookmarkStart w:id="147" w:name="X1c8fe019f5bb14d040fa14c988ae5c385cb29e2"/>
     <w:p>
       <w:pPr>
         <w:pStyle w:val="Heading2"/>
       </w:pPr>
       <w:r>
-        <w:t>VALIDATION ON A THIRD DATASET AND REFUSAL BEHAVIOUR</w:t>
+        <w:t>CROSS-DATASET VALIDATION ON THE NASA DATASET</w:t>
       </w:r>
     </w:p>
     <w:p>
@@ -23781,13 +23781,13 @@
       </w:r>
     </w:p>
     <w:bookmarkEnd w:id="155"/>
-    <w:bookmarkStart w:id="156" w:name="Xa02a71f04cbfbaee63c846a057c53165dabfc4c"/>
+    <w:bookmarkStart w:id="156" w:name="scope-of-the-hardware-results"/>
     <w:p>
       <w:pPr>
         <w:pStyle w:val="Heading3"/>
       </w:pPr>
       <w:r>
-        <w:t xml:space="preserve">What the Hardware Result Does and Does Not Show</w:t>
+        <w:t xml:space="preserve">Scope of the Hardware Results</w:t>
       </w:r>
     </w:p>
     <w:p>
@@ -23816,13 +23816,13 @@
     </w:p>
     <w:bookmarkEnd w:id="156"/>
     <w:bookmarkEnd w:id="157"/>
-    <w:bookmarkStart w:id="158" w:name="Xd3f8ad7df265cef58eca5272d7d9dc9db31ce47"/>
+    <w:bookmarkStart w:id="158" w:name="case-study-health-report-card"/>
     <w:p>
       <w:pPr>
         <w:pStyle w:val="Heading2"/>
       </w:pPr>
       <w:r>
-        <w:t>ILLUSTRATIVE EXAMPLE: THE HEALTH REPORT CARD</w:t>
+        <w:t>CASE STUDY: HEALTH REPORT CARD</w:t>
       </w:r>
     </w:p>
     <w:p>
@@ -24437,7 +24437,7 @@
           <w:bCs/>
           <w:b/>
         </w:rPr>
-        <w:t xml:space="preserve">Validate on the Unit of Deployment.</w:t>
+        <w:t xml:space="preserve">Validation Unit.</w:t>
       </w:r>
       <w:r>
         <w:t xml:space="preserve"> </w:t>
@@ -24455,7 +24455,7 @@
           <w:bCs/>
           <w:b/>
         </w:rPr>
-        <w:t xml:space="preserve">Prefer Measurement to Fitting Where Measurement Is Possible.</w:t>
+        <w:t xml:space="preserve">Measurement Versus Fitting.</w:t>
       </w:r>
       <w:r>
         <w:t xml:space="preserve"> </w:t>
@@ -24473,7 +24473,7 @@
           <w:bCs/>
           <w:b/>
         </w:rPr>
-        <w:t xml:space="preserve">Make Refusal a Normal Output.</w:t>
+        <w:t xml:space="preserve">Refusal as an Output.</w:t>
       </w:r>
       <w:r>
         <w:t xml:space="preserve"> </w:t>
@@ -24491,7 +24491,7 @@
           <w:bCs/>
           <w:b/>
         </w:rPr>
-        <w:t xml:space="preserve">Keep One Scoring Path.</w:t>
+        <w:t xml:space="preserve">Single Scoring Path.</w:t>
       </w:r>
       <w:r>
         <w:t xml:space="preserve"> </w:t>
@@ -26536,7 +26536,7 @@
           <w:bCs/>
           <w:b/>
         </w:rPr>
-        <w:t xml:space="preserve">Provenance of Every Reported Number</w:t>
+        <w:t xml:space="preserve">PROVENANCE OF REPORTED RESULTS</w:t>
       </w:r>
     </w:p>
     <w:p>
@@ -27474,7 +27474,7 @@
           <w:bCs/>
           <w:b/>
         </w:rPr>
-        <w:t xml:space="preserve">Reproducing the System and the Results</w:t>
+        <w:t xml:space="preserve">REPRODUCTION PROCEDURE</w:t>
       </w:r>
     </w:p>
     <w:p>

</xml_diff>

<commit_message>
Report: light-theme dashboard screenshots
Co-Authored-By: Claude Sonnet 5.5 <noreply@anthropic.com>
Claude-Session: https://claude.ai/code/session_01XSGpBmyyfwNpi7tuzVvNqh
</commit_message>
<xml_diff>
--- a/report/BEACON_Project_Report.docx
+++ b/report/BEACON_Project_Report.docx
@@ -16355,7 +16355,7 @@
         <w:pStyle w:val="ImageCaption"/>
       </w:pPr>
       <w:r>
-        <w:t xml:space="preserve">Figure 4.3: Overview screen of the BEACON dashboard on a synthetic fleet. The banner marks the values as simulated, and the panel at the bottom shows the measured bench-rig readings, with the health index and remaining life refused because no temperature channel exists.</w:t>
+        <w:t xml:space="preserve">Figure 4.3: Overview screen of the BEACON dashboard (light theme) on a synthetic fleet. The banner marks the values as simulated, and the panel at the bottom shows the measured bench-rig readings, with the health index and remaining life refused because no temperature channel exists.</w:t>
       </w:r>
     </w:p>
     <w:p>
@@ -16365,7 +16365,7 @@
       <w:r>
         <w:drawing>
           <wp:inline>
-            <wp:extent cx="4937760" cy="3915917"/>
+            <wp:extent cx="4937760" cy="3967352"/>
             <wp:effectExtent b="0" l="0" r="0" t="0"/>
             <wp:docPr descr="" title="" id="112" name="Picture"/>
             <a:graphic>
@@ -16386,7 +16386,7 @@
                   <pic:spPr bwMode="auto">
                     <a:xfrm>
                       <a:off x="0" y="0"/>
-                      <a:ext cx="4937760" cy="3915917"/>
+                      <a:ext cx="4937760" cy="3967352"/>
                     </a:xfrm>
                     <a:prstGeom prst="rect">
                       <a:avLst/>
@@ -16410,7 +16410,7 @@
         <w:pStyle w:val="ImageCaption"/>
       </w:pPr>
       <w:r>
-        <w:t xml:space="preserve">Figure 4.4: Battery health screen: state of health over cycles for one battery, the attribution of its health index to behaviour terms, and its aggregate usage parameters (synthetic fleet).</w:t>
+        <w:t xml:space="preserve">Figure 4.4: Battery health screen (light theme): state of health over cycles for one battery, the attribution of its health index to behaviour terms, and its aggregate usage parameters (synthetic fleet).</w:t>
       </w:r>
     </w:p>
     <w:p>
@@ -23759,7 +23759,7 @@
         <w:pStyle w:val="ImageCaption"/>
       </w:pPr>
       <w:r>
-        <w:t xml:space="preserve">Figure 5.6: Evidence view of the BEACON dashboard for the bench rig: 83 of 83 records accepted, voltage and current as measured, temperature reported as not supplied, and the health index, remaining life and state of health refused because coverage is incomplete.</w:t>
+        <w:t xml:space="preserve">Figure 5.6: Evidence view of the BEACON dashboard (light theme) for the bench rig: 83 of 83 records accepted, voltage and current as measured, temperature reported as not supplied, and the health index, remaining life and state of health refused because coverage is incomplete.</w:t>
       </w:r>
     </w:p>
     <w:bookmarkEnd w:id="154"/>

</xml_diff>